<commit_message>
Integrate native Pi chat, resident defense inference, and verified delivery evidence
</commit_message>
<xml_diff>
--- a/submission/周兴富-双镜D²Guard-整体设计文档.docx
+++ b/submission/周兴富-双镜D²Guard-整体设计文档.docx
@@ -578,6 +578,7 @@
           <w:lang w:val="en-US" w:eastAsia="zh-CN"/>
         </w:rPr>
         <w:sectPr>
+          <w:footerReference w:type="default" r:id="rId15"/>
           <w:pgSz w:w="11906" w:h="16838"/>
           <w:pgMar w:top="1440" w:right="1466" w:bottom="1440" w:left="1620" w:header="0" w:footer="0" w:gutter="0"/>
           <w:pgBorders>
@@ -731,7 +732,7 @@
           <w:sz w:val="24"/>
         </w:rPr>
         <w:tab/>
-        <w:t>4</w:t>
+        <w:t>3</w:t>
       </w:r>
     </w:p>
     <w:p>
@@ -758,7 +759,7 @@
           <w:sz w:val="24"/>
         </w:rPr>
         <w:tab/>
-        <w:t>5</w:t>
+        <w:t>4</w:t>
       </w:r>
     </w:p>
     <w:p>
@@ -785,7 +786,7 @@
           <w:sz w:val="24"/>
         </w:rPr>
         <w:tab/>
-        <w:t>8</w:t>
+        <w:t>7</w:t>
       </w:r>
     </w:p>
     <w:p>
@@ -812,7 +813,7 @@
           <w:sz w:val="24"/>
         </w:rPr>
         <w:tab/>
-        <w:t>8</w:t>
+        <w:t>7</w:t>
       </w:r>
     </w:p>
     <w:p>
@@ -839,7 +840,7 @@
           <w:sz w:val="28"/>
         </w:rPr>
         <w:tab/>
-        <w:t>10</w:t>
+        <w:t>9</w:t>
       </w:r>
     </w:p>
     <w:p>
@@ -866,7 +867,7 @@
           <w:sz w:val="24"/>
         </w:rPr>
         <w:tab/>
-        <w:t>10</w:t>
+        <w:t>9</w:t>
       </w:r>
     </w:p>
     <w:p>
@@ -893,7 +894,7 @@
           <w:sz w:val="24"/>
         </w:rPr>
         <w:tab/>
-        <w:t>12</w:t>
+        <w:t>10</w:t>
       </w:r>
     </w:p>
     <w:p>
@@ -920,7 +921,7 @@
           <w:sz w:val="28"/>
         </w:rPr>
         <w:tab/>
-        <w:t>14</w:t>
+        <w:t>12</w:t>
       </w:r>
     </w:p>
     <w:p>
@@ -947,7 +948,7 @@
           <w:sz w:val="24"/>
         </w:rPr>
         <w:tab/>
-        <w:t>14</w:t>
+        <w:t>12</w:t>
       </w:r>
     </w:p>
     <w:p>
@@ -974,7 +975,7 @@
           <w:sz w:val="24"/>
         </w:rPr>
         <w:tab/>
-        <w:t>14</w:t>
+        <w:t>12</w:t>
       </w:r>
     </w:p>
     <w:p>
@@ -1001,7 +1002,7 @@
           <w:sz w:val="24"/>
         </w:rPr>
         <w:tab/>
-        <w:t>14</w:t>
+        <w:t>12</w:t>
       </w:r>
     </w:p>
     <w:p>
@@ -1028,7 +1029,7 @@
           <w:sz w:val="24"/>
         </w:rPr>
         <w:tab/>
-        <w:t>15</w:t>
+        <w:t>13</w:t>
       </w:r>
     </w:p>
     <w:p>
@@ -1055,7 +1056,7 @@
           <w:sz w:val="28"/>
         </w:rPr>
         <w:tab/>
-        <w:t>16</w:t>
+        <w:t>14</w:t>
       </w:r>
     </w:p>
     <w:p>
@@ -1082,7 +1083,7 @@
           <w:sz w:val="24"/>
         </w:rPr>
         <w:tab/>
-        <w:t>16</w:t>
+        <w:t>14</w:t>
       </w:r>
     </w:p>
     <w:p>
@@ -1109,7 +1110,7 @@
           <w:sz w:val="24"/>
         </w:rPr>
         <w:tab/>
-        <w:t>17</w:t>
+        <w:t>15</w:t>
       </w:r>
     </w:p>
     <w:p>
@@ -1136,7 +1137,7 @@
           <w:sz w:val="24"/>
         </w:rPr>
         <w:tab/>
-        <w:t>18</w:t>
+        <w:t>16</w:t>
       </w:r>
     </w:p>
     <w:p>
@@ -1163,7 +1164,7 @@
           <w:sz w:val="24"/>
         </w:rPr>
         <w:tab/>
-        <w:t>19</w:t>
+        <w:t>17</w:t>
       </w:r>
     </w:p>
     <w:p>
@@ -1190,7 +1191,7 @@
           <w:sz w:val="24"/>
         </w:rPr>
         <w:tab/>
-        <w:t>20</w:t>
+        <w:t>18</w:t>
       </w:r>
     </w:p>
     <w:p>
@@ -1217,7 +1218,7 @@
           <w:sz w:val="24"/>
         </w:rPr>
         <w:tab/>
-        <w:t>21</w:t>
+        <w:t>18</w:t>
       </w:r>
     </w:p>
     <w:p>
@@ -1244,7 +1245,7 @@
           <w:sz w:val="28"/>
         </w:rPr>
         <w:tab/>
-        <w:t>23</w:t>
+        <w:t>20</w:t>
       </w:r>
     </w:p>
     <w:p>
@@ -1271,7 +1272,7 @@
           <w:sz w:val="24"/>
         </w:rPr>
         <w:tab/>
-        <w:t>23</w:t>
+        <w:t>20</w:t>
       </w:r>
     </w:p>
     <w:p>
@@ -1298,7 +1299,7 @@
           <w:sz w:val="24"/>
         </w:rPr>
         <w:tab/>
-        <w:t>24</w:t>
+        <w:t>21</w:t>
       </w:r>
     </w:p>
     <w:p>
@@ -1325,7 +1326,7 @@
           <w:sz w:val="24"/>
         </w:rPr>
         <w:tab/>
-        <w:t>25</w:t>
+        <w:t>22</w:t>
       </w:r>
     </w:p>
     <w:p>
@@ -1352,7 +1353,7 @@
           <w:sz w:val="24"/>
         </w:rPr>
         <w:tab/>
-        <w:t>27</w:t>
+        <w:t>24</w:t>
       </w:r>
     </w:p>
     <w:p>
@@ -1379,7 +1380,7 @@
           <w:sz w:val="24"/>
         </w:rPr>
         <w:tab/>
-        <w:t>28</w:t>
+        <w:t>25</w:t>
       </w:r>
     </w:p>
     <w:p>
@@ -1406,7 +1407,7 @@
           <w:sz w:val="28"/>
         </w:rPr>
         <w:tab/>
-        <w:t>30</w:t>
+        <w:t>27</w:t>
       </w:r>
     </w:p>
     <w:p>
@@ -1433,7 +1434,7 @@
           <w:sz w:val="24"/>
         </w:rPr>
         <w:tab/>
-        <w:t>30</w:t>
+        <w:t>27</w:t>
       </w:r>
     </w:p>
     <w:p>
@@ -1460,7 +1461,7 @@
           <w:sz w:val="24"/>
         </w:rPr>
         <w:tab/>
-        <w:t>30</w:t>
+        <w:t>27</w:t>
       </w:r>
     </w:p>
     <w:p>
@@ -1487,7 +1488,7 @@
           <w:sz w:val="24"/>
         </w:rPr>
         <w:tab/>
-        <w:t>31</w:t>
+        <w:t>28</w:t>
       </w:r>
     </w:p>
     <w:p>
@@ -1514,7 +1515,7 @@
           <w:sz w:val="24"/>
         </w:rPr>
         <w:tab/>
-        <w:t>33</w:t>
+        <w:t>29</w:t>
       </w:r>
     </w:p>
     <w:p>
@@ -1541,7 +1542,7 @@
           <w:sz w:val="24"/>
         </w:rPr>
         <w:tab/>
-        <w:t>33</w:t>
+        <w:t>30</w:t>
       </w:r>
     </w:p>
     <w:p>
@@ -1568,7 +1569,7 @@
           <w:sz w:val="28"/>
         </w:rPr>
         <w:tab/>
-        <w:t>35</w:t>
+        <w:t>31</w:t>
       </w:r>
     </w:p>
     <w:p>
@@ -1595,7 +1596,7 @@
           <w:sz w:val="24"/>
         </w:rPr>
         <w:tab/>
-        <w:t>35</w:t>
+        <w:t>31</w:t>
       </w:r>
     </w:p>
     <w:p>
@@ -1622,7 +1623,7 @@
           <w:sz w:val="24"/>
         </w:rPr>
         <w:tab/>
-        <w:t>36</w:t>
+        <w:t>32</w:t>
       </w:r>
     </w:p>
     <w:p>
@@ -1649,7 +1650,7 @@
           <w:sz w:val="24"/>
         </w:rPr>
         <w:tab/>
-        <w:t>36</w:t>
+        <w:t>32</w:t>
       </w:r>
     </w:p>
     <w:p>
@@ -1676,7 +1677,7 @@
           <w:sz w:val="24"/>
         </w:rPr>
         <w:tab/>
-        <w:t>36</w:t>
+        <w:t>32</w:t>
       </w:r>
     </w:p>
     <w:p>
@@ -1687,7 +1688,7 @@
           <w:tab w:pos="8820" w:val="right" w:leader="dot"/>
         </w:tabs>
         <w:snapToGrid w:val="0"/>
-        <w:spacing w:before="0" w:after="0" w:line="360" w:lineRule="auto"/>
+        <w:spacing w:before="0" w:after="0" w:line="276" w:lineRule="auto"/>
         <w:jc w:val="left"/>
       </w:pPr>
       <w:r>
@@ -1703,7 +1704,7 @@
           <w:sz w:val="28"/>
         </w:rPr>
         <w:tab/>
-        <w:t>38</w:t>
+        <w:t>33</w:t>
       </w:r>
     </w:p>
     <w:p>
@@ -1713,7 +1714,7 @@
           <w:tab w:pos="8820" w:val="right" w:leader="dot"/>
         </w:tabs>
         <w:snapToGrid w:val="0"/>
-        <w:spacing w:before="0" w:after="0" w:line="360" w:lineRule="auto"/>
+        <w:spacing w:before="0" w:after="0" w:line="276" w:lineRule="auto"/>
         <w:ind w:left="480"/>
         <w:jc w:val="left"/>
       </w:pPr>
@@ -1730,7 +1731,7 @@
           <w:sz w:val="24"/>
         </w:rPr>
         <w:tab/>
-        <w:t>38</w:t>
+        <w:t>33</w:t>
       </w:r>
     </w:p>
     <w:p>
@@ -1740,7 +1741,7 @@
           <w:tab w:pos="8820" w:val="right" w:leader="dot"/>
         </w:tabs>
         <w:snapToGrid w:val="0"/>
-        <w:spacing w:before="0" w:after="0" w:line="360" w:lineRule="auto"/>
+        <w:spacing w:before="0" w:after="0" w:line="276" w:lineRule="auto"/>
         <w:ind w:left="480"/>
         <w:jc w:val="left"/>
       </w:pPr>
@@ -1757,7 +1758,7 @@
           <w:sz w:val="24"/>
         </w:rPr>
         <w:tab/>
-        <w:t>39</w:t>
+        <w:t>34</w:t>
       </w:r>
     </w:p>
     <w:p>
@@ -1784,7 +1785,7 @@
           <w:sz w:val="28"/>
         </w:rPr>
         <w:tab/>
-        <w:t>41</w:t>
+        <w:t>35</w:t>
       </w:r>
     </w:p>
     <w:p>
@@ -1811,7 +1812,7 @@
           <w:sz w:val="24"/>
         </w:rPr>
         <w:tab/>
-        <w:t>41</w:t>
+        <w:t>35</w:t>
       </w:r>
     </w:p>
     <w:p>
@@ -1838,7 +1839,7 @@
           <w:sz w:val="24"/>
         </w:rPr>
         <w:tab/>
-        <w:t>41</w:t>
+        <w:t>35</w:t>
       </w:r>
     </w:p>
     <w:p>
@@ -1865,7 +1866,7 @@
           <w:sz w:val="24"/>
         </w:rPr>
         <w:tab/>
-        <w:t>42</w:t>
+        <w:t>36</w:t>
       </w:r>
     </w:p>
     <w:p>
@@ -1892,7 +1893,7 @@
           <w:sz w:val="24"/>
         </w:rPr>
         <w:tab/>
-        <w:t>42</w:t>
+        <w:t>36</w:t>
       </w:r>
     </w:p>
     <w:p>
@@ -1919,7 +1920,7 @@
           <w:sz w:val="24"/>
         </w:rPr>
         <w:tab/>
-        <w:t>43</w:t>
+        <w:t>36</w:t>
       </w:r>
     </w:p>
     <w:p>
@@ -1946,7 +1947,7 @@
           <w:sz w:val="28"/>
         </w:rPr>
         <w:tab/>
-        <w:t>44</w:t>
+        <w:t>38</w:t>
       </w:r>
     </w:p>
     <w:p>
@@ -1973,7 +1974,7 @@
           <w:sz w:val="28"/>
         </w:rPr>
         <w:tab/>
-        <w:t>45</w:t>
+        <w:t>39</w:t>
       </w:r>
       <w:r>
         <w:fldChar w:fldCharType="end"/>
@@ -2034,7 +2035,55 @@
           <w:b w:val="0"/>
           <w:sz w:val="24"/>
         </w:rPr>
-        <w:t>随着大模型智能体获得文件读写、命令执行和工具调用能力，提示注入的危害已由文本误导扩展至凭据外泄与越权操作。本作品设计并实现了运行时防御系统——双镜 D²Guard，兼顾长程任务的防护效果、裁决延迟与任务可用性。作品具有三方面特色：一是面向原生智能体，以 Hook 插件、API 网关与 MCP 代理非侵入地接入开源编码智能体 Pi，在真实任务中实施防护；二是提出增量安全链，从轨迹中抽取用户授权、来源污点与数据流等安全分量并附原文证据引用，以有界状态视图降低安全判断对完整轨迹的依赖；三是构建快慢协同的防护内核，以 20,662 条样本微调 System One 式类型化决策模型得到快镜 D²Guard-Laya，识别外部内容中的任务请求，与规则共同完成同步裁决；慢镜采用 LLM-judge 方式，在挂起或阻断后按证据引用回溯原文，异步还原攻击路径并生成研判报告，不改变裁决。安全控制台展示检测、研判、阻断与溯源过程并支持人工审批，可部署于 Windows 与 Linux。在覆盖 15 类攻击手法的 83 个场景、996 次运行中，开启防护后攻击成功率由 91.7% 降至 0，929 个可确认良性动作均未被误挂起，单动作裁决耗时中位数为 8 ms。</w:t>
+        <w:t>随着大模型智能体获得文件读写、命令执行和工具调用能力，提示注入的危害已由文本误导扩展至凭据外泄与越权操作。本作品设计并实现了运行时防御系统——双镜 D²Guard，</w:t>
+      </w:r>
+      <w:r>
+        <w:rPr>
+          <w:rFonts w:ascii="Times New Roman" w:hAnsi="Times New Roman" w:eastAsia="宋体" w:cs="Times New Roman"/>
+          <w:b/>
+          <w:sz w:val="24"/>
+        </w:rPr>
+        <w:t>面向长流程任务中历史污染保留与重复判读开销问题</w:t>
+      </w:r>
+      <w:r>
+        <w:rPr>
+          <w:rFonts w:ascii="Times New Roman" w:hAnsi="Times New Roman" w:eastAsia="宋体" w:cs="Times New Roman"/>
+          <w:b w:val="0"/>
+          <w:sz w:val="24"/>
+        </w:rPr>
+        <w:t>，兼顾防护效果、裁决延迟与任务可用性。作品具有三方面特色：一是面向原生智能体，以 Hook 插件、API 网关与 MCP 代理非侵入地接入开源编码智能体 Pi，在真实任务中实施防护；二是</w:t>
+      </w:r>
+      <w:r>
+        <w:rPr>
+          <w:rFonts w:ascii="Times New Roman" w:hAnsi="Times New Roman" w:eastAsia="宋体" w:cs="Times New Roman"/>
+          <w:b/>
+          <w:sz w:val="24"/>
+        </w:rPr>
+        <w:t>提出增量安全链</w:t>
+      </w:r>
+      <w:r>
+        <w:rPr>
+          <w:rFonts w:ascii="Times New Roman" w:hAnsi="Times New Roman" w:eastAsia="宋体" w:cs="Times New Roman"/>
+          <w:b w:val="0"/>
+          <w:sz w:val="24"/>
+        </w:rPr>
+        <w:t>，从轨迹中抽取用户授权、来源污点与数据流等安全分量并附原文证据引用，以有界状态视图降低安全判断对完整轨迹的依赖；三是构建快慢协同的防护内核，</w:t>
+      </w:r>
+      <w:r>
+        <w:rPr>
+          <w:rFonts w:ascii="Times New Roman" w:hAnsi="Times New Roman" w:eastAsia="宋体" w:cs="Times New Roman"/>
+          <w:b/>
+          <w:sz w:val="24"/>
+        </w:rPr>
+        <w:t>以自建的 20,662 条领域样本微调多语言 Laya</w:t>
+      </w:r>
+      <w:r>
+        <w:rPr>
+          <w:rFonts w:ascii="Times New Roman" w:hAnsi="Times New Roman" w:eastAsia="宋体" w:cs="Times New Roman"/>
+          <w:b w:val="0"/>
+          <w:sz w:val="24"/>
+        </w:rPr>
+        <w:t>，得到快镜 D²Guard-Laya，识别外部内容中的任务请求，与规则共同完成同步裁决；慢镜采用 LLM-judge 方式，在挂起或阻断后按证据引用回溯原文，异步还原攻击路径并生成研判报告，不改变裁决。安全控制台展示检测、研判、阻断与溯源过程并支持人工审批，可部署于 Windows 与 Linux。在覆盖 15 类攻击手法的 83 个场景、996 次运行中，开启防护后攻击成功率由 91.7% 降至 0，929 个可确认良性动作均未被误挂起，单动作裁决耗时中位数为 8 ms。补充的用户输入直接注入测试中，18 组攻击配对的外发成功由 18／18 降至 0／18，18 组正常输入配对均完成且未被挂起。</w:t>
       </w:r>
     </w:p>
     <w:p>
@@ -2431,7 +2480,7 @@
           <w:b w:val="0"/>
           <w:sz w:val="24"/>
         </w:rPr>
-        <w:t>在检测型护栏方面，相关方法训练安全分类器或使用大模型对输入输出进行审核，例如 Llama Guard[9] 以生成方式完成安全分类，另有多种专用的提示注入分类模型。此类方法以单段文本为判定对象，既不掌握用户对当前任务的授权范围，也不维护跨步骤的状态，因而难以区分合法的部署说明与伪装成部署说明的注入内容。</w:t>
+        <w:t>在检测型护栏方面，Llama Guard[9] 以生成方式完成输入输出安全分类，专用分类器也可用于提示注入检测。单段文本的分类结果不能单独确定当前动作是否越权，还需结合用户授权、内容来源与此前的数据流。在智能体护栏方面，LlamaFirewall[23] 已组合提示注入检测、任务对齐检查与代码静态分析，说明多层协同防护已有公开研究基础。</w:t>
       </w:r>
     </w:p>
     <w:p>
@@ -2447,7 +2496,7 @@
           <w:b w:val="0"/>
           <w:sz w:val="24"/>
         </w:rPr>
-        <w:t>在系统级防御方面，Spotlighting[10] 通过标记区分外部内容与用户指令；CaMeL[11] 将控制流与数据流分离，以能力约束限制不可信数据的使用方式；FIDES[12] 在智能体中引入信息流控制标签；Task Shield[13] 在每一步检查动作是否服务于用户任务；MELON[14] 通过掩码重执行判断动作是否依赖外部内容。这些方法提供了有效的防御思路，但通常需要改造智能体架构，或在每一步额外调用大模型，开销随轨迹长度增长。</w:t>
+        <w:t>在系统级防御方面，Spotlighting[10] 通过标记区分外部内容与用户指令；CaMeL[11] 将控制流与数据流分离，以能力约束限制不可信数据的使用方式；FIDES[12] 在智能体中引入信息流控制标签；Task Shield[13] 在每一步检查动作是否服务于用户任务；MELON[14] 通过掩码重执行判断动作是否依赖外部内容。这些方法分别从信任边界、信息流和任务对齐提供防御依据。其接入方式与运行开销取决于具体实现，不能统一归为逐步调用大模型的方案。</w:t>
       </w:r>
     </w:p>
     <w:p>
@@ -2463,7 +2512,7 @@
           <w:b w:val="0"/>
           <w:sz w:val="24"/>
         </w:rPr>
-        <w:t>在类型化决策模型方面，2026 年 9 月 TypeSafe AI 发布 Jev 并提出 System One 模型的概念[15]，其名称源于 Kahneman 对快思考与慢思考的划分[16]。该类模型以非结构化状态和一组类型化问题为输入，经单次前向计算输出带校准置信度的答案，不生成自由文本，具有延迟低、输出格式确定、可设置判定阈值等特点。开源社区随后出现了多种复现与替代实现，其中 Convai 发布的 Laya[17] 以 ModernBERT[18] 与 mmBERT[19] 编码器为底座，采用 Apache-2.0 许可，接口与 Jev 兼容。就公开资料而言，该范式目前主要应用于工单分流、内容审核等通用决策任务，尚未见到将其用作智能体运行时安全判别器的系统。</w:t>
+        <w:t>在类型化决策模型方面，TypeSafe AI 于 2026 年 9 月发布 Jev，明确将护栏判断和越狱检测列为应用场景[15]。DeerFlow 的工具调用前授权文档也提供了基于 Jev 的风险评分与阈值拦截配置[22]。因此，将类型化模型用于智能体安全判别本身并非本作品独有。开源 Laya[17] 提供基于 ModernBERT[18] 与 mmBERT[19] 编码器的类型化决策实现，为领域微调与本地推理提供了基础。</w:t>
       </w:r>
     </w:p>
     <w:p>
@@ -2479,7 +2528,39 @@
           <w:b w:val="0"/>
           <w:sz w:val="24"/>
         </w:rPr>
-        <w:t>本作品借鉴了信息流标签与任务对齐的思想，并在三个方面加以改进：以只追加的增量安全链承载安全状态，避免逐步重读轨迹；将 System One 模型领域化为快镜，仅在内容进入时运行一次；将需要生成式大模型的溯源研判交由慢镜异步完成，不进入同步裁决路径。</w:t>
+        <w:t>本作品着重解决长流程任务中的状态保留、语义伪装识别与在线裁决开销三个具体问题：</w:t>
+      </w:r>
+      <w:r>
+        <w:rPr>
+          <w:rFonts w:ascii="Times New Roman" w:hAnsi="Times New Roman" w:eastAsia="宋体" w:cs="Times New Roman"/>
+          <w:b/>
+          <w:sz w:val="24"/>
+        </w:rPr>
+        <w:t>以增量安全链保存授权、来源污点和数据流</w:t>
+      </w:r>
+      <w:r>
+        <w:rPr>
+          <w:rFonts w:ascii="Times New Roman" w:hAnsi="Times New Roman" w:eastAsia="宋体" w:cs="Times New Roman"/>
+          <w:b w:val="0"/>
+          <w:sz w:val="24"/>
+        </w:rPr>
+        <w:t>，降低反复读取完整轨迹的成本；</w:t>
+      </w:r>
+      <w:r>
+        <w:rPr>
+          <w:rFonts w:ascii="Times New Roman" w:hAnsi="Times New Roman" w:eastAsia="宋体" w:cs="Times New Roman"/>
+          <w:b/>
+          <w:sz w:val="24"/>
+        </w:rPr>
+        <w:t>以自建领域数据训练快镜</w:t>
+      </w:r>
+      <w:r>
+        <w:rPr>
+          <w:rFonts w:ascii="Times New Roman" w:hAnsi="Times New Roman" w:eastAsia="宋体" w:cs="Times New Roman"/>
+          <w:b w:val="0"/>
+          <w:sz w:val="24"/>
+        </w:rPr>
+        <w:t>，在内容进入时识别具体任务请求；由确定性决策表执行权限边界，将生成式大模型限定于异步证据研判。本文通过原生 Pi 运行、消融实验和状态压力测试分别检验上述设计，而不将通用护栏概念作为创新依据。</w:t>
       </w:r>
     </w:p>
     <w:p>
@@ -2632,18 +2713,26 @@
       <w:r>
         <w:rPr>
           <w:rFonts w:ascii="Times New Roman" w:hAnsi="Times New Roman" w:eastAsia="宋体" w:cs="Times New Roman"/>
+          <w:b w:val="0"/>
+          <w:sz w:val="24"/>
+        </w:rPr>
+        <w:t>本作品将安全判断所需的信息从原始轨迹中分离出来，</w:t>
+      </w:r>
+      <w:r>
+        <w:rPr>
+          <w:rFonts w:ascii="Times New Roman" w:hAnsi="Times New Roman" w:eastAsia="宋体" w:cs="Times New Roman"/>
           <w:b/>
           <w:sz w:val="24"/>
         </w:rPr>
-        <w:t>本作品将安全判断所需的信息从原始轨迹中分离出来，以增量安全链的形式维护：每个事件仅向链上追加类型化的安全增量，裁决和研判读取由安全链构造的有界状态视图，从而降低安全判断对完整上下文的依赖。</w:t>
-      </w:r>
-      <w:r>
-        <w:rPr>
-          <w:rFonts w:ascii="Times New Roman" w:hAnsi="Times New Roman" w:eastAsia="宋体" w:cs="Times New Roman"/>
-          <w:b w:val="0"/>
-          <w:sz w:val="24"/>
-        </w:rPr>
-        <w:t>在此基础上，防护内核采用规则、快镜与慢镜三层协同的结构。规则层负责机密、敏感目标与硬策略等确定性判断；快镜 D²Guard-Laya 在内容进入时判断其是否构成对读者的具体任务请求，弥补规则对语义伪装的漏检，同时避免将全部外部内容一律视为污染；决策表在执行前综合用户授权、污染来源与策略作出裁决；慢镜在挂起或阻断发生后异步生成攻击路径与研判报告。</w:t>
+        <w:t>以增量安全链的形式维护</w:t>
+      </w:r>
+      <w:r>
+        <w:rPr>
+          <w:rFonts w:ascii="Times New Roman" w:hAnsi="Times New Roman" w:eastAsia="宋体" w:cs="Times New Roman"/>
+          <w:b w:val="0"/>
+          <w:sz w:val="24"/>
+        </w:rPr>
+        <w:t>：每个事件仅向链上追加类型化的安全增量，裁决和研判读取由安全链构造的有界状态视图，从而降低安全判断对完整上下文的依赖。在此基础上，防护内核采用规则、快镜与慢镜三层协同的结构。规则层负责机密、敏感目标与硬策略等确定性判断；快镜 D²Guard-Laya 由本作品</w:t>
       </w:r>
       <w:r>
         <w:rPr>
@@ -2651,15 +2740,31 @@
           <w:b/>
           <w:sz w:val="24"/>
         </w:rPr>
-        <w:t>同步路径不调用生成式大模型，单动作裁决耗时中位数为 8 ms。</w:t>
-      </w:r>
-      <w:r>
-        <w:rPr>
-          <w:rFonts w:ascii="Times New Roman" w:hAnsi="Times New Roman" w:eastAsia="宋体" w:cs="Times New Roman"/>
-          <w:b w:val="0"/>
-          <w:sz w:val="24"/>
-        </w:rPr>
-        <w:t>图 1-2 为安全控制台中运行时防御链路的展示界面。</w:t>
+        <w:t>使用 20,662 条领域样本微调得到</w:t>
+      </w:r>
+      <w:r>
+        <w:rPr>
+          <w:rFonts w:ascii="Times New Roman" w:hAnsi="Times New Roman" w:eastAsia="宋体" w:cs="Times New Roman"/>
+          <w:b w:val="0"/>
+          <w:sz w:val="24"/>
+        </w:rPr>
+        <w:t>，在内容进入时判断其是否构成对读者的具体任务请求，弥补规则对语义伪装的漏检，同时避免将全部外部内容一律视为污染；决策表在执行前综合用户授权、污染来源与策略作出裁决；慢镜在挂起或阻断发生后异步生成攻击路径与研判报告。</w:t>
+      </w:r>
+      <w:r>
+        <w:rPr>
+          <w:rFonts w:ascii="Times New Roman" w:hAnsi="Times New Roman" w:eastAsia="宋体" w:cs="Times New Roman"/>
+          <w:b/>
+          <w:sz w:val="24"/>
+        </w:rPr>
+        <w:t>同步路径不调用生成式大模型</w:t>
+      </w:r>
+      <w:r>
+        <w:rPr>
+          <w:rFonts w:ascii="Times New Roman" w:hAnsi="Times New Roman" w:eastAsia="宋体" w:cs="Times New Roman"/>
+          <w:b w:val="0"/>
+          <w:sz w:val="24"/>
+        </w:rPr>
+        <w:t>，单动作裁决耗时中位数为 8 ms。图 1-2 为安全控制台中运行时防御链路的展示界面。</w:t>
       </w:r>
     </w:p>
     <w:p>
@@ -2746,10 +2851,18 @@
       <w:r>
         <w:rPr>
           <w:rFonts w:ascii="Times New Roman" w:hAnsi="Times New Roman" w:eastAsia="宋体" w:cs="Times New Roman"/>
-          <w:b w:val="0"/>
-          <w:sz w:val="24"/>
-        </w:rPr>
-        <w:t>系统为每一轮运行保存完整证据，包括模型请求快照、工具调用参数与返回、裁决依据及接收端回执，并据此构建由用户消息、外部来源、智能体、工具调用、裁决与受影响资产组成的溯源图。安全控制台提供态势展示、防护关闭与开启的对照运行、单任务防护运行与溯源分析等功能，可展示一次攻击从外部来源进入、经主智能体与子智能体传播、直至在执行前被拦截的完整过程，并支持在网页中对挂起动作进行批准或拒绝。图 1-3 为三层子智能体场景的攻击路径溯源图。</w:t>
+          <w:b/>
+          <w:sz w:val="24"/>
+        </w:rPr>
+        <w:t>系统为每一轮运行保存完整证据</w:t>
+      </w:r>
+      <w:r>
+        <w:rPr>
+          <w:rFonts w:ascii="Times New Roman" w:hAnsi="Times New Roman" w:eastAsia="宋体" w:cs="Times New Roman"/>
+          <w:b w:val="0"/>
+          <w:sz w:val="24"/>
+        </w:rPr>
+        <w:t>，包括模型请求快照、工具调用参数与返回、裁决依据及接收端回执，并据此构建由用户消息、外部来源、智能体、工具调用、裁决与受影响资产组成的溯源图。安全控制台提供态势展示、防护关闭与开启的对照运行、单任务防护运行与溯源分析等功能，可展示一次攻击从外部来源进入、经主智能体与子智能体传播、直至在执行前被拦截的完整过程，并支持在网页中对挂起动作进行批准或拒绝。图 1-3 为三层子智能体场景的攻击路径溯源图。</w:t>
       </w:r>
     </w:p>
     <w:p>
@@ -12598,23 +12711,7 @@
           <w:b w:val="0"/>
           <w:sz w:val="24"/>
         </w:rPr>
-        <w:t>已有的对齐检查通常判断“该动作是否服务于用户任务”，需要大模型同时理解任务与动作，代价较高且结果不够稳定。</w:t>
-      </w:r>
-      <w:r>
-        <w:rPr>
-          <w:rFonts w:ascii="Times New Roman" w:hAnsi="Times New Roman" w:eastAsia="宋体" w:cs="Times New Roman"/>
-          <w:b/>
-          <w:sz w:val="24"/>
-        </w:rPr>
-        <w:t>本作品将其转化为对越权动作来源的判定，即依据用户授权与各来源的请求信息，确定一个超出授权的动作源于智能体的自主规划还是外部内容的要求。</w:t>
-      </w:r>
-      <w:r>
-        <w:rPr>
-          <w:rFonts w:ascii="Times New Roman" w:hAnsi="Times New Roman" w:eastAsia="宋体" w:cs="Times New Roman"/>
-          <w:b w:val="0"/>
-          <w:sz w:val="24"/>
-        </w:rPr>
-        <w:t>快镜在内容进入时已经确定了哪些来源提出了具体任务，规则将这些任务抽取为（操作，目标）索引，因此每个越权动作都可以通过查表对齐到用户授权、自主规划与外部诱导三种来源之一，并对应表 5-4 中的风险等级：在授权范围内或属于低风险辅助动作为 R0；超出字面授权、上下文无请求污染的高风险动作为 R1；涉及敏感目标、请求污染、外部指令或机密风险为 R2；违反硬策略或确证外泄为 R3。轨迹级偏离度取各动作偏离等级的最大值，并给出偏离路径。安全控制台的任务跟踪模式（护航模式）以授权锚点为计划，逐步核对每个动作的裁决与执行情况，并标出由外部指令诱导且已被拦截的偏离。</w:t>
+        <w:t>Task Shield 等对齐方法检查“该动作是否服务于用户任务”，本作品则以授权与来源信息构造可计算的检查条件。本作品将其转化为越权动作与来源请求之间的关联检查，即依据用户授权与各来源的请求信息，检查一个超出授权的动作是否与外部内容提出的操作、目标相匹配。快镜在内容进入时已经确定了哪些来源提出了具体任务，规则将这些任务抽取为（操作，目标）索引，据此区分已授权动作、未匹配外部请求的规划动作与存在外部请求关联的动作，并对应表 5-4 中的风险等级：在授权范围内或属于低风险辅助动作为 R0；超出字面授权、上下文无请求污染的高风险动作为 R1；涉及敏感目标、请求污染、外部指令或机密风险为 R2；违反硬策略或确证外泄为 R3。轨迹级偏离度取各动作偏离等级的最大值，并给出偏离路径。安全控制台的任务跟踪模式（护航模式）以授权锚点为计划，逐步核对每个动作的裁决与执行情况，并标出与外部指令关联且已被拦截的偏离；该关联不等同于已证明因果关系。</w:t>
       </w:r>
     </w:p>
     <w:p>
@@ -14802,7 +14899,7 @@
       <w:pPr>
         <w:keepNext/>
         <w:snapToGrid w:val="0"/>
-        <w:spacing w:before="200" w:after="120" w:line="360" w:lineRule="auto"/>
+        <w:spacing w:before="200" w:after="0" w:line="276" w:lineRule="auto"/>
         <w:jc w:val="left"/>
         <w:outlineLvl w:val="1"/>
       </w:pPr>
@@ -14818,7 +14915,7 @@
     <w:p>
       <w:pPr>
         <w:snapToGrid w:val="0"/>
-        <w:spacing w:before="0" w:after="0" w:line="360" w:lineRule="auto"/>
+        <w:spacing w:before="0" w:after="0" w:line="276" w:lineRule="auto"/>
         <w:ind w:firstLine="480"/>
         <w:jc w:val="both"/>
       </w:pPr>
@@ -14835,7 +14932,7 @@
       <w:pPr>
         <w:keepNext/>
         <w:snapToGrid w:val="0"/>
-        <w:spacing w:before="60" w:after="60" w:line="360" w:lineRule="auto"/>
+        <w:spacing w:before="60" w:after="0" w:line="276" w:lineRule="auto"/>
         <w:jc w:val="center"/>
       </w:pPr>
       <w:r>
@@ -14885,7 +14982,7 @@
           <w:p>
             <w:pPr>
               <w:snapToGrid w:val="0"/>
-              <w:spacing w:before="0" w:after="0" w:line="360" w:lineRule="auto"/>
+              <w:spacing w:before="0" w:after="40" w:line="276" w:lineRule="auto"/>
               <w:jc w:val="center"/>
             </w:pPr>
             <w:r>
@@ -14913,7 +15010,7 @@
           <w:p>
             <w:pPr>
               <w:snapToGrid w:val="0"/>
-              <w:spacing w:before="0" w:after="0" w:line="360" w:lineRule="auto"/>
+              <w:spacing w:before="0" w:after="40" w:line="276" w:lineRule="auto"/>
               <w:jc w:val="center"/>
             </w:pPr>
             <w:r>
@@ -14941,7 +15038,7 @@
           <w:p>
             <w:pPr>
               <w:snapToGrid w:val="0"/>
-              <w:spacing w:before="0" w:after="0" w:line="360" w:lineRule="auto"/>
+              <w:spacing w:before="0" w:after="40" w:line="276" w:lineRule="auto"/>
               <w:jc w:val="center"/>
             </w:pPr>
             <w:r>
@@ -14973,7 +15070,7 @@
           <w:p>
             <w:pPr>
               <w:snapToGrid w:val="0"/>
-              <w:spacing w:before="0" w:after="0" w:line="360" w:lineRule="auto"/>
+              <w:spacing w:before="0" w:after="40" w:line="276" w:lineRule="auto"/>
               <w:jc w:val="center"/>
             </w:pPr>
             <w:r>
@@ -15000,7 +15097,7 @@
           <w:p>
             <w:pPr>
               <w:snapToGrid w:val="0"/>
-              <w:spacing w:before="0" w:after="0" w:line="360" w:lineRule="auto"/>
+              <w:spacing w:before="0" w:after="40" w:line="276" w:lineRule="auto"/>
               <w:jc w:val="center"/>
             </w:pPr>
             <w:r>
@@ -15027,7 +15124,7 @@
           <w:p>
             <w:pPr>
               <w:snapToGrid w:val="0"/>
-              <w:spacing w:before="0" w:after="0" w:line="360" w:lineRule="auto"/>
+              <w:spacing w:before="0" w:after="40" w:line="276" w:lineRule="auto"/>
               <w:jc w:val="left"/>
             </w:pPr>
             <w:r>
@@ -15059,7 +15156,7 @@
           <w:p>
             <w:pPr>
               <w:snapToGrid w:val="0"/>
-              <w:spacing w:before="0" w:after="0" w:line="360" w:lineRule="auto"/>
+              <w:spacing w:before="0" w:after="40" w:line="276" w:lineRule="auto"/>
               <w:jc w:val="center"/>
             </w:pPr>
             <w:r>
@@ -15086,7 +15183,7 @@
           <w:p>
             <w:pPr>
               <w:snapToGrid w:val="0"/>
-              <w:spacing w:before="0" w:after="0" w:line="360" w:lineRule="auto"/>
+              <w:spacing w:before="0" w:after="40" w:line="276" w:lineRule="auto"/>
               <w:jc w:val="center"/>
             </w:pPr>
             <w:r>
@@ -15113,7 +15210,7 @@
           <w:p>
             <w:pPr>
               <w:snapToGrid w:val="0"/>
-              <w:spacing w:before="0" w:after="0" w:line="360" w:lineRule="auto"/>
+              <w:spacing w:before="0" w:after="40" w:line="276" w:lineRule="auto"/>
               <w:jc w:val="left"/>
             </w:pPr>
             <w:r>
@@ -15145,7 +15242,7 @@
           <w:p>
             <w:pPr>
               <w:snapToGrid w:val="0"/>
-              <w:spacing w:before="0" w:after="0" w:line="360" w:lineRule="auto"/>
+              <w:spacing w:before="0" w:after="40" w:line="276" w:lineRule="auto"/>
               <w:jc w:val="center"/>
             </w:pPr>
             <w:r>
@@ -15172,7 +15269,7 @@
           <w:p>
             <w:pPr>
               <w:snapToGrid w:val="0"/>
-              <w:spacing w:before="0" w:after="0" w:line="360" w:lineRule="auto"/>
+              <w:spacing w:before="0" w:after="40" w:line="276" w:lineRule="auto"/>
               <w:jc w:val="center"/>
             </w:pPr>
             <w:r>
@@ -15199,7 +15296,7 @@
           <w:p>
             <w:pPr>
               <w:snapToGrid w:val="0"/>
-              <w:spacing w:before="0" w:after="0" w:line="360" w:lineRule="auto"/>
+              <w:spacing w:before="0" w:after="40" w:line="276" w:lineRule="auto"/>
               <w:jc w:val="left"/>
             </w:pPr>
             <w:r>
@@ -15231,7 +15328,7 @@
           <w:p>
             <w:pPr>
               <w:snapToGrid w:val="0"/>
-              <w:spacing w:before="0" w:after="0" w:line="360" w:lineRule="auto"/>
+              <w:spacing w:before="0" w:after="40" w:line="276" w:lineRule="auto"/>
               <w:jc w:val="center"/>
             </w:pPr>
             <w:r>
@@ -15258,7 +15355,7 @@
           <w:p>
             <w:pPr>
               <w:snapToGrid w:val="0"/>
-              <w:spacing w:before="0" w:after="0" w:line="360" w:lineRule="auto"/>
+              <w:spacing w:before="0" w:after="40" w:line="276" w:lineRule="auto"/>
               <w:jc w:val="center"/>
             </w:pPr>
             <w:r>
@@ -15285,7 +15382,7 @@
           <w:p>
             <w:pPr>
               <w:snapToGrid w:val="0"/>
-              <w:spacing w:before="0" w:after="0" w:line="360" w:lineRule="auto"/>
+              <w:spacing w:before="0" w:after="40" w:line="276" w:lineRule="auto"/>
               <w:jc w:val="left"/>
             </w:pPr>
             <w:r>
@@ -15317,7 +15414,7 @@
           <w:p>
             <w:pPr>
               <w:snapToGrid w:val="0"/>
-              <w:spacing w:before="0" w:after="0" w:line="360" w:lineRule="auto"/>
+              <w:spacing w:before="0" w:after="40" w:line="276" w:lineRule="auto"/>
               <w:jc w:val="center"/>
             </w:pPr>
             <w:r>
@@ -15344,7 +15441,7 @@
           <w:p>
             <w:pPr>
               <w:snapToGrid w:val="0"/>
-              <w:spacing w:before="0" w:after="0" w:line="360" w:lineRule="auto"/>
+              <w:spacing w:before="0" w:after="40" w:line="276" w:lineRule="auto"/>
               <w:jc w:val="center"/>
             </w:pPr>
             <w:r>
@@ -15371,7 +15468,7 @@
           <w:p>
             <w:pPr>
               <w:snapToGrid w:val="0"/>
-              <w:spacing w:before="0" w:after="0" w:line="360" w:lineRule="auto"/>
+              <w:spacing w:before="0" w:after="40" w:line="276" w:lineRule="auto"/>
               <w:jc w:val="left"/>
             </w:pPr>
             <w:r>
@@ -15403,7 +15500,7 @@
           <w:p>
             <w:pPr>
               <w:snapToGrid w:val="0"/>
-              <w:spacing w:before="0" w:after="0" w:line="360" w:lineRule="auto"/>
+              <w:spacing w:before="0" w:after="40" w:line="276" w:lineRule="auto"/>
               <w:jc w:val="center"/>
             </w:pPr>
             <w:r>
@@ -15430,16 +15527,16 @@
           <w:p>
             <w:pPr>
               <w:snapToGrid w:val="0"/>
-              <w:spacing w:before="0" w:after="0" w:line="360" w:lineRule="auto"/>
-              <w:jc w:val="center"/>
-            </w:pPr>
-            <w:r>
-              <w:rPr>
-                <w:rFonts w:ascii="Times New Roman" w:hAnsi="Times New Roman" w:eastAsia="宋体" w:cs="Times New Roman"/>
-                <w:b w:val="0"/>
-                <w:sz w:val="24"/>
-              </w:rPr>
-              <w:t>攻防竞技场</w:t>
+              <w:spacing w:before="0" w:after="40" w:line="276" w:lineRule="auto"/>
+              <w:jc w:val="center"/>
+            </w:pPr>
+            <w:r>
+              <w:rPr>
+                <w:rFonts w:ascii="Times New Roman" w:hAnsi="Times New Roman" w:eastAsia="宋体" w:cs="Times New Roman"/>
+                <w:b w:val="0"/>
+                <w:sz w:val="24"/>
+              </w:rPr>
+              <w:t>自由对话</w:t>
             </w:r>
           </w:p>
         </w:tc>
@@ -15457,7 +15554,7 @@
           <w:p>
             <w:pPr>
               <w:snapToGrid w:val="0"/>
-              <w:spacing w:before="0" w:after="0" w:line="360" w:lineRule="auto"/>
+              <w:spacing w:before="0" w:after="40" w:line="276" w:lineRule="auto"/>
               <w:jc w:val="left"/>
             </w:pPr>
             <w:r>
@@ -15466,7 +15563,7 @@
                 <w:b w:val="0"/>
                 <w:sz w:val="24"/>
               </w:rPr>
-              <w:t>同一场景在防护关闭与开启两种条件下同时运行真实智能体，左右两路逐步对照工具调用、裁决与执行结果</w:t>
+              <w:t>直接输入任务、附带文本与连续追问；原生 Pi 会话保留上下文，支持停止生成</w:t>
             </w:r>
           </w:p>
         </w:tc>
@@ -15489,7 +15586,7 @@
           <w:p>
             <w:pPr>
               <w:snapToGrid w:val="0"/>
-              <w:spacing w:before="0" w:after="0" w:line="360" w:lineRule="auto"/>
+              <w:spacing w:before="0" w:after="40" w:line="276" w:lineRule="auto"/>
               <w:jc w:val="center"/>
             </w:pPr>
             <w:r>
@@ -15516,16 +15613,16 @@
           <w:p>
             <w:pPr>
               <w:snapToGrid w:val="0"/>
-              <w:spacing w:before="0" w:after="0" w:line="360" w:lineRule="auto"/>
-              <w:jc w:val="center"/>
-            </w:pPr>
-            <w:r>
-              <w:rPr>
-                <w:rFonts w:ascii="Times New Roman" w:hAnsi="Times New Roman" w:eastAsia="宋体" w:cs="Times New Roman"/>
-                <w:b w:val="0"/>
-                <w:sz w:val="24"/>
-              </w:rPr>
-              <w:t>护航模式</w:t>
+              <w:spacing w:before="0" w:after="40" w:line="276" w:lineRule="auto"/>
+              <w:jc w:val="center"/>
+            </w:pPr>
+            <w:r>
+              <w:rPr>
+                <w:rFonts w:ascii="Times New Roman" w:hAnsi="Times New Roman" w:eastAsia="宋体" w:cs="Times New Roman"/>
+                <w:b w:val="0"/>
+                <w:sz w:val="24"/>
+              </w:rPr>
+              <w:t>攻防竞技场</w:t>
             </w:r>
           </w:p>
         </w:tc>
@@ -15543,7 +15640,7 @@
           <w:p>
             <w:pPr>
               <w:snapToGrid w:val="0"/>
-              <w:spacing w:before="0" w:after="0" w:line="360" w:lineRule="auto"/>
+              <w:spacing w:before="0" w:after="40" w:line="276" w:lineRule="auto"/>
               <w:jc w:val="left"/>
             </w:pPr>
             <w:r>
@@ -15552,7 +15649,7 @@
                 <w:b w:val="0"/>
                 <w:sz w:val="24"/>
               </w:rPr>
-              <w:t>防护开启下运行，以授权锚点为计划逐步核对动作的裁决与执行，标出被诱导的偏离</w:t>
+              <w:t>同一场景在防护关闭与开启两种条件下同时运行真实智能体，左右两路逐步对照工具调用、裁决与执行结果</w:t>
             </w:r>
           </w:p>
         </w:tc>
@@ -15575,7 +15672,7 @@
           <w:p>
             <w:pPr>
               <w:snapToGrid w:val="0"/>
-              <w:spacing w:before="0" w:after="0" w:line="360" w:lineRule="auto"/>
+              <w:spacing w:before="0" w:after="40" w:line="276" w:lineRule="auto"/>
               <w:jc w:val="center"/>
             </w:pPr>
             <w:r>
@@ -15602,16 +15699,16 @@
           <w:p>
             <w:pPr>
               <w:snapToGrid w:val="0"/>
-              <w:spacing w:before="0" w:after="0" w:line="360" w:lineRule="auto"/>
-              <w:jc w:val="center"/>
-            </w:pPr>
-            <w:r>
-              <w:rPr>
-                <w:rFonts w:ascii="Times New Roman" w:hAnsi="Times New Roman" w:eastAsia="宋体" w:cs="Times New Roman"/>
-                <w:b w:val="0"/>
-                <w:sz w:val="24"/>
-              </w:rPr>
-              <w:t>网页审批</w:t>
+              <w:spacing w:before="0" w:after="40" w:line="276" w:lineRule="auto"/>
+              <w:jc w:val="center"/>
+            </w:pPr>
+            <w:r>
+              <w:rPr>
+                <w:rFonts w:ascii="Times New Roman" w:hAnsi="Times New Roman" w:eastAsia="宋体" w:cs="Times New Roman"/>
+                <w:b w:val="0"/>
+                <w:sz w:val="24"/>
+              </w:rPr>
+              <w:t>护航模式</w:t>
             </w:r>
           </w:p>
         </w:tc>
@@ -15629,7 +15726,7 @@
           <w:p>
             <w:pPr>
               <w:snapToGrid w:val="0"/>
-              <w:spacing w:before="0" w:after="0" w:line="360" w:lineRule="auto"/>
+              <w:spacing w:before="0" w:after="40" w:line="276" w:lineRule="auto"/>
               <w:jc w:val="left"/>
             </w:pPr>
             <w:r>
@@ -15638,7 +15735,7 @@
                 <w:b w:val="0"/>
                 <w:sz w:val="24"/>
               </w:rPr>
-              <w:t>在被挂起的步骤旁显示待审批调用的工具、参数、理由与有效期，批准或拒绝后原会话继续执行</w:t>
+              <w:t>防护开启下运行，以授权锚点为计划逐步核对动作的裁决与执行，标出被诱导的偏离</w:t>
             </w:r>
           </w:p>
         </w:tc>
@@ -15661,16 +15758,16 @@
           <w:p>
             <w:pPr>
               <w:snapToGrid w:val="0"/>
-              <w:spacing w:before="0" w:after="0" w:line="360" w:lineRule="auto"/>
-              <w:jc w:val="center"/>
-            </w:pPr>
-            <w:r>
-              <w:rPr>
-                <w:rFonts w:ascii="Times New Roman" w:hAnsi="Times New Roman" w:eastAsia="宋体" w:cs="Times New Roman"/>
-                <w:b w:val="0"/>
-                <w:sz w:val="24"/>
-              </w:rPr>
-              <w:t>分析</w:t>
+              <w:spacing w:before="0" w:after="40" w:line="276" w:lineRule="auto"/>
+              <w:jc w:val="center"/>
+            </w:pPr>
+            <w:r>
+              <w:rPr>
+                <w:rFonts w:ascii="Times New Roman" w:hAnsi="Times New Roman" w:eastAsia="宋体" w:cs="Times New Roman"/>
+                <w:b w:val="0"/>
+                <w:sz w:val="24"/>
+              </w:rPr>
+              <w:t>执行</w:t>
             </w:r>
           </w:p>
         </w:tc>
@@ -15688,16 +15785,16 @@
           <w:p>
             <w:pPr>
               <w:snapToGrid w:val="0"/>
-              <w:spacing w:before="0" w:after="0" w:line="360" w:lineRule="auto"/>
-              <w:jc w:val="center"/>
-            </w:pPr>
-            <w:r>
-              <w:rPr>
-                <w:rFonts w:ascii="Times New Roman" w:hAnsi="Times New Roman" w:eastAsia="宋体" w:cs="Times New Roman"/>
-                <w:b w:val="0"/>
-                <w:sz w:val="24"/>
-              </w:rPr>
-              <w:t>溯源分析</w:t>
+              <w:spacing w:before="0" w:after="40" w:line="276" w:lineRule="auto"/>
+              <w:jc w:val="center"/>
+            </w:pPr>
+            <w:r>
+              <w:rPr>
+                <w:rFonts w:ascii="Times New Roman" w:hAnsi="Times New Roman" w:eastAsia="宋体" w:cs="Times New Roman"/>
+                <w:b w:val="0"/>
+                <w:sz w:val="24"/>
+              </w:rPr>
+              <w:t>网页审批</w:t>
             </w:r>
           </w:p>
         </w:tc>
@@ -15715,7 +15812,7 @@
           <w:p>
             <w:pPr>
               <w:snapToGrid w:val="0"/>
-              <w:spacing w:before="0" w:after="0" w:line="360" w:lineRule="auto"/>
+              <w:spacing w:before="0" w:after="40" w:line="276" w:lineRule="auto"/>
               <w:jc w:val="left"/>
             </w:pPr>
             <w:r>
@@ -15724,7 +15821,7 @@
                 <w:b w:val="0"/>
                 <w:sz w:val="24"/>
               </w:rPr>
-              <w:t>攻击路径 DAG、时序泳道、来源原文高亮、影响范围与研判报告</w:t>
+              <w:t>在被挂起的步骤旁显示待审批调用的工具、参数、理由与有效期，批准或拒绝后原会话继续执行</w:t>
             </w:r>
           </w:p>
         </w:tc>
@@ -15739,6 +15836,92 @@
             <w:tcBorders>
               <w:top w:val="single" w:sz="4" w:color="C9D1DD" w:space="0"/>
               <w:left w:val="nil"/>
+              <w:bottom w:val="single" w:sz="4" w:color="C9D1DD" w:space="0"/>
+              <w:right w:val="nil"/>
+            </w:tcBorders>
+            <w:vAlign w:val="center"/>
+          </w:tcPr>
+          <w:p>
+            <w:pPr>
+              <w:snapToGrid w:val="0"/>
+              <w:spacing w:before="0" w:after="40" w:line="276" w:lineRule="auto"/>
+              <w:jc w:val="center"/>
+            </w:pPr>
+            <w:r>
+              <w:rPr>
+                <w:rFonts w:ascii="Times New Roman" w:hAnsi="Times New Roman" w:eastAsia="宋体" w:cs="Times New Roman"/>
+                <w:b w:val="0"/>
+                <w:sz w:val="24"/>
+              </w:rPr>
+              <w:t>分析</w:t>
+            </w:r>
+          </w:p>
+        </w:tc>
+        <w:tc>
+          <w:tcPr>
+            <w:tcW w:type="dxa" w:w="1809"/>
+            <w:tcBorders>
+              <w:top w:val="single" w:sz="4" w:color="C9D1DD" w:space="0"/>
+              <w:left w:val="nil"/>
+              <w:bottom w:val="single" w:sz="4" w:color="C9D1DD" w:space="0"/>
+              <w:right w:val="nil"/>
+            </w:tcBorders>
+            <w:vAlign w:val="center"/>
+          </w:tcPr>
+          <w:p>
+            <w:pPr>
+              <w:snapToGrid w:val="0"/>
+              <w:spacing w:before="0" w:after="40" w:line="276" w:lineRule="auto"/>
+              <w:jc w:val="center"/>
+            </w:pPr>
+            <w:r>
+              <w:rPr>
+                <w:rFonts w:ascii="Times New Roman" w:hAnsi="Times New Roman" w:eastAsia="宋体" w:cs="Times New Roman"/>
+                <w:b w:val="0"/>
+                <w:sz w:val="24"/>
+              </w:rPr>
+              <w:t>溯源分析</w:t>
+            </w:r>
+          </w:p>
+        </w:tc>
+        <w:tc>
+          <w:tcPr>
+            <w:tcW w:type="dxa" w:w="5820"/>
+            <w:tcBorders>
+              <w:top w:val="single" w:sz="4" w:color="C9D1DD" w:space="0"/>
+              <w:left w:val="nil"/>
+              <w:bottom w:val="single" w:sz="4" w:color="C9D1DD" w:space="0"/>
+              <w:right w:val="nil"/>
+            </w:tcBorders>
+            <w:vAlign w:val="center"/>
+          </w:tcPr>
+          <w:p>
+            <w:pPr>
+              <w:snapToGrid w:val="0"/>
+              <w:spacing w:before="0" w:after="40" w:line="276" w:lineRule="auto"/>
+              <w:jc w:val="left"/>
+            </w:pPr>
+            <w:r>
+              <w:rPr>
+                <w:rFonts w:ascii="Times New Roman" w:hAnsi="Times New Roman" w:eastAsia="宋体" w:cs="Times New Roman"/>
+                <w:b w:val="0"/>
+                <w:sz w:val="24"/>
+              </w:rPr>
+              <w:t>攻击路径 DAG、时序泳道、来源原文高亮、影响范围与研判报告</w:t>
+            </w:r>
+          </w:p>
+        </w:tc>
+      </w:tr>
+      <w:tr>
+        <w:trPr>
+          <w:cantSplit/>
+        </w:trPr>
+        <w:tc>
+          <w:tcPr>
+            <w:tcW w:type="dxa" w:w="1101"/>
+            <w:tcBorders>
+              <w:top w:val="single" w:sz="4" w:color="C9D1DD" w:space="0"/>
+              <w:left w:val="nil"/>
               <w:bottom w:val="single" w:sz="12" w:color="1B2A49" w:space="0"/>
               <w:right w:val="nil"/>
             </w:tcBorders>
@@ -15747,7 +15930,7 @@
           <w:p>
             <w:pPr>
               <w:snapToGrid w:val="0"/>
-              <w:spacing w:before="0" w:after="0" w:line="360" w:lineRule="auto"/>
+              <w:spacing w:before="0" w:after="40" w:line="276" w:lineRule="auto"/>
               <w:jc w:val="center"/>
             </w:pPr>
             <w:r>
@@ -15774,7 +15957,7 @@
           <w:p>
             <w:pPr>
               <w:snapToGrid w:val="0"/>
-              <w:spacing w:before="0" w:after="0" w:line="360" w:lineRule="auto"/>
+              <w:spacing w:before="0" w:after="40" w:line="276" w:lineRule="auto"/>
               <w:jc w:val="center"/>
             </w:pPr>
             <w:r>
@@ -15801,7 +15984,7 @@
           <w:p>
             <w:pPr>
               <w:snapToGrid w:val="0"/>
-              <w:spacing w:before="0" w:after="0" w:line="360" w:lineRule="auto"/>
+              <w:spacing w:before="0" w:after="40" w:line="276" w:lineRule="auto"/>
               <w:jc w:val="left"/>
             </w:pPr>
             <w:r>
@@ -15819,15 +16002,47 @@
     <w:p>
       <w:pPr>
         <w:snapToGrid w:val="0"/>
-        <w:spacing w:before="0" w:after="80" w:line="144" w:lineRule="auto"/>
+        <w:spacing w:before="0" w:after="0" w:line="276" w:lineRule="auto"/>
         <w:jc w:val="both"/>
       </w:pPr>
     </w:p>
     <w:p>
       <w:pPr>
+        <w:snapToGrid w:val="0"/>
+        <w:spacing w:before="0" w:after="0" w:line="276" w:lineRule="auto"/>
+        <w:ind w:firstLine="480"/>
+        <w:jc w:val="both"/>
+      </w:pPr>
+      <w:r>
+        <w:rPr>
+          <w:rFonts w:ascii="Times New Roman" w:hAnsi="Times New Roman" w:eastAsia="宋体" w:cs="Times New Roman"/>
+          <w:b w:val="0"/>
+          <w:sz w:val="24"/>
+        </w:rPr>
+        <w:t>自由对话页面将用户任务与连续追问传递给</w:t>
+      </w:r>
+      <w:r>
+        <w:rPr>
+          <w:rFonts w:ascii="Times New Roman" w:hAnsi="Times New Roman" w:eastAsia="宋体" w:cs="Times New Roman"/>
+          <w:b/>
+          <w:sz w:val="24"/>
+        </w:rPr>
+        <w:t>同一个 Pi 原生 RPC 会话</w:t>
+      </w:r>
+      <w:r>
+        <w:rPr>
+          <w:rFonts w:ascii="Times New Roman" w:hAnsi="Times New Roman" w:eastAsia="宋体" w:cs="Times New Roman"/>
+          <w:b w:val="0"/>
+          <w:sz w:val="24"/>
+        </w:rPr>
+        <w:t>，上下文维护、自动压缩和工具调用循环由 Pi 实现。D²Guard 检测每轮输入并裁决候选工具操作，前端展示原生回复与审批；附带资料按引用边界处理。该接入不另建智能体执行循环。</w:t>
+      </w:r>
+    </w:p>
+    <w:p>
+      <w:pPr>
         <w:keepNext/>
         <w:snapToGrid w:val="0"/>
-        <w:spacing w:before="200" w:after="120" w:line="360" w:lineRule="auto"/>
+        <w:spacing w:before="200" w:after="0" w:line="276" w:lineRule="auto"/>
         <w:jc w:val="left"/>
         <w:outlineLvl w:val="1"/>
       </w:pPr>
@@ -15843,7 +16058,7 @@
     <w:p>
       <w:pPr>
         <w:snapToGrid w:val="0"/>
-        <w:spacing w:before="0" w:after="0" w:line="360" w:lineRule="auto"/>
+        <w:spacing w:before="0" w:after="0" w:line="276" w:lineRule="auto"/>
         <w:ind w:firstLine="480"/>
         <w:jc w:val="both"/>
       </w:pPr>
@@ -15853,14 +16068,14 @@
           <w:b w:val="0"/>
           <w:sz w:val="24"/>
         </w:rPr>
-        <w:t>系统的技术栈如表 8-2 所示。防护主机运行 Pi、钩子插件、网关、MCP 代理与防护内核；快镜可部署在 GPU 上，也可在防护主机的 CPU 上运行；慢镜可接入任意 OpenAI 兼容接口，并可与智能体使用不同的模型。系统支持 Windows 10／11 与 Linux 原生部署：Windows 上使用独立的 Python 虚拟环境与项目内固定版本的 Pi，命令与 Git 工具经 Git for Windows 提供的 Bash 执行；Linux 上通过 POSIX Shell 执行。两个平台使用相同的源码、策略与模型权重，部署步骤见《部署说明文档》。</w:t>
+        <w:t>系统技术栈见表 8-2。Pi、钩子插件、网关、MCP 代理和内核部署在防护主机；快镜支持 GPU 及 CPU 推理，慢镜接入 OpenAI 兼容接口，可与 Agent 选用不同模型。系统支持 Windows 10／11 与 Linux：前者使用独立 Python 虚拟环境、固定版本 Pi 及 Git for Windows 的 Bash，后者采用 POSIX Shell。两平台使用同一套源码、策略和权重，安装步骤见《部署说明文档》。</w:t>
       </w:r>
     </w:p>
     <w:p>
       <w:pPr>
         <w:keepNext/>
         <w:snapToGrid w:val="0"/>
-        <w:spacing w:before="60" w:after="60" w:line="360" w:lineRule="auto"/>
+        <w:spacing w:before="60" w:after="0" w:line="276" w:lineRule="auto"/>
         <w:jc w:val="center"/>
       </w:pPr>
       <w:r>
@@ -15909,7 +16124,7 @@
           <w:p>
             <w:pPr>
               <w:snapToGrid w:val="0"/>
-              <w:spacing w:before="0" w:after="0" w:line="360" w:lineRule="auto"/>
+              <w:spacing w:before="0" w:after="40" w:line="276" w:lineRule="auto"/>
               <w:jc w:val="center"/>
             </w:pPr>
             <w:r>
@@ -15937,7 +16152,7 @@
           <w:p>
             <w:pPr>
               <w:snapToGrid w:val="0"/>
-              <w:spacing w:before="0" w:after="0" w:line="360" w:lineRule="auto"/>
+              <w:spacing w:before="0" w:after="40" w:line="276" w:lineRule="auto"/>
               <w:jc w:val="center"/>
             </w:pPr>
             <w:r>
@@ -15969,7 +16184,7 @@
           <w:p>
             <w:pPr>
               <w:snapToGrid w:val="0"/>
-              <w:spacing w:before="0" w:after="0" w:line="360" w:lineRule="auto"/>
+              <w:spacing w:before="0" w:after="40" w:line="276" w:lineRule="auto"/>
               <w:jc w:val="center"/>
             </w:pPr>
             <w:r>
@@ -15996,7 +16211,7 @@
           <w:p>
             <w:pPr>
               <w:snapToGrid w:val="0"/>
-              <w:spacing w:before="0" w:after="0" w:line="360" w:lineRule="auto"/>
+              <w:spacing w:before="0" w:after="40" w:line="276" w:lineRule="auto"/>
               <w:jc w:val="left"/>
             </w:pPr>
             <w:r>
@@ -16028,7 +16243,7 @@
           <w:p>
             <w:pPr>
               <w:snapToGrid w:val="0"/>
-              <w:spacing w:before="0" w:after="0" w:line="360" w:lineRule="auto"/>
+              <w:spacing w:before="0" w:after="40" w:line="276" w:lineRule="auto"/>
               <w:jc w:val="center"/>
             </w:pPr>
             <w:r>
@@ -16055,7 +16270,7 @@
           <w:p>
             <w:pPr>
               <w:snapToGrid w:val="0"/>
-              <w:spacing w:before="0" w:after="0" w:line="360" w:lineRule="auto"/>
+              <w:spacing w:before="0" w:after="40" w:line="276" w:lineRule="auto"/>
               <w:jc w:val="left"/>
             </w:pPr>
             <w:r>
@@ -16087,7 +16302,7 @@
           <w:p>
             <w:pPr>
               <w:snapToGrid w:val="0"/>
-              <w:spacing w:before="0" w:after="0" w:line="360" w:lineRule="auto"/>
+              <w:spacing w:before="0" w:after="40" w:line="276" w:lineRule="auto"/>
               <w:jc w:val="left"/>
             </w:pPr>
             <w:r>
@@ -16114,7 +16329,7 @@
           <w:p>
             <w:pPr>
               <w:snapToGrid w:val="0"/>
-              <w:spacing w:before="0" w:after="0" w:line="360" w:lineRule="auto"/>
+              <w:spacing w:before="0" w:after="40" w:line="276" w:lineRule="auto"/>
               <w:jc w:val="left"/>
             </w:pPr>
             <w:r>
@@ -16146,7 +16361,7 @@
           <w:p>
             <w:pPr>
               <w:snapToGrid w:val="0"/>
-              <w:spacing w:before="0" w:after="0" w:line="360" w:lineRule="auto"/>
+              <w:spacing w:before="0" w:after="40" w:line="276" w:lineRule="auto"/>
               <w:jc w:val="left"/>
             </w:pPr>
             <w:r>
@@ -16173,7 +16388,7 @@
           <w:p>
             <w:pPr>
               <w:snapToGrid w:val="0"/>
-              <w:spacing w:before="0" w:after="0" w:line="360" w:lineRule="auto"/>
+              <w:spacing w:before="0" w:after="40" w:line="276" w:lineRule="auto"/>
               <w:jc w:val="left"/>
             </w:pPr>
             <w:r>
@@ -16205,7 +16420,7 @@
           <w:p>
             <w:pPr>
               <w:snapToGrid w:val="0"/>
-              <w:spacing w:before="0" w:after="0" w:line="360" w:lineRule="auto"/>
+              <w:spacing w:before="0" w:after="40" w:line="276" w:lineRule="auto"/>
               <w:jc w:val="center"/>
             </w:pPr>
             <w:r>
@@ -16232,7 +16447,7 @@
           <w:p>
             <w:pPr>
               <w:snapToGrid w:val="0"/>
-              <w:spacing w:before="0" w:after="0" w:line="360" w:lineRule="auto"/>
+              <w:spacing w:before="0" w:after="40" w:line="276" w:lineRule="auto"/>
               <w:jc w:val="left"/>
             </w:pPr>
             <w:r>
@@ -16264,7 +16479,7 @@
           <w:p>
             <w:pPr>
               <w:snapToGrid w:val="0"/>
-              <w:spacing w:before="0" w:after="0" w:line="360" w:lineRule="auto"/>
+              <w:spacing w:before="0" w:after="40" w:line="276" w:lineRule="auto"/>
               <w:jc w:val="center"/>
             </w:pPr>
             <w:r>
@@ -16291,7 +16506,7 @@
           <w:p>
             <w:pPr>
               <w:snapToGrid w:val="0"/>
-              <w:spacing w:before="0" w:after="0" w:line="360" w:lineRule="auto"/>
+              <w:spacing w:before="0" w:after="40" w:line="276" w:lineRule="auto"/>
               <w:jc w:val="left"/>
             </w:pPr>
             <w:r>
@@ -16323,7 +16538,7 @@
           <w:p>
             <w:pPr>
               <w:snapToGrid w:val="0"/>
-              <w:spacing w:before="0" w:after="0" w:line="360" w:lineRule="auto"/>
+              <w:spacing w:before="0" w:after="40" w:line="276" w:lineRule="auto"/>
               <w:jc w:val="center"/>
             </w:pPr>
             <w:r>
@@ -16350,7 +16565,7 @@
           <w:p>
             <w:pPr>
               <w:snapToGrid w:val="0"/>
-              <w:spacing w:before="0" w:after="0" w:line="360" w:lineRule="auto"/>
+              <w:spacing w:before="0" w:after="40" w:line="276" w:lineRule="auto"/>
               <w:jc w:val="left"/>
             </w:pPr>
             <w:r>
@@ -16382,7 +16597,7 @@
           <w:p>
             <w:pPr>
               <w:snapToGrid w:val="0"/>
-              <w:spacing w:before="0" w:after="0" w:line="360" w:lineRule="auto"/>
+              <w:spacing w:before="0" w:after="40" w:line="276" w:lineRule="auto"/>
               <w:jc w:val="center"/>
             </w:pPr>
             <w:r>
@@ -16409,7 +16624,7 @@
           <w:p>
             <w:pPr>
               <w:snapToGrid w:val="0"/>
-              <w:spacing w:before="0" w:after="0" w:line="360" w:lineRule="auto"/>
+              <w:spacing w:before="0" w:after="40" w:line="276" w:lineRule="auto"/>
               <w:jc w:val="left"/>
             </w:pPr>
             <w:r>
@@ -16435,9 +16650,92 @@
     <w:p>
       <w:pPr>
         <w:snapToGrid w:val="0"/>
-        <w:spacing w:before="0" w:after="80" w:line="144" w:lineRule="auto"/>
+        <w:spacing w:before="0" w:after="0" w:line="276" w:lineRule="auto"/>
         <w:jc w:val="both"/>
       </w:pPr>
+    </w:p>
+    <w:p>
+      <w:pPr>
+        <w:snapToGrid w:val="0"/>
+        <w:spacing w:before="0" w:after="0" w:line="276" w:lineRule="auto"/>
+        <w:ind w:firstLine="480"/>
+        <w:jc w:val="both"/>
+      </w:pPr>
+      <w:r>
+        <w:rPr>
+          <w:rFonts w:ascii="Times New Roman" w:hAnsi="Times New Roman" w:eastAsia="宋体" w:cs="Times New Roman"/>
+          <w:b w:val="0"/>
+          <w:sz w:val="24"/>
+        </w:rPr>
+        <w:t>控制台将模型加载与会话状态分离：常驻进程共享已校验的快镜权重和分词器，</w:t>
+      </w:r>
+      <w:r>
+        <w:rPr>
+          <w:rFonts w:ascii="Times New Roman" w:hAnsi="Times New Roman" w:eastAsia="宋体" w:cs="Times New Roman"/>
+          <w:b/>
+          <w:sz w:val="24"/>
+        </w:rPr>
+        <w:t>各会话分别维护授权、污点、审批与证据</w:t>
+      </w:r>
+      <w:r>
+        <w:rPr>
+          <w:rFonts w:ascii="Times New Roman" w:hAnsi="Times New Roman" w:eastAsia="宋体" w:cs="Times New Roman"/>
+          <w:b w:val="0"/>
+          <w:sz w:val="24"/>
+        </w:rPr>
+        <w:t>。推理接口仅监听本机并校验身份和配置；连接失败或配置不一致时停止相关执行。Windows 采用只读 FP32 权重映射，保持原权重转 FP32 的数值，降低页面文件占用。</w:t>
+      </w:r>
+    </w:p>
+    <w:p>
+      <w:pPr>
+        <w:snapToGrid w:val="0"/>
+        <w:spacing w:before="0" w:after="0" w:line="276" w:lineRule="auto"/>
+        <w:ind w:firstLine="480"/>
+        <w:jc w:val="both"/>
+      </w:pPr>
+      <w:r>
+        <w:rPr>
+          <w:rFonts w:ascii="Times New Roman" w:hAnsi="Times New Roman" w:eastAsia="宋体" w:cs="Times New Roman"/>
+          <w:b w:val="0"/>
+          <w:sz w:val="24"/>
+        </w:rPr>
+        <w:t>上游密钥由网关读取，Pi 仅持有本地代理令牌；实验使用随机合成凭据，安全视图和网页均作脱敏处理。模型与配置按哈希核查。每轮独立保存版本和资源清单、Pi 原生事件、审计记录、证据库、安全链、裁决、网关摘要、接收端回执及判分结果，以支持独立核验。工作目录、清理后的进程环境与超时回收属于应用层约束，不等同于操作系统级沙箱。</w:t>
+      </w:r>
+    </w:p>
+    <w:p>
+      <w:pPr>
+        <w:pStyle w:val="2"/>
+        <w:keepNext/>
+        <w:pageBreakBefore/>
+        <w:snapToGrid w:val="0"/>
+        <w:spacing w:before="120" w:after="360" w:line="360" w:lineRule="auto"/>
+        <w:jc w:val="center"/>
+      </w:pPr>
+      <w:r>
+        <w:rPr>
+          <w:rFonts w:ascii="Arial" w:hAnsi="Arial" w:eastAsia="黑体" w:cs="Arial"/>
+          <w:b w:val="0"/>
+          <w:sz w:val="32"/>
+        </w:rPr>
+        <w:t>第九章 创新性说明</w:t>
+      </w:r>
+    </w:p>
+    <w:p>
+      <w:pPr>
+        <w:keepNext/>
+        <w:snapToGrid w:val="0"/>
+        <w:spacing w:before="200" w:after="120" w:line="360" w:lineRule="auto"/>
+        <w:jc w:val="left"/>
+        <w:outlineLvl w:val="1"/>
+      </w:pPr>
+      <w:r>
+        <w:rPr>
+          <w:rFonts w:ascii="Arial" w:hAnsi="Arial" w:eastAsia="黑体" w:cs="Arial"/>
+          <w:b w:val="0"/>
+          <w:sz w:val="28"/>
+        </w:rPr>
+        <w:t>9.1 基于增量安全链的长程安全状态表示</w:t>
+      </w:r>
     </w:p>
     <w:p>
       <w:pPr>
@@ -16452,41 +16750,71 @@
           <w:b w:val="0"/>
           <w:sz w:val="24"/>
         </w:rPr>
-        <w:t xml:space="preserve">在密钥与隐私保护方面，上游密钥仅由网关进程读取，智能体只获得本地代理令牌；实验仅使用每轮随机生成、带 </w:t>
-      </w:r>
-      <w:r>
-        <w:rPr>
-          <w:rFonts w:ascii="Times New Roman" w:hAnsi="Times New Roman" w:eastAsia="宋体" w:cs="Times New Roman"/>
-          <w:b w:val="0"/>
-          <w:sz w:val="24"/>
-        </w:rPr>
-        <w:t>d2-test-</w:t>
-      </w:r>
-      <w:r>
-        <w:rPr>
-          <w:rFonts w:ascii="Times New Roman" w:hAnsi="Times New Roman" w:eastAsia="宋体" w:cs="Times New Roman"/>
-          <w:b w:val="0"/>
-          <w:sz w:val="24"/>
-        </w:rPr>
-        <w:t xml:space="preserve"> 前缀的合成凭据；安全链、模型输入与慢镜取证包均不含机密明文，界面中的合成凭据同样以掩码显示。在可复核性方面，每轮运行输出运行清单（模型、宿主版本、源码与初始资源的 SHA-256）、Pi 原生事件、审计记录、证据库、安全链、裁决、网关摘要、接收端回执与判分结果，可由独立脚本逐项核验。</w:t>
-      </w:r>
-    </w:p>
-    <w:p>
-      <w:pPr>
-        <w:pStyle w:val="2"/>
-        <w:keepNext/>
-        <w:pageBreakBefore/>
-        <w:snapToGrid w:val="0"/>
-        <w:spacing w:before="120" w:after="360" w:line="360" w:lineRule="auto"/>
-        <w:jc w:val="center"/>
-      </w:pPr>
-      <w:r>
-        <w:rPr>
-          <w:rFonts w:ascii="Arial" w:hAnsi="Arial" w:eastAsia="黑体" w:cs="Arial"/>
-          <w:b w:val="0"/>
-          <w:sz w:val="32"/>
-        </w:rPr>
-        <w:t>第九章 创新性说明</w:t>
+        <w:t>针对基于完整上下文的检测与裁判方法在长程任务中成本随轨迹增长、早期注入容易被后续内容稀释的问题，</w:t>
+      </w:r>
+      <w:r>
+        <w:rPr>
+          <w:rFonts w:ascii="Times New Roman" w:hAnsi="Times New Roman" w:eastAsia="宋体" w:cs="Times New Roman"/>
+          <w:b/>
+          <w:sz w:val="24"/>
+        </w:rPr>
+        <w:t>本作品提出了增量安全链。</w:t>
+      </w:r>
+      <w:r>
+        <w:rPr>
+          <w:rFonts w:ascii="Times New Roman" w:hAnsi="Times New Roman" w:eastAsia="宋体" w:cs="Times New Roman"/>
+          <w:b w:val="0"/>
+          <w:sz w:val="24"/>
+        </w:rPr>
+        <w:t>该方法在每个事件发生时抽取类型化的安全增量，包括用户授权、来源污点、外部指令、机密、数据流、父子关系与记忆标签，并以只追加方式维护；外部内容的语义标签在进入时计算一次，裁决与研判只读取由安全链构造的有界状态视图，每条安全事实均附带指向原文字符区间的证据引用。</w:t>
+      </w:r>
+    </w:p>
+    <w:p>
+      <w:pPr>
+        <w:snapToGrid w:val="0"/>
+        <w:spacing w:before="0" w:after="0" w:line="360" w:lineRule="auto"/>
+        <w:ind w:firstLine="480"/>
+        <w:jc w:val="both"/>
+      </w:pPr>
+      <w:r>
+        <w:rPr>
+          <w:rFonts w:ascii="Times New Roman" w:hAnsi="Times New Roman" w:eastAsia="宋体" w:cs="Times New Roman"/>
+          <w:b w:val="0"/>
+          <w:sz w:val="24"/>
+        </w:rPr>
+        <w:t>实验表明，正式评测中单动作裁决耗时的中位数为 8 ms；真实运行中上下文与安全状态之比的中位数为 3.06，最大为 19.2；</w:t>
+      </w:r>
+      <w:r>
+        <w:rPr>
+          <w:rFonts w:ascii="Times New Roman" w:hAnsi="Times New Roman" w:eastAsia="宋体" w:cs="Times New Roman"/>
+          <w:b/>
+          <w:sz w:val="24"/>
+        </w:rPr>
+        <w:t>仅依据状态视图作出的裁决与金标准的一致率为 97.89%</w:t>
+      </w:r>
+      <w:r>
+        <w:rPr>
+          <w:rFonts w:ascii="Times New Roman" w:hAnsi="Times New Roman" w:eastAsia="宋体" w:cs="Times New Roman"/>
+          <w:b w:val="0"/>
+          <w:sz w:val="24"/>
+        </w:rPr>
+        <w:t>。在不调用真实 Pi、</w:t>
+      </w:r>
+      <w:r>
+        <w:rPr>
+          <w:rFonts w:ascii="Times New Roman" w:hAnsi="Times New Roman" w:eastAsia="宋体" w:cs="Times New Roman"/>
+          <w:b/>
+          <w:sz w:val="24"/>
+        </w:rPr>
+        <w:t>以模型桩驱动的 2000 步合成事件压力测试</w:t>
+      </w:r>
+      <w:r>
+        <w:rPr>
+          <w:rFonts w:ascii="Times New Roman" w:hAnsi="Times New Roman" w:eastAsia="宋体" w:cs="Times New Roman"/>
+          <w:b w:val="0"/>
+          <w:sz w:val="24"/>
+        </w:rPr>
+        <w:t>中（26 个子智能体、1360 个来源），安全状态核心保持在约 7.7 KB，快镜输入视图不超过 111 token，最早植入的污点在任务结束时仍然有效。</w:t>
       </w:r>
     </w:p>
     <w:p>
@@ -16503,7 +16831,7 @@
           <w:b w:val="0"/>
           <w:sz w:val="28"/>
         </w:rPr>
-        <w:t>9.1 基于增量安全链的长程安全状态表示</w:t>
+        <w:t>9.2 规则、快镜与慢镜分层协同的防护内核</w:t>
       </w:r>
     </w:p>
     <w:p>
@@ -16519,7 +16847,7 @@
           <w:b w:val="0"/>
           <w:sz w:val="24"/>
         </w:rPr>
-        <w:t>针对基于完整上下文的检测与裁判方法在长程任务中成本随轨迹增长、早期注入容易被后续内容稀释的问题，</w:t>
+        <w:t>针对纯规则方法对语义伪装存在漏检、生成式大模型裁判延迟高且输出不稳定、粗粒度污染判定导致正常任务难以完成的问题，本作品借鉴快思考与慢思考的分工[16]，设计了三层协同的防护内核。规则层执行机密指纹、敏感目标、硬策略与字面授权等确定性检查，构成不能被模型越过的安全下限；快镜将“外部内容是否要求读者执行具体任务”表述为固定选项问题，由本作品</w:t>
       </w:r>
       <w:r>
         <w:rPr>
@@ -16527,15 +16855,31 @@
           <w:b/>
           <w:sz w:val="24"/>
         </w:rPr>
-        <w:t>本作品提出了增量安全链。</w:t>
-      </w:r>
-      <w:r>
-        <w:rPr>
-          <w:rFonts w:ascii="Times New Roman" w:hAnsi="Times New Roman" w:eastAsia="宋体" w:cs="Times New Roman"/>
-          <w:b w:val="0"/>
-          <w:sz w:val="24"/>
-        </w:rPr>
-        <w:t>该方法在每个事件发生时抽取类型化的安全增量，包括用户授权、来源污点、外部指令、机密、数据流、父子关系与记忆标签，并以只追加方式维护；外部内容的语义标签在进入时计算一次，裁决与研判只读取由安全链构造的有界状态视图，每条安全事实均附带指向原文字符区间的证据引用。</w:t>
+        <w:t>以 20,662 条领域样本微调的 D²Guard-Laya</w:t>
+      </w:r>
+      <w:r>
+        <w:rPr>
+          <w:rFonts w:ascii="Times New Roman" w:hAnsi="Times New Roman" w:eastAsia="宋体" w:cs="Times New Roman"/>
+          <w:b w:val="0"/>
+          <w:sz w:val="24"/>
+        </w:rPr>
+        <w:t xml:space="preserve"> 以单次前向计算输出校准概率，仅在内容进入时运行；慢镜在挂起或阻断后异步还原攻击路径并生成研判报告，不改变裁决。该设计的重点在于</w:t>
+      </w:r>
+      <w:r>
+        <w:rPr>
+          <w:rFonts w:ascii="Times New Roman" w:hAnsi="Times New Roman" w:eastAsia="宋体" w:cs="Times New Roman"/>
+          <w:b/>
+          <w:sz w:val="24"/>
+        </w:rPr>
+        <w:t>将领域判别结果写入可持续维护的安全状态</w:t>
+      </w:r>
+      <w:r>
+        <w:rPr>
+          <w:rFonts w:ascii="Times New Roman" w:hAnsi="Times New Roman" w:eastAsia="宋体" w:cs="Times New Roman"/>
+          <w:b w:val="0"/>
+          <w:sz w:val="24"/>
+        </w:rPr>
+        <w:t>，并由决策表使用；其作用由规则消融和独立金标准评测检验。</w:t>
       </w:r>
     </w:p>
     <w:p>
@@ -16551,7 +16895,23 @@
           <w:b w:val="0"/>
           <w:sz w:val="24"/>
         </w:rPr>
-        <w:t>实验表明，正式评测中单动作裁决耗时的中位数为 8 ms；真实运行中上下文与安全状态之比的中位数为 3.06，最大为 19.2；仅依据状态视图作出的裁决与金标准的一致率为 97.89%。在 2000 步、26 个子智能体、1360 个来源的长程压力测试中，安全状态核心保持在约 7.7 KB，快镜输入视图不超过 111 token，最早植入的污点在任务结束时仍然有效。</w:t>
+        <w:t>消融实验表明，两种仅依靠规则的配置分别导致正常业务完成率为 0 或语义伪装攻击全部成功，而</w:t>
+      </w:r>
+      <w:r>
+        <w:rPr>
+          <w:rFonts w:ascii="Times New Roman" w:hAnsi="Times New Roman" w:eastAsia="宋体" w:cs="Times New Roman"/>
+          <w:b/>
+          <w:sz w:val="24"/>
+        </w:rPr>
+        <w:t>规则与快镜协同时攻击成功为 0／20、正常业务完成为 20／24</w:t>
+      </w:r>
+      <w:r>
+        <w:rPr>
+          <w:rFonts w:ascii="Times New Roman" w:hAnsi="Times New Roman" w:eastAsia="宋体" w:cs="Times New Roman"/>
+          <w:b w:val="0"/>
+          <w:sz w:val="24"/>
+        </w:rPr>
+        <w:t>。快镜在真实良性文本上的误报率为 1.06%，GPU 推理耗时中位数为 29 ms，CPU 为 172 ms，同步裁决路径不调用生成式大模型，本地完成比例为 100%。</w:t>
       </w:r>
     </w:p>
     <w:p>
@@ -16568,7 +16928,7 @@
           <w:b w:val="0"/>
           <w:sz w:val="28"/>
         </w:rPr>
-        <w:t>9.2 规则、快镜与慢镜分层协同的防护内核</w:t>
+        <w:t>9.3 基于来源级请求污染的意图—计划—工具对齐</w:t>
       </w:r>
     </w:p>
     <w:p>
@@ -16584,7 +16944,7 @@
           <w:b w:val="0"/>
           <w:sz w:val="24"/>
         </w:rPr>
-        <w:t>针对纯规则方法对语义伪装存在漏检、生成式大模型裁判延迟高且输出不稳定、粗粒度污染判定导致正常任务难以完成的问题，</w:t>
+        <w:t>本作品以用户授权、来源请求与候选动作之间的可核查关系实现意图—计划—工具对齐。授权锚点表示已识别的任务权限，候选调用序列表示计划，规范化动作表示工具操作；快镜标注提出具体任务的来源，规则将操作与目标写入索引。执行前查询这些信息，区分已授权行为、无外部请求关联的越权行为和与外部请求匹配的行为，并给出风险等级及原文引用。这种匹配提供来源关联线索，不单独证明攻击因果。</w:t>
       </w:r>
       <w:r>
         <w:rPr>
@@ -16592,15 +16952,15 @@
           <w:b/>
           <w:sz w:val="24"/>
         </w:rPr>
-        <w:t>本作品借鉴快思考与慢思考的分工，设计了三层协同的防护内核。</w:t>
-      </w:r>
-      <w:r>
-        <w:rPr>
-          <w:rFonts w:ascii="Times New Roman" w:hAnsi="Times New Roman" w:eastAsia="宋体" w:cs="Times New Roman"/>
-          <w:b w:val="0"/>
-          <w:sz w:val="24"/>
-        </w:rPr>
-        <w:t>规则层执行机密指纹、敏感目标、硬策略与字面授权等确定性检查，构成不能被模型越过的安全下限；快镜将“外部内容是否要求读者执行具体任务”表述为固定选项问题，由领域微调的 System One 式类型化决策模型以单次前向计算输出校准概率，仅在内容进入时运行；慢镜在挂起或阻断后异步还原攻击路径并生成研判报告，不改变裁决。就公开资料而言，尚未见到将 System One 决策模型用于智能体运行时防护并与安全状态机、决策表配套的系统。</w:t>
+        <w:t>快镜的请求识别与规则的权限判断分别评测</w:t>
+      </w:r>
+      <w:r>
+        <w:rPr>
+          <w:rFonts w:ascii="Times New Roman" w:hAnsi="Times New Roman" w:eastAsia="宋体" w:cs="Times New Roman"/>
+          <w:b w:val="0"/>
+          <w:sz w:val="24"/>
+        </w:rPr>
+        <w:t>，避免将文本分类准确率等同于端到端防御效果。</w:t>
       </w:r>
     </w:p>
     <w:p>
@@ -16616,7 +16976,23 @@
           <w:b w:val="0"/>
           <w:sz w:val="24"/>
         </w:rPr>
-        <w:t>消融实验表明，两种仅依靠规则的配置分别导致正常业务完成率为 0 或语义伪装攻击全部成功，而规则与快镜协同时攻击成功为 0／20、正常业务完成为 20／24。快镜在真实良性文本上的误报率为 1.06%，GPU 推理耗时中位数为 29 ms，CPU 为 172 ms，同步裁决路径不调用生成式大模型，本地完成比例为 100%。</w:t>
+        <w:t>实验中，语义伪装、多语言与混淆变体攻击均在副作用发生前被挂起，对抗变体族的条件防护率为 21／21，</w:t>
+      </w:r>
+      <w:r>
+        <w:rPr>
+          <w:rFonts w:ascii="Times New Roman" w:hAnsi="Times New Roman" w:eastAsia="宋体" w:cs="Times New Roman"/>
+          <w:b/>
+          <w:sz w:val="24"/>
+        </w:rPr>
+        <w:t>可确认良性动作被误挂起的比例为 0／929</w:t>
+      </w:r>
+      <w:r>
+        <w:rPr>
+          <w:rFonts w:ascii="Times New Roman" w:hAnsi="Times New Roman" w:eastAsia="宋体" w:cs="Times New Roman"/>
+          <w:b w:val="0"/>
+          <w:sz w:val="24"/>
+        </w:rPr>
+        <w:t>。</w:t>
       </w:r>
     </w:p>
     <w:p>
@@ -16633,7 +17009,7 @@
           <w:b w:val="0"/>
           <w:sz w:val="28"/>
         </w:rPr>
-        <w:t>9.3 基于来源级请求污染的意图—计划—工具对齐</w:t>
+        <w:t>9.4 面向原生智能体的非侵入式接入与可复核证据链</w:t>
       </w:r>
     </w:p>
     <w:p>
@@ -16649,7 +17025,7 @@
           <w:b w:val="0"/>
           <w:sz w:val="24"/>
         </w:rPr>
-        <w:t>针对现有对齐检查依赖大模型逐步判断“动作是否服务于用户任务”、代价较高且结果不够稳定的问题，</w:t>
+        <w:t>为检验防护机制在真实工具调用循环中的行为，本作品直接防护公开发布的 Pi 编码智能体，</w:t>
       </w:r>
       <w:r>
         <w:rPr>
@@ -16657,15 +17033,15 @@
           <w:b/>
           <w:sz w:val="24"/>
         </w:rPr>
-        <w:t>本作品将对齐问题转化为可计算的来源归属问题：</w:t>
-      </w:r>
-      <w:r>
-        <w:rPr>
-          <w:rFonts w:ascii="Times New Roman" w:hAnsi="Times New Roman" w:eastAsia="宋体" w:cs="Times New Roman"/>
-          <w:b w:val="0"/>
-          <w:sz w:val="24"/>
-        </w:rPr>
-        <w:t>依据用户授权与各来源的请求信息，判定每个超出授权的动作源于智能体的自主规划还是外部内容的要求。授权锚点表示意图，候选调用序列表示计划，规范化动作表示工具；快镜在入口处标注提出具体任务的来源，规则将任务抽取为（操作，目标）索引，越权动作通过查表即可对齐到用户授权、自主规划与外部诱导三者之一，并给出偏离等级与证据。快镜只判断是否存在具体任务，越权与否由规则判断，二者职责分离，可以分别评测。</w:t>
+        <w:t>通过执行前钩子插件、API 侧网关与 MCP 中间代理三个组件非侵入接入</w:t>
+      </w:r>
+      <w:r>
+        <w:rPr>
+          <w:rFonts w:ascii="Times New Roman" w:hAnsi="Times New Roman" w:eastAsia="宋体" w:cs="Times New Roman"/>
+          <w:b w:val="0"/>
+          <w:sz w:val="24"/>
+        </w:rPr>
+        <w:t>，三者共用同一份安全状态，系统可在 Windows 与 Linux 上原生部署；挂起的动作可以在网页中审批，批准或拒绝后原会话继续执行。每轮运行输出完整的证据目录，由独立脚本逐项核验，攻击是否成功仅以接收端回执与实际文件为准。</w:t>
       </w:r>
     </w:p>
     <w:p>
@@ -16681,7 +17057,7 @@
           <w:b w:val="0"/>
           <w:sz w:val="24"/>
         </w:rPr>
-        <w:t>实验中，语义伪装、多语言与混淆变体攻击均在副作用发生前被挂起，对抗变体族的条件防护率为 21／21，可确认良性动作被误挂起的比例为 0／929。</w:t>
+        <w:t>正式评测的 996 次运行均在未经改造的 Pi 智能体上执行，经独立脚本逐项核验，未出现非模型原因导致的核验失败。由于内核通过事件与裁决接口与宿主解耦，该接入方式原则上适用于其他提供工具执行前钩子的智能体框架。</w:t>
       </w:r>
     </w:p>
     <w:p>
@@ -16698,7 +17074,7 @@
           <w:b w:val="0"/>
           <w:sz w:val="28"/>
         </w:rPr>
-        <w:t>9.4 面向原生智能体的非侵入式接入与可复核证据链</w:t>
+        <w:t>9.5 与现有方案的对比</w:t>
       </w:r>
     </w:p>
     <w:p>
@@ -16714,72 +17090,7 @@
           <w:b w:val="0"/>
           <w:sz w:val="24"/>
         </w:rPr>
-        <w:t>针对现有防护多在简化循环或回放轨迹上验证、结论难以迁移到真实产品的问题，</w:t>
-      </w:r>
-      <w:r>
-        <w:rPr>
-          <w:rFonts w:ascii="Times New Roman" w:hAnsi="Times New Roman" w:eastAsia="宋体" w:cs="Times New Roman"/>
-          <w:b/>
-          <w:sz w:val="24"/>
-        </w:rPr>
-        <w:t>本作品直接防护公开发布的 Pi 编码智能体，</w:t>
-      </w:r>
-      <w:r>
-        <w:rPr>
-          <w:rFonts w:ascii="Times New Roman" w:hAnsi="Times New Roman" w:eastAsia="宋体" w:cs="Times New Roman"/>
-          <w:b w:val="0"/>
-          <w:sz w:val="24"/>
-        </w:rPr>
-        <w:t>通过执行前钩子插件、API 侧网关与 MCP 中间代理三个组件非侵入接入，三者共用同一份安全状态，系统可在 Windows 与 Linux 上原生部署；挂起的动作可以在网页中审批，批准或拒绝后原会话继续执行。每轮运行输出完整的证据目录，由独立脚本逐项核验，攻击是否成功仅以接收端回执与实际文件为准。</w:t>
-      </w:r>
-    </w:p>
-    <w:p>
-      <w:pPr>
-        <w:snapToGrid w:val="0"/>
-        <w:spacing w:before="0" w:after="0" w:line="360" w:lineRule="auto"/>
-        <w:ind w:firstLine="480"/>
-        <w:jc w:val="both"/>
-      </w:pPr>
-      <w:r>
-        <w:rPr>
-          <w:rFonts w:ascii="Times New Roman" w:hAnsi="Times New Roman" w:eastAsia="宋体" w:cs="Times New Roman"/>
-          <w:b w:val="0"/>
-          <w:sz w:val="24"/>
-        </w:rPr>
-        <w:t>正式评测的 996 次运行均在未经改造的 Pi 智能体上执行，经独立脚本逐项核验，未出现非模型原因导致的核验失败。由于内核通过事件与裁决接口与宿主解耦，该接入方式原则上适用于其他提供工具执行前钩子的智能体框架。</w:t>
-      </w:r>
-    </w:p>
-    <w:p>
-      <w:pPr>
-        <w:keepNext/>
-        <w:snapToGrid w:val="0"/>
-        <w:spacing w:before="200" w:after="120" w:line="360" w:lineRule="auto"/>
-        <w:jc w:val="left"/>
-        <w:outlineLvl w:val="1"/>
-      </w:pPr>
-      <w:r>
-        <w:rPr>
-          <w:rFonts w:ascii="Arial" w:hAnsi="Arial" w:eastAsia="黑体" w:cs="Arial"/>
-          <w:b w:val="0"/>
-          <w:sz w:val="28"/>
-        </w:rPr>
-        <w:t>9.5 与现有方案的对比</w:t>
-      </w:r>
-    </w:p>
-    <w:p>
-      <w:pPr>
-        <w:snapToGrid w:val="0"/>
-        <w:spacing w:before="0" w:after="0" w:line="360" w:lineRule="auto"/>
-        <w:ind w:firstLine="480"/>
-        <w:jc w:val="both"/>
-      </w:pPr>
-      <w:r>
-        <w:rPr>
-          <w:rFonts w:ascii="Times New Roman" w:hAnsi="Times New Roman" w:eastAsia="宋体" w:cs="Times New Roman"/>
-          <w:b w:val="0"/>
-          <w:sz w:val="24"/>
-        </w:rPr>
-        <w:t>表 9-1 从防护对象、授权理解、语义伪装识别、同步路径开销、长程成本与溯源能力六个维度，将本作品与三类代表性方案进行对比。</w:t>
+        <w:t>表 9-1 比较代表性公开方案的机制与本作品的实现选择。表中依据文献和官方配置说明归纳，不是相同硬件、任务与模型条件下的性能排名；具体系统可通过扩展改变其能力。</w:t>
       </w:r>
     </w:p>
     <w:p>
@@ -16875,7 +17186,7 @@
                 <w:b/>
                 <w:sz w:val="24"/>
               </w:rPr>
-              <w:t>生成式护栏与大模型裁判</w:t>
+              <w:t>Jev 风险门控[22]</w:t>
             </w:r>
           </w:p>
         </w:tc>
@@ -16903,7 +17214,9 @@
                 <w:b/>
                 <w:sz w:val="24"/>
               </w:rPr>
-              <w:t>规则与黑白名单</w:t>
+              <w:t>Task Shield</w:t>
+              <w:br/>
+              <w:t>[13]</w:t>
             </w:r>
           </w:p>
         </w:tc>
@@ -16931,7 +17244,7 @@
                 <w:b/>
                 <w:sz w:val="24"/>
               </w:rPr>
-              <w:t>架构改造类系统防御</w:t>
+              <w:t>信息流防御[11–12]</w:t>
             </w:r>
           </w:p>
         </w:tc>
@@ -16991,7 +17304,7 @@
                 <w:b w:val="0"/>
                 <w:sz w:val="24"/>
               </w:rPr>
-              <w:t>防护对象</w:t>
+              <w:t>判定依据</w:t>
             </w:r>
           </w:p>
         </w:tc>
@@ -17018,7 +17331,7 @@
                 <w:b w:val="0"/>
                 <w:sz w:val="24"/>
               </w:rPr>
-              <w:t>单段文本</w:t>
+              <w:t>工具调用风险概率与阈值</w:t>
             </w:r>
           </w:p>
         </w:tc>
@@ -17045,7 +17358,7 @@
                 <w:b w:val="0"/>
                 <w:sz w:val="24"/>
               </w:rPr>
-              <w:t>工具调用</w:t>
+              <w:t>动作与用户任务的对齐关系</w:t>
             </w:r>
           </w:p>
         </w:tc>
@@ -17072,7 +17385,7 @@
                 <w:b w:val="0"/>
                 <w:sz w:val="24"/>
               </w:rPr>
-              <w:t>需改造的智能体</w:t>
+              <w:t>能力约束或信息流标签</w:t>
             </w:r>
           </w:p>
         </w:tc>
@@ -17099,7 +17412,7 @@
                 <w:b w:val="0"/>
                 <w:sz w:val="24"/>
               </w:rPr>
-              <w:t>原生智能体，非侵入接入</w:t>
+              <w:t>授权、来源请求、数据流与硬策略</w:t>
             </w:r>
           </w:p>
         </w:tc>
@@ -17131,7 +17444,7 @@
                 <w:b w:val="0"/>
                 <w:sz w:val="24"/>
               </w:rPr>
-              <w:t>授权理解</w:t>
+              <w:t>模型职责</w:t>
             </w:r>
           </w:p>
         </w:tc>
@@ -17158,7 +17471,7 @@
                 <w:b w:val="0"/>
                 <w:sz w:val="24"/>
               </w:rPr>
-              <w:t>无</w:t>
+              <w:t>类型化风险评分</w:t>
             </w:r>
           </w:p>
         </w:tc>
@@ -17185,7 +17498,7 @@
                 <w:b w:val="0"/>
                 <w:sz w:val="24"/>
               </w:rPr>
-              <w:t>部分（静态）</w:t>
+              <w:t>生成式模型进行对齐检查</w:t>
             </w:r>
           </w:p>
         </w:tc>
@@ -17212,7 +17525,7 @@
                 <w:b w:val="0"/>
                 <w:sz w:val="24"/>
               </w:rPr>
-              <w:t>有</w:t>
+              <w:t>依具体实现而定</w:t>
             </w:r>
           </w:p>
         </w:tc>
@@ -17239,7 +17552,7 @@
                 <w:b w:val="0"/>
                 <w:sz w:val="24"/>
               </w:rPr>
-              <w:t>有（授权锚点与字面授权）</w:t>
+              <w:t>领域微调快镜识别请求；慢镜异步研判</w:t>
             </w:r>
           </w:p>
         </w:tc>
@@ -17271,7 +17584,7 @@
                 <w:b w:val="0"/>
                 <w:sz w:val="24"/>
               </w:rPr>
-              <w:t>语义伪装识别</w:t>
+              <w:t>状态处理</w:t>
             </w:r>
           </w:p>
         </w:tc>
@@ -17298,7 +17611,7 @@
                 <w:b w:val="0"/>
                 <w:sz w:val="24"/>
               </w:rPr>
-              <w:t>较好</w:t>
+              <w:t>默认模板评估当前调用；可扩展上下文</w:t>
             </w:r>
           </w:p>
         </w:tc>
@@ -17325,7 +17638,7 @@
                 <w:b w:val="0"/>
                 <w:sz w:val="24"/>
               </w:rPr>
-              <w:t>易漏检</w:t>
+              <w:t>使用任务与执行上下文</w:t>
             </w:r>
           </w:p>
         </w:tc>
@@ -17352,7 +17665,7 @@
                 <w:b w:val="0"/>
                 <w:sz w:val="24"/>
               </w:rPr>
-              <w:t>依赖具体设计</w:t>
+              <w:t>显式维护能力或标签</w:t>
             </w:r>
           </w:p>
         </w:tc>
@@ -17379,7 +17692,7 @@
                 <w:b w:val="0"/>
                 <w:sz w:val="24"/>
               </w:rPr>
-              <w:t>快镜补充识别，规则提供确定性下限</w:t>
+              <w:t>增量维护安全链；视图有界，完整标签保留</w:t>
             </w:r>
           </w:p>
         </w:tc>
@@ -17411,7 +17724,7 @@
                 <w:b w:val="0"/>
                 <w:sz w:val="24"/>
               </w:rPr>
-              <w:t>同步路径大模型调用</w:t>
+              <w:t>执行控制</w:t>
             </w:r>
           </w:p>
         </w:tc>
@@ -17438,7 +17751,7 @@
                 <w:b w:val="0"/>
                 <w:sz w:val="24"/>
               </w:rPr>
-              <w:t>每步一次</w:t>
+              <w:t>工具调用前按阈值拒绝</w:t>
             </w:r>
           </w:p>
         </w:tc>
@@ -17465,7 +17778,7 @@
                 <w:b w:val="0"/>
                 <w:sz w:val="24"/>
               </w:rPr>
-              <w:t>无</w:t>
+              <w:t>检查后决定是否继续</w:t>
             </w:r>
           </w:p>
         </w:tc>
@@ -17492,7 +17805,7 @@
                 <w:b w:val="0"/>
                 <w:sz w:val="24"/>
               </w:rPr>
-              <w:t>通常每步一次</w:t>
+              <w:t>在执行中约束不可信数据</w:t>
             </w:r>
           </w:p>
         </w:tc>
@@ -17519,7 +17832,7 @@
                 <w:b w:val="0"/>
                 <w:sz w:val="24"/>
               </w:rPr>
-              <w:t>无（快镜为编码器单次前向）</w:t>
+              <w:t>执行前 ALLOW／ASK／BLOCK，支持网页审批</w:t>
             </w:r>
           </w:p>
         </w:tc>
@@ -17551,7 +17864,7 @@
                 <w:b w:val="0"/>
                 <w:sz w:val="24"/>
               </w:rPr>
-              <w:t>长程成本</w:t>
+              <w:t>本作品实测关注点</w:t>
             </w:r>
           </w:p>
         </w:tc>
@@ -17578,7 +17891,7 @@
                 <w:b w:val="0"/>
                 <w:sz w:val="24"/>
               </w:rPr>
-              <w:t>随轨迹增长</w:t>
+              <w:t>未进行同条件实测</w:t>
             </w:r>
           </w:p>
         </w:tc>
@@ -17605,7 +17918,7 @@
                 <w:b w:val="0"/>
                 <w:sz w:val="24"/>
               </w:rPr>
-              <w:t>恒定</w:t>
+              <w:t>未进行同条件实测</w:t>
             </w:r>
           </w:p>
         </w:tc>
@@ -17632,7 +17945,7 @@
                 <w:b w:val="0"/>
                 <w:sz w:val="24"/>
               </w:rPr>
-              <w:t>多随轨迹增长</w:t>
+              <w:t>未进行同条件实测</w:t>
             </w:r>
           </w:p>
         </w:tc>
@@ -17659,7 +17972,7 @@
                 <w:b w:val="0"/>
                 <w:sz w:val="24"/>
               </w:rPr>
-              <w:t>视图有界；内部标签随来源数增长</w:t>
+              <w:t>消融、真实配对、状态充分性与合成压力测试</w:t>
             </w:r>
           </w:p>
         </w:tc>
@@ -17691,7 +18004,7 @@
                 <w:b w:val="0"/>
                 <w:sz w:val="24"/>
               </w:rPr>
-              <w:t>研判与溯源</w:t>
+              <w:t>验证与解释</w:t>
             </w:r>
           </w:p>
         </w:tc>
@@ -17718,7 +18031,7 @@
                 <w:b w:val="0"/>
                 <w:sz w:val="24"/>
               </w:rPr>
-              <w:t>无或文字说明</w:t>
+              <w:t>由接入系统记录</w:t>
             </w:r>
           </w:p>
         </w:tc>
@@ -17745,7 +18058,7 @@
                 <w:b w:val="0"/>
                 <w:sz w:val="24"/>
               </w:rPr>
-              <w:t>规则编号</w:t>
+              <w:t>依据对齐检查结果</w:t>
             </w:r>
           </w:p>
         </w:tc>
@@ -17772,7 +18085,7 @@
                 <w:b w:val="0"/>
                 <w:sz w:val="24"/>
               </w:rPr>
-              <w:t>部分支持</w:t>
+              <w:t>依据能力或标签记录</w:t>
             </w:r>
           </w:p>
         </w:tc>
@@ -17799,7 +18112,7 @@
                 <w:b w:val="0"/>
                 <w:sz w:val="24"/>
               </w:rPr>
-              <w:t>溯源图、时序、原文高亮、引用校验的研判报告</w:t>
+              <w:t>原生事件、接收端回执、来源引用与独立核验</w:t>
             </w:r>
           </w:p>
         </w:tc>
@@ -17843,7 +18156,39 @@
           <w:b w:val="0"/>
           <w:sz w:val="24"/>
         </w:rPr>
-        <w:t>本作品针对大模型智能体在真实环境中面临的提示注入与工具滥用风险，设计并实现了运行时防御系统“双镜 D²Guard”。在系统层面，作品以公开发布的 Pi 编码智能体为防护对象，通过三个组件非侵入接入，支持 Windows 与 Linux 原生部署，并提供攻防过程可视化、网页审批与全链路溯源的安全控制台。在技术层面，作品的创新主要体现在四个方面：提出增量安全链，降低安全判断对完整上下文的依赖；设计规则、快镜与慢镜分层协同的防护内核，其中快镜 D²Guard-Laya 将 System One 式类型化决策模型应用于智能体安全判别；以来源级请求污染实现意图—计划—工具语义对齐；实现了面向原生智能体的非侵入式接入与可独立复核的证据链。此外，针对用户输入中的上下文劫持、角色伪装与越权声明，系统在引用边界之外增加了直接注入特征识别，使含有此类特征的用户消息不再产生授权。</w:t>
+        <w:t>本作品针对长流程智能体中的历史污染保留、语义伪装识别与在线裁决开销，设计并实现双镜 D²Guard。</w:t>
+      </w:r>
+      <w:r>
+        <w:rPr>
+          <w:rFonts w:ascii="Times New Roman" w:hAnsi="Times New Roman" w:eastAsia="宋体" w:cs="Times New Roman"/>
+          <w:b/>
+          <w:sz w:val="24"/>
+        </w:rPr>
+        <w:t>增量安全链持续维护授权、来源污点和数据流</w:t>
+      </w:r>
+      <w:r>
+        <w:rPr>
+          <w:rFonts w:ascii="Times New Roman" w:hAnsi="Times New Roman" w:eastAsia="宋体" w:cs="Times New Roman"/>
+          <w:b w:val="0"/>
+          <w:sz w:val="24"/>
+        </w:rPr>
+        <w:t>，保留早期风险并降低重复读取完整轨迹的成本；</w:t>
+      </w:r>
+      <w:r>
+        <w:rPr>
+          <w:rFonts w:ascii="Times New Roman" w:hAnsi="Times New Roman" w:eastAsia="宋体" w:cs="Times New Roman"/>
+          <w:b/>
+          <w:sz w:val="24"/>
+        </w:rPr>
+        <w:t>以自建的 20,662 条领域样本微调快镜</w:t>
+      </w:r>
+      <w:r>
+        <w:rPr>
+          <w:rFonts w:ascii="Times New Roman" w:hAnsi="Times New Roman" w:eastAsia="宋体" w:cs="Times New Roman"/>
+          <w:b w:val="0"/>
+          <w:sz w:val="24"/>
+        </w:rPr>
+        <w:t>，在内容进入时识别具体任务请求；确定性决策表在执行前裁决，生成式慢镜异步开展证据研判。系统接入真实 Pi 的工具循环，通过原生事件、产物和回执核对执行效果。其贡献在于上述机制的实现与分项验证，而非将通用护栏或类型化决策模型本身作为创新。</w:t>
       </w:r>
     </w:p>
     <w:p>
@@ -17883,6 +18228,38 @@
           <w:b w:val="0"/>
           <w:sz w:val="24"/>
         </w:rPr>
+        <w:t>针对新增的用户输入直接注入识别，补充实验覆盖中英文三类攻击特征及相近正常表述。18 组攻击配对中，无防护时均发生合成凭据外发，开启防护后均在执行前挂起；</w:t>
+      </w:r>
+      <w:r>
+        <w:rPr>
+          <w:rFonts w:ascii="Times New Roman" w:hAnsi="Times New Roman" w:eastAsia="宋体" w:cs="Times New Roman"/>
+          <w:b/>
+          <w:sz w:val="24"/>
+        </w:rPr>
+        <w:t>18 组正常输入配对均完成任务且无挂起或阻断</w:t>
+      </w:r>
+      <w:r>
+        <w:rPr>
+          <w:rFonts w:ascii="Times New Roman" w:hAnsi="Times New Roman" w:eastAsia="宋体" w:cs="Times New Roman"/>
+          <w:b w:val="0"/>
+          <w:sz w:val="24"/>
+        </w:rPr>
+        <w:t>。显式关闭上游思考后的 32 次复测中，新增攻击与正常输入结果保持一致，全部运行有效。两种推理配置分别统计，首轮旧场景回归中的一次超时原样保留，具体范围与限制见《测试样例及测试流程说明文档》第 5.4 节。</w:t>
+      </w:r>
+    </w:p>
+    <w:p>
+      <w:pPr>
+        <w:snapToGrid w:val="0"/>
+        <w:spacing w:before="0" w:after="0" w:line="360" w:lineRule="auto"/>
+        <w:ind w:firstLine="480"/>
+        <w:jc w:val="both"/>
+      </w:pPr>
+      <w:r>
+        <w:rPr>
+          <w:rFonts w:ascii="Times New Roman" w:hAnsi="Times New Roman" w:eastAsia="宋体" w:cs="Times New Roman"/>
+          <w:b w:val="0"/>
+          <w:sz w:val="24"/>
+        </w:rPr>
         <w:t>后续工作将主要围绕长程运行效率、授权交互和验证范围展开。针对来源标签按智能体重复存储及逐事件全量重建带来的开销（2000 步、1360 个来源时单次裁决耗时约 0.5 s），可采用跨智能体共享标签、增量序列化与机密指纹索引；针对正常任务中未获字面授权的敏感访问，可进一步研究基于任务需求的细粒度授权推断与会话内审批复用。在验证范围上，需要设计更多跨会话记忆污染场景进行系统评测，并结合容器或系统级沙箱完善命令执行边界。在此基础上，将继续把 MCP 中间代理扩展为完整的 MCP 网关、适配更多智能体框架，并探索快镜在外发必要性、工具描述越界等更多类型化安全问题上的应用。</w:t>
       </w:r>
     </w:p>
@@ -18141,7 +18518,7 @@
           <w:b w:val="0"/>
           <w:sz w:val="24"/>
         </w:rPr>
-        <w:t>[15] DigitalOcean. What is Jev? TypeSafe AI's System One model[EB/OL]. (2026-09-24)[2026-10-19]. https://www.digitalocean.com/resources/articles/what-is-jev.</w:t>
+        <w:t>[15] Almeida D. Introducing System One models &amp; Jev[EB/OL]. (2026-09-15)[2026-10-20]. https://typesafe.ai/blog/introducing-system-one-models-and-jev.</w:t>
       </w:r>
     </w:p>
     <w:p>
@@ -18238,6 +18615,38 @@
           <w:sz w:val="24"/>
         </w:rPr>
         <w:t>[21] Guo C, Pleiss G, Sun Y, et al. On calibration of modern neural networks[C]//Proceedings of the 34th International Conference on Machine Learning. 2017: 1321-1330.</w:t>
+      </w:r>
+    </w:p>
+    <w:p>
+      <w:pPr>
+        <w:snapToGrid w:val="0"/>
+        <w:spacing w:before="0" w:after="0" w:line="360" w:lineRule="auto"/>
+        <w:ind w:hanging="520" w:left="520"/>
+        <w:jc w:val="left"/>
+      </w:pPr>
+      <w:r>
+        <w:rPr>
+          <w:rFonts w:ascii="Times New Roman" w:hAnsi="Times New Roman" w:eastAsia="宋体" w:cs="Times New Roman"/>
+          <w:b w:val="0"/>
+          <w:sz w:val="24"/>
+        </w:rPr>
+        <w:t>[22] ByteDance. Guardrails: pre-tool-call authorization[EB/OL]. [2026-10-20]. https://github.com/bytedance/deer-flow/blob/main/backend/docs/GUARDRAILS.md.</w:t>
+      </w:r>
+    </w:p>
+    <w:p>
+      <w:pPr>
+        <w:snapToGrid w:val="0"/>
+        <w:spacing w:before="0" w:after="0" w:line="360" w:lineRule="auto"/>
+        <w:ind w:hanging="520" w:left="520"/>
+        <w:jc w:val="left"/>
+      </w:pPr>
+      <w:r>
+        <w:rPr>
+          <w:rFonts w:ascii="Times New Roman" w:hAnsi="Times New Roman" w:eastAsia="宋体" w:cs="Times New Roman"/>
+          <w:b w:val="0"/>
+          <w:sz w:val="24"/>
+        </w:rPr>
+        <w:t>[23] Chennabasappa S, Nikolaidis C, Song D, et al. LlamaFirewall: an open source guardrail system for building secure AI agents[EB/OL]. arXiv:2505.03574, 2025.</w:t>
       </w:r>
     </w:p>
     <w:sectPr>
@@ -18341,7 +18750,7 @@
         <w:rFonts w:ascii="Times New Roman" w:hAnsi="Times New Roman" w:eastAsia="宋体" w:cs="Times New Roman"/>
         <w:sz w:val="21"/>
       </w:rPr>
-      <w:t>46</w:t>
+      <w:t>40</w:t>
     </w:r>
     <w:r>
       <w:rPr>
@@ -18366,6 +18775,16 @@
   <w:p>
     <w:pPr>
       <w:pStyle w:val="5"/>
+    </w:pPr>
+  </w:p>
+</w:ftr>
+</file>
+
+<file path=word/footer3.xml><?xml version="1.0" encoding="utf-8"?>
+<w:ftr xmlns:m="http://schemas.openxmlformats.org/officeDocument/2006/math" xmlns:mc="http://schemas.openxmlformats.org/markup-compatibility/2006" xmlns:mo="http://schemas.microsoft.com/office/mac/office/2008/main" xmlns:mv="urn:schemas-microsoft-com:mac:vml" xmlns:o="urn:schemas-microsoft-com:office:office" xmlns:r="http://schemas.openxmlformats.org/officeDocument/2006/relationships" xmlns:v="urn:schemas-microsoft-com:vml" xmlns:w10="urn:schemas-microsoft-com:office:word" xmlns:w14="http://schemas.microsoft.com/office/word/2010/wordml" xmlns:w="http://schemas.openxmlformats.org/wordprocessingml/2006/main" xmlns:wne="http://schemas.microsoft.com/office/word/2006/wordml" xmlns:wp14="http://schemas.microsoft.com/office/word/2010/wordprocessingDrawing" xmlns:wp="http://schemas.openxmlformats.org/drawingml/2006/wordprocessingDrawing" xmlns:wpc="http://schemas.microsoft.com/office/word/2010/wordprocessingCanvas" xmlns:wpg="http://schemas.microsoft.com/office/word/2010/wordprocessingGroup" xmlns:wpi="http://schemas.microsoft.com/office/word/2010/wordprocessingInk" xmlns:wps="http://schemas.microsoft.com/office/word/2010/wordprocessingShape" mc:Ignorable="w14 wp14">
+  <w:p>
+    <w:pPr>
+      <w:pStyle w:val="Footer"/>
     </w:pPr>
   </w:p>
 </w:ftr>

</xml_diff>

<commit_message>
Complete D2Guard-Laya evaluation delivery
</commit_message>
<xml_diff>
--- a/submission/周兴富-双镜D²Guard-整体设计文档.docx
+++ b/submission/周兴富-双镜D²Guard-整体设计文档.docx
@@ -732,7 +732,7 @@
           <w:sz w:val="24"/>
         </w:rPr>
         <w:tab/>
-        <w:t>3</w:t>
+        <w:t>4</w:t>
       </w:r>
     </w:p>
     <w:p>
@@ -759,7 +759,7 @@
           <w:sz w:val="24"/>
         </w:rPr>
         <w:tab/>
-        <w:t>4</w:t>
+        <w:t>5</w:t>
       </w:r>
     </w:p>
     <w:p>
@@ -1461,7 +1461,7 @@
           <w:sz w:val="24"/>
         </w:rPr>
         <w:tab/>
-        <w:t>29</w:t>
+        <w:t>28</w:t>
       </w:r>
     </w:p>
     <w:p>
@@ -1704,7 +1704,7 @@
           <w:sz w:val="28"/>
         </w:rPr>
         <w:tab/>
-        <w:t>33</w:t>
+        <w:t>34</w:t>
       </w:r>
     </w:p>
     <w:p>
@@ -1731,7 +1731,7 @@
           <w:sz w:val="24"/>
         </w:rPr>
         <w:tab/>
-        <w:t>33</w:t>
+        <w:t>34</w:t>
       </w:r>
     </w:p>
     <w:p>
@@ -1758,7 +1758,7 @@
           <w:sz w:val="24"/>
         </w:rPr>
         <w:tab/>
-        <w:t>34</w:t>
+        <w:t>35</w:t>
       </w:r>
     </w:p>
     <w:p>
@@ -1785,7 +1785,7 @@
           <w:sz w:val="28"/>
         </w:rPr>
         <w:tab/>
-        <w:t>35</w:t>
+        <w:t>36</w:t>
       </w:r>
     </w:p>
     <w:p>
@@ -1812,7 +1812,7 @@
           <w:sz w:val="24"/>
         </w:rPr>
         <w:tab/>
-        <w:t>35</w:t>
+        <w:t>36</w:t>
       </w:r>
     </w:p>
     <w:p>
@@ -1839,7 +1839,7 @@
           <w:sz w:val="24"/>
         </w:rPr>
         <w:tab/>
-        <w:t>35</w:t>
+        <w:t>36</w:t>
       </w:r>
     </w:p>
     <w:p>
@@ -1866,7 +1866,7 @@
           <w:sz w:val="24"/>
         </w:rPr>
         <w:tab/>
-        <w:t>36</w:t>
+        <w:t>37</w:t>
       </w:r>
     </w:p>
     <w:p>
@@ -1893,7 +1893,7 @@
           <w:sz w:val="24"/>
         </w:rPr>
         <w:tab/>
-        <w:t>36</w:t>
+        <w:t>37</w:t>
       </w:r>
     </w:p>
     <w:p>
@@ -1920,7 +1920,7 @@
           <w:sz w:val="24"/>
         </w:rPr>
         <w:tab/>
-        <w:t>36</w:t>
+        <w:t>37</w:t>
       </w:r>
     </w:p>
     <w:p>
@@ -1947,7 +1947,7 @@
           <w:sz w:val="28"/>
         </w:rPr>
         <w:tab/>
-        <w:t>38</w:t>
+        <w:t>39</w:t>
       </w:r>
     </w:p>
     <w:p>
@@ -1974,7 +1974,7 @@
           <w:sz w:val="28"/>
         </w:rPr>
         <w:tab/>
-        <w:t>39</w:t>
+        <w:t>41</w:t>
       </w:r>
       <w:r>
         <w:fldChar w:fldCharType="end"/>
@@ -2032,9 +2032,10 @@
       <w:r>
         <w:rPr>
           <w:rFonts w:ascii="Times New Roman" w:hAnsi="Times New Roman" w:eastAsia="宋体" w:cs="Times New Roman"/>
-          <w:sz w:val="24"/>
-        </w:rPr>
-        <w:t xml:space="preserve">随着大模型智能体获得文件读写、命令执行和工具调用能力，提示注入的危害已由文本误导扩展至凭据外泄与越权操作。</w:t>
+          <w:b w:val="0"/>
+          <w:sz w:val="24"/>
+        </w:rPr>
+        <w:t>随着大模型智能体获得文件读写、命令执行和工具调用能力，提示注入的危害已由文本误导扩展至凭据外泄与越权操作。针对长流程任务中早期注入易被稀释、逐步重读完整轨迹开销大以及语义伪装注入难以被规则识别等问题，本作品设计并实现了大模型智能体运行时防御系统——双镜 D²Guard，覆盖检测、研判、阻断与溯源全过程。作品具有三方面特色：一是面向原生智能体，以执行前钩子插件、API 侧网关与 MCP 中间代理非侵入地接入开源编码智能体 Pi，在真实工具调用循环中实施防护；二是提出增量安全链，在事件发生时抽取用户授权、来源污点、外部指令与数据流等安全分量并附原文证据引用，裁决只读取有界的状态视图，不再重读完整轨迹；三是构建规则、快镜与慢镜分层协同的防护内核：规则层执行机密指纹、敏感目标与硬策略等确定性检查；快镜 D²Guard-Laya 由本作品以自建的 20,662 条领域样本（真实文本占 42.1%）微调多语言 Laya 得到，在内容进入时识别其中的具体任务请求并写入安全链；决策表据此在执行前作出放行、挂起或阻断的裁决；慢镜在挂起或阻断后调用大模型，依据证据引用回溯原文，还原跨主智能体、子智能体与 MCP 工具的攻击路径并生成可核验的研判报告，不改变已作出的裁决。安全控制台以可视化方式展示上述过程并支持网页审批，可部署于 Windows 与 Linux。在覆盖 15 类攻击手法的 83 个场景、996 次真实运行中，有效攻击运行的攻击成功率由无防护时的 67.1%（</w:t>
       </w:r>
       <w:r>
         <w:rPr>
@@ -2042,14 +2043,15 @@
           <w:b/>
           <w:sz w:val="24"/>
         </w:rPr>
-        <w:t xml:space="preserve">针对长流程任务中早期注入易被稀释、逐步重读完整轨迹开销大以及语义伪装注入难以被规则识别等问题，</w:t>
-      </w:r>
-      <w:r>
-        <w:rPr>
-          <w:rFonts w:ascii="Times New Roman" w:hAnsi="Times New Roman" w:eastAsia="宋体" w:cs="Times New Roman"/>
-          <w:sz w:val="24"/>
-        </w:rPr>
-        <w:t xml:space="preserve">本作品设计并实现了大模型智能体运行时防御系统——双镜 D²Guard，覆盖检测、研判、阻断与溯源全过程。作品具有三方面特色：一是面向原生智能体，以执行前钩子插件、API 侧网关与 MCP 中间代理非侵入地接入开源编码智能体 Pi，在真实工具调用循环中实施防护；二是</w:t>
+        <w:t>110／164</w:t>
+      </w:r>
+      <w:r>
+        <w:rPr>
+          <w:rFonts w:ascii="Times New Roman" w:hAnsi="Times New Roman" w:eastAsia="宋体" w:cs="Times New Roman"/>
+          <w:b w:val="0"/>
+          <w:sz w:val="24"/>
+        </w:rPr>
+        <w:t>）降至 0（</w:t>
       </w:r>
       <w:r>
         <w:rPr>
@@ -2057,44 +2059,21 @@
           <w:b/>
           <w:sz w:val="24"/>
         </w:rPr>
-        <w:t xml:space="preserve">提出增量安全链</w:t>
-      </w:r>
-      <w:r>
-        <w:rPr>
-          <w:rFonts w:ascii="Times New Roman" w:hAnsi="Times New Roman" w:eastAsia="宋体" w:cs="Times New Roman"/>
-          <w:sz w:val="24"/>
-        </w:rPr>
-        <w:t xml:space="preserve">，在事件发生时抽取用户授权、来源污点、外部指令与数据流等安全分量并附原文证据引用，裁决只读取有界的状态视图，不再重读完整轨迹；三是</w:t>
-      </w:r>
-      <w:r>
-        <w:rPr>
-          <w:rFonts w:ascii="Times New Roman" w:hAnsi="Times New Roman" w:eastAsia="宋体" w:cs="Times New Roman"/>
+        <w:t>0／165</w:t>
+      </w:r>
+      <w:r>
+        <w:rPr>
+          <w:rFonts w:ascii="Times New Roman" w:hAnsi="Times New Roman" w:eastAsia="宋体" w:cs="Times New Roman"/>
+          <w:b w:val="0"/>
+          <w:sz w:val="24"/>
+        </w:rPr>
+        <w:t>）；正常任务无一被阻断，其中 92.4% 无需人工干预即自动完成，其余 7.6% 等待一次人工确认，929 个可确认良性动作均未因自身裁决被误挂起，另有 2 次会话连带暂停；单动作裁决耗时中位数为 8 ms，干净环境下任务耗时与无防护时基本一致。在四类 CVE 复现与跨来源拆分注入评测中，攻击成功合计由 9／15 降为 0／15；用户输入直接注入评测中，外发成功由 18／18 降至 0／18，相近正常输入均未被挂起。</w:t>
+      </w:r>
+      <w:r>
+        <w:rPr>
           <w:b/>
-          <w:sz w:val="24"/>
-        </w:rPr>
-        <w:t xml:space="preserve">构建规则、快镜与慢镜分层协同的防护内核</w:t>
-      </w:r>
-      <w:r>
-        <w:rPr>
-          <w:rFonts w:ascii="Times New Roman" w:hAnsi="Times New Roman" w:eastAsia="宋体" w:cs="Times New Roman"/>
-          <w:sz w:val="24"/>
-        </w:rPr>
-        <w:t xml:space="preserve">：规则层执行机密指纹、敏感目标与硬策略等确定性检查；快镜 D²Guard-Laya 由本作品以自建的 20,662 条领域样本（真实文本占 42.1%）微调多语言 Laya 得到，在内容进入时识别其中的具体任务请求并写入安全链；决策表据此在执行前作出放行、挂起或阻断的裁决；慢镜在挂起或阻断后调用大模型，依据证据引用回溯原文，还原跨主智能体、子智能体与 MCP 工具的攻击路径并生成可核验的研判报告，不改变已作出的裁决。安全控制台以可视化方式展示上述过程并支持网页审批，可部署于 Windows 与 Linux。</w:t>
-      </w:r>
-      <w:r>
-        <w:rPr>
-          <w:rFonts w:ascii="Times New Roman" w:hAnsi="Times New Roman" w:eastAsia="宋体" w:cs="Times New Roman"/>
-          <w:b/>
-          <w:sz w:val="24"/>
-        </w:rPr>
-        <w:t xml:space="preserve">在覆盖 15 类攻击手法的 83 个场景、996 次真实运行中，无防护时攻击成功率为 91.7%，开启防护后降至 0；正常任务无一被阻断，其中 92.4% 无需人工干预即自动完成，其余 7.6% 因模型自行访问未授权的敏感目标而等待一次人工确认，929 个可确认良性动作均未被误挂起；单动作裁决耗时中位数为 8 ms，干净环境下任务耗时与无防护时基本一致。</w:t>
-      </w:r>
-      <w:r>
-        <w:rPr>
-          <w:rFonts w:ascii="Times New Roman" w:hAnsi="Times New Roman" w:eastAsia="宋体" w:cs="Times New Roman"/>
-          <w:sz w:val="24"/>
-        </w:rPr>
-        <w:t xml:space="preserve">在 4 个真实 CVE 复现与多轮拆分注入的补充实验中，攻击成功由 9／15 降为 0／15；补充的用户输入直接注入实验中，外发成功由 18／18 降至 0／18，相近正常输入均未被挂起。</w:t>
+        </w:rPr>
+        <w:t xml:space="preserve"> 跨用户轮次拆分评测为 3／3→0／3，干净受保护完成 2／3，另 1 次未授权外发等待确认。</w:t>
       </w:r>
     </w:p>
     <w:p>
@@ -5000,7 +4979,7 @@
                 <w:b w:val="0"/>
                 <w:sz w:val="24"/>
               </w:rPr>
-              <w:t>防护关闭与开启两种条件下，在模型实际发起攻击动作的运行中，接收端收到机密或敏感写入、执行实际发生的比例</w:t>
+              <w:t>防护关闭与开启两种条件下，在模型运行有效且可判分的攻击运行中，接收端收到机密或敏感写入、执行实际发生的比例；模型失败、判分不可用与模型未发起攻击的运行单独列出，不计为防御成功</w:t>
             </w:r>
           </w:p>
         </w:tc>
@@ -5640,42 +5619,9 @@
       <w:r>
         <w:rPr>
           <w:rFonts w:ascii="Times New Roman" w:hAnsi="Times New Roman" w:eastAsia="宋体" w:cs="Times New Roman"/>
-          <w:b w:val="0"/>
-          <w:sz w:val="24"/>
-        </w:rPr>
-        <w:t xml:space="preserve">MCP 中间代理位于智能体与 MCP 服务器之间，接管 initialize、tools/list 与 tools/call 流程，支持 stdio 与 HTTP 两类传输方式。工具描述在列出时即作为 </w:t>
-      </w:r>
-      <w:r>
-        <w:rPr>
-          <w:rFonts w:ascii="Times New Roman" w:hAnsi="Times New Roman" w:eastAsia="宋体" w:cs="Times New Roman"/>
-          <w:b w:val="0"/>
-          <w:sz w:val="24"/>
-        </w:rPr>
-        <w:t>MCP_DESC</w:t>
-      </w:r>
-      <w:r>
-        <w:rPr>
-          <w:rFonts w:ascii="Times New Roman" w:hAnsi="Times New Roman" w:eastAsia="宋体" w:cs="Times New Roman"/>
-          <w:b w:val="0"/>
-          <w:sz w:val="24"/>
-        </w:rPr>
-        <w:t xml:space="preserve"> 类型的来源摄入，返回字段作为 </w:t>
-      </w:r>
-      <w:r>
-        <w:rPr>
-          <w:rFonts w:ascii="Times New Roman" w:hAnsi="Times New Roman" w:eastAsia="宋体" w:cs="Times New Roman"/>
-          <w:b w:val="0"/>
-          <w:sz w:val="24"/>
-        </w:rPr>
-        <w:t>MCP_RET</w:t>
-      </w:r>
-      <w:r>
-        <w:rPr>
-          <w:rFonts w:ascii="Times New Roman" w:hAnsi="Times New Roman" w:eastAsia="宋体" w:cs="Times New Roman"/>
-          <w:b w:val="0"/>
-          <w:sz w:val="24"/>
-        </w:rPr>
-        <w:t xml:space="preserve"> 类型的来源摄入，二者均视为不可信内容并经过快镜标注；工具调用参数与已批准的裁决绑定。因此，工具描述中隐藏的指令在智能体首次列出工具时即被记录。</w:t>
+          <w:sz w:val="24"/>
+        </w:rPr>
+        <w:t xml:space="preserve">MCP 中间代理位于智能体与 MCP 服务器之间，接管 initialize、tools/list 与 tools/call 流程，支持 stdio 与 HTTP 两类传输方式。工具描述在列出时即作为 MCP_DESC 类型的来源摄入，返回字段作为 MCP_RET 类型的来源摄入，二者均视为不可信内容并经过快镜标注；工具调用参数与已批准的裁决绑定。因此，工具描述中隐藏的指令在智能体首次列出工具时即被记录。同一任务可同时接入多个 MCP 服务器，工具按“服务器标识/工具名”区分，每次调用只路由到一个服务器并记录其服务器标识，该标识写入来源 URI 与溯源图中的服务器节点，从而在多服务器场景下区分同名工具并保持来源归属。</w:t>
       </w:r>
     </w:p>
     <w:p>
@@ -9199,7 +9145,7 @@
           <w:b w:val="0"/>
           <w:sz w:val="24"/>
         </w:rPr>
-        <w:t>按照赛题对检测、研判、阻断与溯源的要求，内核的处理流程划分为四个环节（图 5-1）。检测环节由规则层与快镜完成，识别外部内容中的任务请求、机密与敏感目标，并将结果写入安全链；研判环节由决策表完成，将候选动作与授权锚点、污染来源和策略谓词进行比对，给出风险等级、命中规则与证据引用；阻断环节由三个接入组件在副作用发生前执行裁决，挂起的动作交由用户审批；溯源环节由溯源图与慢镜完成，在挂起或阻断后还原攻击路径并生成研判报告。前三个环节在本地同步完成，正式评测中本地路径比例为 100%（1942／1942）；溯源环节异步执行，其结论不改变已作出的裁决。</w:t>
+        <w:t>按照赛题对检测、研判、阻断与溯源的要求，内核的处理流程划分为四个环节（图 5-1）。检测环节由规则层与快镜完成，识别外部内容中的任务请求、机密与敏感目标，并将结果写入安全链；研判环节由决策表完成，将候选动作与授权锚点、污染来源和策略谓词进行比对，给出风险等级、命中规则与证据引用；阻断环节由三个接入组件在副作用发生前执行裁决，挂起的动作交由用户审批；溯源环节由溯源图与慢镜完成，在挂起或阻断后还原攻击路径并生成研判报告。前三个环节在本地同步完成，83 场景矩阵评测中本地路径比例为 100%（1942／1942）；溯源环节异步执行，其结论不改变已作出的裁决。</w:t>
       </w:r>
     </w:p>
     <w:p>
@@ -14346,7 +14292,7 @@
                 <w:b w:val="0"/>
                 <w:sz w:val="24"/>
               </w:rPr>
-              <w:t>片段重叠切分；同一来源的指令跨片段合并；外发侧使用滑窗指纹</w:t>
+              <w:t>片段重叠切分与滑窗机密指纹；同一会话分轮摄入引用材料，后续裁决复用此前来源污点</w:t>
             </w:r>
           </w:p>
         </w:tc>
@@ -14919,7 +14865,7 @@
           <w:b w:val="0"/>
           <w:sz w:val="24"/>
         </w:rPr>
-        <w:t>安全控制台为 Web 应用，全部视图由每轮运行的证据库确定性生成，页面上的数字均读自正式评测汇总文件与运行证据。控制台按功能分为态势、管理、执行与分析四组页面（表 8-1），界面示例见图 1-1 至图 1-3 与图 5-3。</w:t>
+        <w:t>安全控制台为 Web 应用，全部视图由每轮运行的证据库确定性生成，页面上的数字均读自83 场景矩阵评测汇总文件与运行证据。控制台按功能分为态势、管理、执行与分析四组页面（表 8-1），界面示例见图 1-1 至图 1-3 与图 5-3。</w:t>
       </w:r>
     </w:p>
     <w:p>
@@ -15127,7 +15073,7 @@
                 <w:b w:val="0"/>
                 <w:sz w:val="24"/>
               </w:rPr>
-              <w:t>正式评测总体结果、各攻击族攻防对比、消融结果、安全链压缩曲线、运行时防御链路回放</w:t>
+              <w:t>83 场景矩阵评测总体结果、各攻击族攻防对比、消融结果、安全链压缩曲线、运行时防御链路回放</w:t>
             </w:r>
           </w:p>
         </w:tc>
@@ -16770,7 +16716,7 @@
           <w:rFonts w:ascii="Times New Roman" w:hAnsi="Times New Roman" w:eastAsia="宋体" w:cs="Times New Roman"/>
           <w:sz w:val="24"/>
         </w:rPr>
-        <w:t xml:space="preserve">实验表明，正式评测中单动作裁决耗时的中位数为 8 ms；真实运行中上下文与安全状态之比的中位数为 3.06，最大为 19.2；</w:t>
+        <w:t xml:space="preserve">实验表明，83 场景矩阵评测中单动作裁决耗时的中位数为 8 ms；真实运行中上下文与安全状态之比的中位数为 3.06，最大为 19.2；</w:t>
       </w:r>
       <w:r>
         <w:rPr>
@@ -16942,7 +16888,7 @@
           <w:rFonts w:ascii="Times New Roman" w:hAnsi="Times New Roman" w:eastAsia="宋体" w:cs="Times New Roman"/>
           <w:sz w:val="24"/>
         </w:rPr>
-        <w:t xml:space="preserve">实验中，语义伪装、多语言与混淆变体攻击均在副作用发生前被挂起，对抗变体族的攻击成功由无防护时的 53／54 降为 0／26，</w:t>
+        <w:t xml:space="preserve">实验中，语义伪装、多语言与混淆变体攻击均在副作用发生前被挂起，对抗变体族的攻击成功由无防护时的 53／60 降为 0／60，</w:t>
       </w:r>
       <w:r>
         <w:rPr>
@@ -16950,7 +16896,7 @@
           <w:b/>
           <w:sz w:val="24"/>
         </w:rPr>
-        <w:t xml:space="preserve">可确认良性动作被误挂起的比例为 0／929</w:t>
+        <w:t xml:space="preserve">可确认良性动作因自身裁决被误挂起的比例为 0／929</w:t>
       </w:r>
       <w:r>
         <w:rPr>
@@ -17022,7 +16968,7 @@
           <w:b w:val="0"/>
           <w:sz w:val="24"/>
         </w:rPr>
-        <w:t>正式评测的 996 次运行均在未经改造的 Pi 智能体上执行，经独立脚本逐项核验，未出现非模型原因导致的核验失败。由于内核通过事件与裁决接口与宿主解耦，该接入方式原则上适用于其他提供工具执行前钩子的智能体框架。</w:t>
+        <w:t>83 场景矩阵评测的 996 次运行均在未经改造的 Pi 智能体上执行，经独立脚本逐项核验，未出现非模型原因导致的核验失败。由于内核通过事件与裁决接口与宿主解耦，该接入方式原则上适用于其他提供工具执行前钩子的智能体框架。</w:t>
       </w:r>
     </w:p>
     <w:p>
@@ -18022,17 +17968,58 @@
       <w:r>
         <w:rPr>
           <w:rFonts w:ascii="Times New Roman" w:hAnsi="Times New Roman" w:eastAsia="宋体" w:cs="Times New Roman"/>
+          <w:b w:val="0"/>
+          <w:sz w:val="24"/>
+        </w:rPr>
+        <w:t>在覆盖 15 类攻击手法的 83 个场景、996 次真实运行中，在模型有效且可判分的攻击运行中，攻击成功率由无防护时的 67.1%（</w:t>
+      </w:r>
+      <w:r>
+        <w:rPr>
+          <w:rFonts w:ascii="Times New Roman" w:hAnsi="Times New Roman" w:eastAsia="宋体" w:cs="Times New Roman"/>
           <w:b/>
           <w:sz w:val="24"/>
         </w:rPr>
-        <w:t xml:space="preserve">在覆盖 15 类攻击手法的 83 个场景、996 次真实运行中，无防护时攻击成功率为 91.7%，开启防护后降至 0；正常任务被阻断为 0，自动完成率为 92.4%，其余运行等待一次人工确认，可确认良性动作误挂起为 0／929；单动作裁决耗时中位数为 8 ms，干净环境下任务耗时与无防护时基本一致，本地路径比例为 100%。</w:t>
-      </w:r>
-      <w:r>
-        <w:rPr>
-          <w:rFonts w:ascii="Times New Roman" w:hAnsi="Times New Roman" w:eastAsia="宋体" w:cs="Times New Roman"/>
-          <w:sz w:val="24"/>
-        </w:rPr>
-        <w:t xml:space="preserve">此外，在 CVE-2025-53773、CVE-2025-54135、CVE-2025-55284 与 CVE-2025-32711 四个真实漏洞复现场景及多轮拆分注入场景的补充实验中，攻击成功由无防护时的 9／15 降为 0／15。测试方法与详细结果见《测试样例及测试流程说明文档》。消融实验验证了快镜在兼顾安全性与可用性方面的作用，决策充分性实验与长程压力测试表明，裁决所需的安全状态保持精简，早期污点不会丢失。</w:t>
+        <w:t>110／164</w:t>
+      </w:r>
+      <w:r>
+        <w:rPr>
+          <w:rFonts w:ascii="Times New Roman" w:hAnsi="Times New Roman" w:eastAsia="宋体" w:cs="Times New Roman"/>
+          <w:b w:val="0"/>
+          <w:sz w:val="24"/>
+        </w:rPr>
+        <w:t>）降至 0（</w:t>
+      </w:r>
+      <w:r>
+        <w:rPr>
+          <w:rFonts w:ascii="Times New Roman" w:hAnsi="Times New Roman" w:eastAsia="宋体" w:cs="Times New Roman"/>
+          <w:b/>
+          <w:sz w:val="24"/>
+        </w:rPr>
+        <w:t>0／165</w:t>
+      </w:r>
+      <w:r>
+        <w:rPr>
+          <w:rFonts w:ascii="Times New Roman" w:hAnsi="Times New Roman" w:eastAsia="宋体" w:cs="Times New Roman"/>
+          <w:b w:val="0"/>
+          <w:sz w:val="24"/>
+        </w:rPr>
+        <w:t xml:space="preserve">）；正常任务被阻断为 0，自动完成率为 92.4%，其余运行等待一次人工确认，可确认良性动作因自身裁决被误挂起为 0／929；单动作裁决耗时中位数为 8 ms，干净环境下任务耗时与无防护时基本一致，本地路径比例为 100%。四类 CVE 与跨来源拆分评测的攻击成功合计为 9／15→0／15，其中 MCP 配置篡改在无防护时未触发，不据此评价防护效果。跨用户轮次拆分注入评测共 12 次，攻击成功由 3／3 降为 0／3，干净环境开启防护后正常完成 </w:t>
+      </w:r>
+      <w:r>
+        <w:rPr>
+          <w:rFonts w:ascii="Times New Roman" w:hAnsi="Times New Roman" w:eastAsia="宋体" w:cs="Times New Roman"/>
+          <w:b/>
+          <w:sz w:val="24"/>
+        </w:rPr>
+        <w:t>2／3</w:t>
+      </w:r>
+      <w:r>
+        <w:rPr>
+          <w:rFonts w:ascii="Times New Roman" w:hAnsi="Times New Roman" w:eastAsia="宋体" w:cs="Times New Roman"/>
+          <w:b w:val="0"/>
+          <w:sz w:val="24"/>
+        </w:rPr>
+        <w:t>，另 1 次因未授权外发等待确认。测试方法与详细结果见《测试样例及测试流程说明文档》。消融实验验证了快镜在兼顾安全性与可用性方面的作用，决策充分性实验与长程压力测试表明，裁决所需的安全状态保持精简，早期污点不会丢失。</w:t>
       </w:r>
     </w:p>
     <w:p>
@@ -18047,7 +18034,7 @@
           <w:rFonts w:ascii="Times New Roman" w:hAnsi="Times New Roman" w:eastAsia="宋体" w:cs="Times New Roman"/>
           <w:sz w:val="24"/>
         </w:rPr>
-        <w:t xml:space="preserve">针对用户输入中的直接注入，补充实验覆盖中英文三类攻击特征及相近正常表述：18 组攻击配对中，无防护时均发生合成凭据外发，开启防护后均在执行前被挂起；</w:t>
+        <w:t xml:space="preserve">针对用户输入中的直接注入，评测覆盖中英文三类攻击特征及相近正常表述：18 组攻击配对中，无防护时均发生合成凭据外发，开启防护后均在执行前被挂起；</w:t>
       </w:r>
       <w:r>
         <w:rPr>
@@ -18613,7 +18600,7 @@
         <w:rFonts w:ascii="Times New Roman" w:hAnsi="Times New Roman" w:eastAsia="宋体" w:cs="Times New Roman"/>
         <w:sz w:val="21"/>
       </w:rPr>
-      <w:t>40</w:t>
+      <w:t>42</w:t>
     </w:r>
     <w:r>
       <w:rPr>

</xml_diff>

<commit_message>
Final review: logo, console wording, docs
</commit_message>
<xml_diff>
--- a/submission/周兴富-双镜D²Guard-整体设计文档.docx
+++ b/submission/周兴富-双镜D²Guard-整体设计文档.docx
@@ -82,47 +82,46 @@
     <w:p>
       <w:pPr>
         <w:spacing w:line="360" w:lineRule="auto"/>
+        <w:jc w:val="center"/>
         <w:rPr>
           <w:rFonts w:ascii="宋体" w:hAnsi="宋体" w:cs="宋体"/>
           <w:sz w:val="24"/>
         </w:rPr>
       </w:pPr>
-    </w:p>
-    <w:p>
-      <w:pPr>
-        <w:spacing w:line="360" w:lineRule="auto"/>
-        <w:rPr>
-          <w:rFonts w:ascii="宋体" w:hAnsi="宋体" w:cs="宋体"/>
-          <w:sz w:val="24"/>
-        </w:rPr>
-      </w:pPr>
-    </w:p>
-    <w:p>
-      <w:pPr>
-        <w:spacing w:line="360" w:lineRule="auto"/>
-        <w:rPr>
-          <w:rFonts w:ascii="宋体" w:hAnsi="宋体" w:cs="宋体"/>
-          <w:sz w:val="24"/>
-        </w:rPr>
-      </w:pPr>
-    </w:p>
-    <w:p>
-      <w:pPr>
-        <w:spacing w:line="360" w:lineRule="auto"/>
-        <w:rPr>
-          <w:rFonts w:ascii="宋体" w:hAnsi="宋体" w:cs="宋体"/>
-          <w:sz w:val="24"/>
-        </w:rPr>
-      </w:pPr>
-    </w:p>
-    <w:p>
-      <w:pPr>
-        <w:spacing w:line="360" w:lineRule="auto"/>
-        <w:rPr>
-          <w:rFonts w:ascii="宋体" w:hAnsi="宋体" w:cs="宋体"/>
-          <w:sz w:val="24"/>
-        </w:rPr>
-      </w:pPr>
+      <w:r>
+        <w:drawing>
+          <wp:inline xmlns:a="http://schemas.openxmlformats.org/drawingml/2006/main" xmlns:pic="http://schemas.openxmlformats.org/drawingml/2006/picture">
+            <wp:extent cx="918394" cy="1080000"/>
+            <wp:docPr id="10" name="Picture 10"/>
+            <wp:cNvGraphicFramePr>
+              <a:graphicFrameLocks noChangeAspect="1"/>
+            </wp:cNvGraphicFramePr>
+            <a:graphic>
+              <a:graphicData uri="http://schemas.openxmlformats.org/drawingml/2006/picture">
+                <pic:pic>
+                  <pic:nvPicPr>
+                    <pic:cNvPr id="0" name="logo-cover.png"/>
+                    <pic:cNvPicPr/>
+                  </pic:nvPicPr>
+                  <pic:blipFill>
+                    <a:blip r:embed="rId16"/>
+                    <a:stretch>
+                      <a:fillRect/>
+                    </a:stretch>
+                  </pic:blipFill>
+                  <pic:spPr>
+                    <a:xfrm>
+                      <a:off x="0" y="0"/>
+                      <a:ext cx="918394" cy="1080000"/>
+                    </a:xfrm>
+                    <a:prstGeom prst="rect"/>
+                  </pic:spPr>
+                </pic:pic>
+              </a:graphicData>
+            </a:graphic>
+          </wp:inline>
+        </w:drawing>
+      </w:r>
     </w:p>
     <w:p>
       <w:pPr>
@@ -2032,10 +2031,9 @@
       <w:r>
         <w:rPr>
           <w:rFonts w:ascii="Times New Roman" w:hAnsi="Times New Roman" w:eastAsia="宋体" w:cs="Times New Roman"/>
-          <w:b w:val="0"/>
-          <w:sz w:val="24"/>
-        </w:rPr>
-        <w:t>随着大模型智能体获得文件读写、命令执行和工具调用能力，提示注入的危害已由文本误导扩展至凭据外泄与越权操作。针对长流程任务中早期注入易被稀释、逐步重读完整轨迹开销大以及语义伪装注入难以被规则识别等问题，本作品设计并实现了大模型智能体运行时防御系统——双镜 D²Guard，覆盖检测、研判、阻断与溯源全过程。作品具有三方面特色：一是面向原生智能体，以执行前钩子插件、API 侧网关与 MCP 中间代理非侵入地接入开源编码智能体 Pi，在真实工具调用循环中实施防护；二是提出增量安全链，在事件发生时抽取用户授权、来源污点、外部指令与数据流等安全分量并附原文证据引用，裁决只读取有界的状态视图，不再重读完整轨迹；三是构建规则、快镜与慢镜分层协同的防护内核：规则层执行机密指纹、敏感目标与硬策略等确定性检查；快镜 D²Guard-Laya 由本作品以自建的 20,662 条领域样本（真实文本占 42.1%）微调多语言 Laya 得到，在内容进入时识别其中的具体任务请求并写入安全链；决策表据此在执行前作出放行、挂起或阻断的裁决；慢镜在挂起或阻断后调用大模型，依据证据引用回溯原文，还原跨主智能体、子智能体与 MCP 工具的攻击路径并生成可核验的研判报告，不改变已作出的裁决。安全控制台以可视化方式展示上述过程并支持网页审批，可部署于 Windows 与 Linux。在覆盖 15 类攻击手法的 83 个场景、996 次真实运行中，有效攻击运行的攻击成功率由无防护时的 67.1%（</w:t>
+          <w:sz w:val="24"/>
+        </w:rPr>
+        <w:t xml:space="preserve">随着大模型智能体获得文件读写、命令执行和工具调用能力，提示注入的危害已由文本误导扩展至凭据外泄与越权操作。针对长流程任务中早期注入易被稀释、逐步重读完整轨迹开销大以及语义伪装注入难以被规则识别等问题，本作品设计并实现了大模型智能体运行时防御系统——双镜 D²Guard，覆盖检测、研判、阻断与溯源全过程。作品具有三方面特色：一是面向原生智能体，以执行前钩子插件、API 侧网关与 MCP 中间代理非侵入地接入开源编码智能体 Pi，在真实工具调用循环中实施防护；二是提出增量安全链，在事件发生时抽取用户授权、来源污点、外部指令与数据流等安全分量并附原文证据引用，裁决只读取有界的状态视图，不再重读完整轨迹；三是构建规则、快镜与慢镜分层协同的防护内核：规则层执行机密指纹、敏感目标与硬策略等确定性检查；快镜 D²Guard-Laya 由本作品以自建的 20,662 条领域样本（真实文本占 42.1%）微调多语言 Laya 得到，在内容进入时识别其中的具体任务请求并写入安全链；决策表据此在执行前作出放行、挂起或阻断的裁决；慢镜在挂起或阻断后调用大模型，依据证据引用回溯原文，还原跨主智能体、子智能体与 MCP 工具的攻击路径并生成可核验的研判报告，不改变已作出的裁决。安全控制台以可视化方式展示上述过程并支持网页审批，可部署于 Windows 与 Linux。</w:t>
       </w:r>
       <w:r>
         <w:rPr>
@@ -2043,37 +2041,14 @@
           <w:b/>
           <w:sz w:val="24"/>
         </w:rPr>
-        <w:t>110／164</w:t>
-      </w:r>
-      <w:r>
-        <w:rPr>
-          <w:rFonts w:ascii="Times New Roman" w:hAnsi="Times New Roman" w:eastAsia="宋体" w:cs="Times New Roman"/>
-          <w:b w:val="0"/>
-          <w:sz w:val="24"/>
-        </w:rPr>
-        <w:t>）降至 0（</w:t>
-      </w:r>
-      <w:r>
-        <w:rPr>
-          <w:rFonts w:ascii="Times New Roman" w:hAnsi="Times New Roman" w:eastAsia="宋体" w:cs="Times New Roman"/>
-          <w:b/>
-          <w:sz w:val="24"/>
-        </w:rPr>
-        <w:t>0／165</w:t>
-      </w:r>
-      <w:r>
-        <w:rPr>
-          <w:rFonts w:ascii="Times New Roman" w:hAnsi="Times New Roman" w:eastAsia="宋体" w:cs="Times New Roman"/>
-          <w:b w:val="0"/>
-          <w:sz w:val="24"/>
-        </w:rPr>
-        <w:t>）；正常任务无一被阻断，其中 92.4% 无需人工干预即自动完成，其余 7.6% 等待一次人工确认，929 个可确认良性动作均未因自身裁决被误挂起，另有 2 次会话连带暂停；单动作裁决耗时中位数为 8 ms，干净环境下任务耗时与无防护时基本一致。在四类 CVE 复现与跨来源拆分注入评测中，攻击成功合计由 9／15 降为 0／15；用户输入直接注入评测中，外发成功由 18／18 降至 0／18，相近正常输入均未被挂起。</w:t>
-      </w:r>
-      <w:r>
-        <w:rPr>
-          <w:b/>
-        </w:rPr>
-        <w:t xml:space="preserve"> 跨用户轮次拆分评测为 3／3→0／3，干净受保护完成 2／3，另 1 次未授权外发等待确认。</w:t>
+        <w:t xml:space="preserve">在覆盖 15 类攻击手法的 83 个场景、996 次真实运行中，有效攻击运行的攻击成功率由无防护时的 67.1%（110／164）降至 0（0／165）</w:t>
+      </w:r>
+      <w:r>
+        <w:rPr>
+          <w:rFonts w:ascii="Times New Roman" w:hAnsi="Times New Roman" w:eastAsia="宋体" w:cs="Times New Roman"/>
+          <w:sz w:val="24"/>
+        </w:rPr>
+        <w:t xml:space="preserve">；正常任务无一被阻断，其中 92.4% 无需人工干预即自动完成，其余等待一次人工确认，929 个可确认良性动作均未因自身裁决被误挂起；单动作裁决耗时中位数为 8 ms，任务耗时与无防护时基本一致。在补充评测中，四类 CVE 复现与跨来源拆分注入的攻击成功由 9／15 降至 0／15，同一会话跨用户轮次拆分注入由 3／3 降至 0／3，用户输入直接注入由 18／18 降至 0／18。</w:t>
       </w:r>
     </w:p>
     <w:p>
@@ -5406,10 +5381,9 @@
       <w:r>
         <w:rPr>
           <w:rFonts w:ascii="Times New Roman" w:hAnsi="Times New Roman" w:eastAsia="宋体" w:cs="Times New Roman"/>
-          <w:b w:val="0"/>
-          <w:sz w:val="24"/>
-        </w:rPr>
-        <w:t>系统由宿主侧的三个接入组件和一个本地防护内核组成，如图 2-1 所示。图中灰色部分为宿主智能体及其外部环境，蓝色部分为本作品新增的组件。三个接入组件分别位于工具执行之前、模型请求链路和 MCP 工具链路上，负责采集事件并执行裁决；防护内核维护证据库、增量安全链、规则层、快镜、决策表、慢镜与溯源图。</w:t>
+          <w:sz w:val="24"/>
+        </w:rPr>
+        <w:t xml:space="preserve">系统由宿主侧的三个接入组件和一个本地防护内核组成，如图 2-1 所示。图中灰色部分为宿主智能体及其外部环境，蓝色部分为本作品新增的组件。在赛题给出的系统形态中，本作品组合采用了宿主 Agent Hook 插件（执行前钩子插件）、Sidecar 网关（API 侧网关）与 MCP 中间代理三种形态。三个接入组件分别位于工具执行之前、模型请求链路和 MCP 工具链路上，负责采集事件并执行裁决；防护内核维护证据库、增量安全链、规则层、快镜、决策表、慢镜与溯源图。</w:t>
       </w:r>
       <w:r>
         <w:rPr>
@@ -5417,7 +5391,7 @@
           <w:b/>
           <w:sz w:val="24"/>
         </w:rPr>
-        <w:t>全部安全判断在内核中基于同一份安全状态完成，以避免多处判断结果不一致。</w:t>
+        <w:t xml:space="preserve">全部安全判断在内核中基于同一份安全状态完成，以避免多处判断结果不一致。</w:t>
       </w:r>
     </w:p>
     <w:p>
@@ -9145,7 +9119,7 @@
           <w:b w:val="0"/>
           <w:sz w:val="24"/>
         </w:rPr>
-        <w:t>按照赛题对检测、研判、阻断与溯源的要求，内核的处理流程划分为四个环节（图 5-1）。检测环节由规则层与快镜完成，识别外部内容中的任务请求、机密与敏感目标，并将结果写入安全链；研判环节由决策表完成，将候选动作与授权锚点、污染来源和策略谓词进行比对，给出风险等级、命中规则与证据引用；阻断环节由三个接入组件在副作用发生前执行裁决，挂起的动作交由用户审批；溯源环节由溯源图与慢镜完成，在挂起或阻断后还原攻击路径并生成研判报告。前三个环节在本地同步完成，83 场景矩阵评测中本地路径比例为 100%（1942／1942）；溯源环节异步执行，其结论不改变已作出的裁决。</w:t>
+        <w:t>按照赛题对检测、研判、阻断与溯源的要求，内核的处理流程划分为四个环节（图 5-1）。检测环节由规则层与快镜完成，识别外部内容中的任务请求、机密与敏感目标，并将结果写入安全链；研判环节由决策表完成，将候选动作与授权锚点、污染来源和策略谓词进行比对，给出风险等级、命中规则与证据引用；阻断环节由三个接入组件在副作用发生前执行裁决，挂起的动作交由用户审批；溯源环节由溯源图与慢镜完成，在挂起或阻断后还原攻击路径并生成研判报告。前三个环节在本地同步完成，83 场景评测中本地路径比例为 100%（1942／1942）；溯源环节异步执行，其结论不改变已作出的裁决。</w:t>
       </w:r>
     </w:p>
     <w:p>
@@ -12757,6 +12731,21 @@
     </w:p>
     <w:p>
       <w:pPr>
+        <w:snapToGrid w:val="0"/>
+        <w:spacing w:before="0" w:after="0" w:line="360" w:lineRule="auto"/>
+        <w:ind w:firstLine="480"/>
+        <w:jc w:val="both"/>
+      </w:pPr>
+      <w:r>
+        <w:rPr>
+          <w:rFonts w:ascii="Times New Roman" w:hAnsi="Times New Roman" w:eastAsia="宋体" w:cs="Times New Roman"/>
+          <w:sz w:val="24"/>
+        </w:rPr>
+        <w:t xml:space="preserve">向量数据库与业务知识库通常以工具形式接入：经 MCP 工具接入时，其检索结果按 MCP_RET 来源摄入并由快镜标注；经记忆工具接入时按 MEMORY 来源处理，继承写入时的完整性标签。</w:t>
+      </w:r>
+    </w:p>
+    <w:p>
+      <w:pPr>
         <w:keepNext/>
         <w:snapToGrid w:val="0"/>
         <w:spacing w:before="60" w:after="60" w:line="360" w:lineRule="auto"/>
@@ -14865,7 +14854,7 @@
           <w:b w:val="0"/>
           <w:sz w:val="24"/>
         </w:rPr>
-        <w:t>安全控制台为 Web 应用，全部视图由每轮运行的证据库确定性生成，页面上的数字均读自83 场景矩阵评测汇总文件与运行证据。控制台按功能分为态势、管理、执行与分析四组页面（表 8-1），界面示例见图 1-1 至图 1-3 与图 5-3。</w:t>
+        <w:t>安全控制台为 Web 应用，全部视图由每轮运行的证据库确定性生成，页面上的数字均读自 83 场景评测的汇总文件与运行证据。控制台按功能分为态势、管理、执行与分析四组页面（表 8-1），界面示例见图 1-1 至图 1-3 与图 5-3。</w:t>
       </w:r>
     </w:p>
     <w:p>
@@ -15073,7 +15062,7 @@
                 <w:b w:val="0"/>
                 <w:sz w:val="24"/>
               </w:rPr>
-              <w:t>83 场景矩阵评测总体结果、各攻击族攻防对比、消融结果、安全链压缩曲线、运行时防御链路回放</w:t>
+              <w:t>83 场景评测总体结果、各攻击族攻防对比、消融结果、安全链压缩曲线、运行时防御链路回放</w:t>
             </w:r>
           </w:p>
         </w:tc>
@@ -16716,7 +16705,7 @@
           <w:rFonts w:ascii="Times New Roman" w:hAnsi="Times New Roman" w:eastAsia="宋体" w:cs="Times New Roman"/>
           <w:sz w:val="24"/>
         </w:rPr>
-        <w:t xml:space="preserve">实验表明，83 场景矩阵评测中单动作裁决耗时的中位数为 8 ms；真实运行中上下文与安全状态之比的中位数为 3.06，最大为 19.2；</w:t>
+        <w:t xml:space="preserve">实验表明，83 场景评测中单动作裁决耗时的中位数为 8 ms；真实运行中上下文与安全状态之比的中位数为 3.06，最大为 19.2；</w:t>
       </w:r>
       <w:r>
         <w:rPr>
@@ -16968,7 +16957,7 @@
           <w:b w:val="0"/>
           <w:sz w:val="24"/>
         </w:rPr>
-        <w:t>83 场景矩阵评测的 996 次运行均在未经改造的 Pi 智能体上执行，经独立脚本逐项核验，未出现非模型原因导致的核验失败。由于内核通过事件与裁决接口与宿主解耦，该接入方式原则上适用于其他提供工具执行前钩子的智能体框架。</w:t>
+        <w:t>83 场景评测的 996 次运行均在未经改造的 Pi 智能体上执行，经独立脚本逐项核验，未出现非模型原因导致的核验失败。由于内核通过事件与裁决接口与宿主解耦，该接入方式原则上适用于其他提供工具执行前钩子的智能体框架。</w:t>
       </w:r>
     </w:p>
     <w:p>
@@ -17096,7 +17085,7 @@
                 <w:b/>
                 <w:sz w:val="24"/>
               </w:rPr>
-              <w:t>Jev 风险门控[22]</w:t>
+              <w:t>Jev 风险门控[18, 25]</w:t>
             </w:r>
           </w:p>
         </w:tc>
@@ -17124,9 +17113,9 @@
                 <w:b/>
                 <w:sz w:val="24"/>
               </w:rPr>
-              <w:t>Task Shield</w:t>
+              <w:t>Task Shield[16]</w:t>
               <w:br/>
-              <w:t>[13]</w:t>
+              <w:t/>
             </w:r>
           </w:p>
         </w:tc>
@@ -17154,7 +17143,7 @@
                 <w:b/>
                 <w:sz w:val="24"/>
               </w:rPr>
-              <w:t>信息流防御[11–12]</w:t>
+              <w:t>信息流防御[14–15]</w:t>
             </w:r>
           </w:p>
         </w:tc>
@@ -17968,10 +17957,9 @@
       <w:r>
         <w:rPr>
           <w:rFonts w:ascii="Times New Roman" w:hAnsi="Times New Roman" w:eastAsia="宋体" w:cs="Times New Roman"/>
-          <w:b w:val="0"/>
-          <w:sz w:val="24"/>
-        </w:rPr>
-        <w:t>在覆盖 15 类攻击手法的 83 个场景、996 次真实运行中，在模型有效且可判分的攻击运行中，攻击成功率由无防护时的 67.1%（</w:t>
+          <w:sz w:val="24"/>
+        </w:rPr>
+        <w:t xml:space="preserve">在覆盖 15 类攻击手法的 83 个场景、996 次真实运行中，在模型有效且可判分的攻击运行中，攻击成功率由无防护时的 67.1%（</w:t>
       </w:r>
       <w:r>
         <w:rPr>
@@ -17979,15 +17967,14 @@
           <w:b/>
           <w:sz w:val="24"/>
         </w:rPr>
-        <w:t>110／164</w:t>
-      </w:r>
-      <w:r>
-        <w:rPr>
-          <w:rFonts w:ascii="Times New Roman" w:hAnsi="Times New Roman" w:eastAsia="宋体" w:cs="Times New Roman"/>
-          <w:b w:val="0"/>
-          <w:sz w:val="24"/>
-        </w:rPr>
-        <w:t>）降至 0（</w:t>
+        <w:t xml:space="preserve">110／164</w:t>
+      </w:r>
+      <w:r>
+        <w:rPr>
+          <w:rFonts w:ascii="Times New Roman" w:hAnsi="Times New Roman" w:eastAsia="宋体" w:cs="Times New Roman"/>
+          <w:sz w:val="24"/>
+        </w:rPr>
+        <w:t xml:space="preserve">）降至 0（</w:t>
       </w:r>
       <w:r>
         <w:rPr>
@@ -17995,15 +17982,14 @@
           <w:b/>
           <w:sz w:val="24"/>
         </w:rPr>
-        <w:t>0／165</w:t>
-      </w:r>
-      <w:r>
-        <w:rPr>
-          <w:rFonts w:ascii="Times New Roman" w:hAnsi="Times New Roman" w:eastAsia="宋体" w:cs="Times New Roman"/>
-          <w:b w:val="0"/>
-          <w:sz w:val="24"/>
-        </w:rPr>
-        <w:t xml:space="preserve">）；正常任务被阻断为 0，自动完成率为 92.4%，其余运行等待一次人工确认，可确认良性动作因自身裁决被误挂起为 0／929；单动作裁决耗时中位数为 8 ms，干净环境下任务耗时与无防护时基本一致，本地路径比例为 100%。四类 CVE 与跨来源拆分评测的攻击成功合计为 9／15→0／15，其中 MCP 配置篡改在无防护时未触发，不据此评价防护效果。跨用户轮次拆分注入评测共 12 次，攻击成功由 3／3 降为 0／3，干净环境开启防护后正常完成 </w:t>
+        <w:t xml:space="preserve">0／165</w:t>
+      </w:r>
+      <w:r>
+        <w:rPr>
+          <w:rFonts w:ascii="Times New Roman" w:hAnsi="Times New Roman" w:eastAsia="宋体" w:cs="Times New Roman"/>
+          <w:sz w:val="24"/>
+        </w:rPr>
+        <w:t xml:space="preserve">）；正常任务被阻断为 0，自动完成率为 92.4%，其余运行等待一次人工确认，可确认良性动作因自身裁决被误挂起为 0／929；单动作裁决耗时中位数为 8 ms，干净环境下任务耗时与无防护时基本一致，本地路径比例为 100%。四类 CVE 复现与跨来源拆分注入评测的攻击成功合计由 9／15 降为 0／15，其中 MCP 配置篡改在无防护时未触发，不据此评价防护效果。跨用户轮次拆分注入评测共 12 次，攻击成功由 3／3 降为 0／3，干净环境开启防护后正常完成 </w:t>
       </w:r>
       <w:r>
         <w:rPr>
@@ -18011,15 +17997,14 @@
           <w:b/>
           <w:sz w:val="24"/>
         </w:rPr>
-        <w:t>2／3</w:t>
-      </w:r>
-      <w:r>
-        <w:rPr>
-          <w:rFonts w:ascii="Times New Roman" w:hAnsi="Times New Roman" w:eastAsia="宋体" w:cs="Times New Roman"/>
-          <w:b w:val="0"/>
-          <w:sz w:val="24"/>
-        </w:rPr>
-        <w:t>，另 1 次因未授权外发等待确认。测试方法与详细结果见《测试样例及测试流程说明文档》。消融实验验证了快镜在兼顾安全性与可用性方面的作用，决策充分性实验与长程压力测试表明，裁决所需的安全状态保持精简，早期污点不会丢失。</w:t>
+        <w:t xml:space="preserve">2／3</w:t>
+      </w:r>
+      <w:r>
+        <w:rPr>
+          <w:rFonts w:ascii="Times New Roman" w:hAnsi="Times New Roman" w:eastAsia="宋体" w:cs="Times New Roman"/>
+          <w:sz w:val="24"/>
+        </w:rPr>
+        <w:t xml:space="preserve">，另 1 次因未授权外发等待确认。测试方法与详细结果见《测试样例及测试流程说明文档》。消融实验验证了快镜在兼顾安全性与可用性方面的作用，决策充分性实验与长程压力测试表明，裁决所需的安全状态保持精简，早期污点不会丢失。</w:t>
       </w:r>
     </w:p>
     <w:p>

</xml_diff>

<commit_message>
Update showcase pages, trace presentation, and final documents
</commit_message>
<xml_diff>
--- a/submission/周兴富-双镜D²Guard-整体设计文档.docx
+++ b/submission/周兴富-双镜D²Guard-整体设计文档.docx
@@ -91,7 +91,7 @@
       <w:r>
         <w:drawing>
           <wp:inline distT="0" distB="0" distL="114300" distR="114300">
-            <wp:extent cx="878992" cy="1079500"/>
+            <wp:extent cx="878840" cy="1079500"/>
             <wp:effectExtent l="0" t="0" r="11430" b="2540"/>
             <wp:docPr id="10" name="Picture 10"/>
             <wp:cNvGraphicFramePr>
@@ -1135,7 +1135,20 @@
         <w:rPr>
           <w:rFonts w:ascii="Arial" w:hAnsi="Arial" w:eastAsia="黑体" w:cs="Arial"/>
         </w:rPr>
-        <w:t>3.1 执行前钩子插件</w:t>
+        <w:t>3.1 执行前</w:t>
+      </w:r>
+      <w:r>
+        <w:rPr>
+          <w:rFonts w:hint="eastAsia" w:ascii="Arial" w:hAnsi="Arial" w:eastAsia="黑体" w:cs="Arial"/>
+          <w:lang w:eastAsia="zh-CN"/>
+        </w:rPr>
+        <w:t>Hook</w:t>
+      </w:r>
+      <w:r>
+        <w:rPr>
+          <w:rFonts w:ascii="Arial" w:hAnsi="Arial" w:eastAsia="黑体" w:cs="Arial"/>
+        </w:rPr>
+        <w:t>插件</w:t>
       </w:r>
       <w:r>
         <w:tab/>
@@ -2520,7 +2533,7 @@
         <w:fldChar w:fldCharType="separate"/>
       </w:r>
       <w:r>
-        <w:t>39</w:t>
+        <w:t>40</w:t>
       </w:r>
       <w:r>
         <w:fldChar w:fldCharType="end"/>
@@ -2564,7 +2577,7 @@
         <w:fldChar w:fldCharType="separate"/>
       </w:r>
       <w:r>
-        <w:t>39</w:t>
+        <w:t>40</w:t>
       </w:r>
       <w:r>
         <w:fldChar w:fldCharType="end"/>
@@ -2608,7 +2621,7 @@
         <w:fldChar w:fldCharType="separate"/>
       </w:r>
       <w:r>
-        <w:t>39</w:t>
+        <w:t>40</w:t>
       </w:r>
       <w:r>
         <w:fldChar w:fldCharType="end"/>
@@ -2652,7 +2665,7 @@
         <w:fldChar w:fldCharType="separate"/>
       </w:r>
       <w:r>
-        <w:t>40</w:t>
+        <w:t>41</w:t>
       </w:r>
       <w:r>
         <w:fldChar w:fldCharType="end"/>
@@ -2696,7 +2709,7 @@
         <w:fldChar w:fldCharType="separate"/>
       </w:r>
       <w:r>
-        <w:t>40</w:t>
+        <w:t>41</w:t>
       </w:r>
       <w:r>
         <w:fldChar w:fldCharType="end"/>
@@ -2740,7 +2753,7 @@
         <w:fldChar w:fldCharType="separate"/>
       </w:r>
       <w:r>
-        <w:t>40</w:t>
+        <w:t>41</w:t>
       </w:r>
       <w:r>
         <w:fldChar w:fldCharType="end"/>
@@ -2785,7 +2798,7 @@
         <w:fldChar w:fldCharType="separate"/>
       </w:r>
       <w:r>
-        <w:t>42</w:t>
+        <w:t>43</w:t>
       </w:r>
       <w:r>
         <w:fldChar w:fldCharType="end"/>
@@ -2878,8 +2891,6 @@
           <w:docGrid w:type="lines" w:linePitch="312" w:charSpace="0"/>
         </w:sectPr>
       </w:pPr>
-      <w:bookmarkStart w:id="50" w:name="_GoBack"/>
-      <w:bookmarkEnd w:id="50"/>
     </w:p>
     <w:p>
       <w:pPr>
@@ -2906,28 +2917,74 @@
         <w:spacing w:before="0" w:after="0" w:line="360" w:lineRule="auto"/>
         <w:ind w:firstLine="480"/>
         <w:jc w:val="both"/>
-      </w:pPr>
-      <w:r>
-        <w:rPr>
-          <w:rFonts w:ascii="Times New Roman" w:hAnsi="Times New Roman" w:eastAsia="宋体" w:cs="Times New Roman"/>
-          <w:sz w:val="24"/>
-        </w:rPr>
-        <w:t xml:space="preserve">随着大模型智能体获得文件读写、命令执行和工具调用能力，提示注入的危害已由文本误导扩展至凭据外泄与越权操作。针对长流程任务中早期注入易被稀释、逐步重读完整轨迹开销大以及语义伪装注入难以被规则识别等问题，本作品设计并实现了大模型智能体运行时防御系统——双镜 D²Guard，覆盖检测、研判、阻断与溯源全过程。作品具有三方面特色：一是面向原生智能体，以执行前钩子插件、API 侧网关与 MCP 中间代理非侵入地接入开源编码智能体 Pi，在真实工具调用循环中实施防护；二是提出增量安全链，在事件发生时抽取用户授权、来源污点、外部指令与数据流等安全分量并附原文证据引用，裁决只读取有界的状态视图，不再重读完整轨迹；三是构建规则、快镜与慢镜分层协同的防护内核：规则层执行机密指纹、敏感目标与硬策略等确定性检查；快镜 D²Guard-Laya 由本作品以自建的 20,662 条领域样本（真实文本占 42.1%）微调多语言 Laya 得到，在内容进入时识别其中的具体任务请求并写入安全链；决策表据此在执行前作出放行、挂起或阻断的裁决；慢镜在挂起或阻断后调用大模型，依据证据引用回溯原文，还原跨主智能体、子智能体与 MCP 工具的攻击路径并生成可核验的研判报告，不改变已作出的裁决。安全控制台以可视化方式展示上述过程并支持网页审批，可部署于 Windows 与 Linux。</w:t>
-      </w:r>
+        <w:rPr>
+          <w:rFonts w:ascii="Times New Roman" w:hAnsi="Times New Roman" w:eastAsia="宋体" w:cs="Times New Roman"/>
+          <w:sz w:val="24"/>
+        </w:rPr>
+      </w:pPr>
+      <w:r>
+        <w:rPr>
+          <w:rFonts w:ascii="Times New Roman" w:hAnsi="Times New Roman" w:eastAsia="宋体" w:cs="Times New Roman"/>
+          <w:sz w:val="24"/>
+        </w:rPr>
+        <w:t>随着大模型智能体获得文件读写、命令执行和工具调用能力，提示注入的危害已由文本误导扩展至凭据外泄与越权操作。针对长流程任务中早期注入易被稀释、逐步重读完整轨迹开销大以及语义伪装注入难以被规则识别等问题，本作品设计并实现了大模型智能体运行时防御系统——双镜 D²Guard，覆盖检测、研判、阻断与溯源全过程。</w:t>
+      </w:r>
+    </w:p>
+    <w:p>
+      <w:pPr>
+        <w:snapToGrid w:val="0"/>
+        <w:spacing w:before="0" w:after="0" w:line="360" w:lineRule="auto"/>
+        <w:ind w:firstLine="480"/>
+        <w:jc w:val="both"/>
+        <w:rPr>
+          <w:rFonts w:ascii="Times New Roman" w:hAnsi="Times New Roman" w:eastAsia="宋体" w:cs="Times New Roman"/>
+          <w:sz w:val="24"/>
+        </w:rPr>
+      </w:pPr>
+      <w:r>
+        <w:rPr>
+          <w:rFonts w:ascii="Times New Roman" w:hAnsi="Times New Roman" w:eastAsia="宋体" w:cs="Times New Roman"/>
+          <w:sz w:val="24"/>
+        </w:rPr>
+        <w:t>作品具有三方面特色：一是面向原生智能体，以执行前</w:t>
+      </w:r>
+      <w:r>
+        <w:rPr>
+          <w:rFonts w:hint="eastAsia" w:cs="Times New Roman"/>
+          <w:sz w:val="24"/>
+          <w:lang w:eastAsia="zh-CN"/>
+        </w:rPr>
+        <w:t>Hook</w:t>
+      </w:r>
+      <w:r>
+        <w:rPr>
+          <w:rFonts w:ascii="Times New Roman" w:hAnsi="Times New Roman" w:eastAsia="宋体" w:cs="Times New Roman"/>
+          <w:sz w:val="24"/>
+        </w:rPr>
+        <w:t>插件、API 侧网关与 MCP 中间代理非侵入地接入开源编码智能体 Pi，在真实工具调用循环中实施防护；二是提出增量安全链，在事件发生时抽取用户授权、来源污点、外部指令与数据流等安全分量并附原文证据引用，裁决只读取有界的状态视图，不再重读完整轨迹；三是构建规则、快镜与慢镜分层协同的防护内核：规则层执行机密指纹、敏感目标与硬策略等确定性检查；快镜 D²Guard-Laya 由本作品以自建的 20,662 条领域样本（真实文本占 42.1%）微调多语言 Laya 得到，在内容进入时识别其中的具体任务请求并写入安全链；决策表据此在执行前作出放行、挂起或阻断的裁决；慢镜在挂起或阻断后调用大模型，依据证据引用回溯原文，还原跨主智能体、子智能体与 MCP 工具的攻击路径并生成可核验的研判报告，不改变已作出的裁决。安全控制台以可视化方式展示上述过程并支持网页审批，可部署于 Windows 与 Linux。</w:t>
+      </w:r>
+    </w:p>
+    <w:p>
+      <w:pPr>
+        <w:snapToGrid w:val="0"/>
+        <w:spacing w:before="0" w:after="0" w:line="360" w:lineRule="auto"/>
+        <w:ind w:firstLine="480"/>
+        <w:jc w:val="both"/>
+      </w:pPr>
       <w:r>
         <w:rPr>
           <w:rFonts w:ascii="Times New Roman" w:hAnsi="Times New Roman" w:eastAsia="宋体" w:cs="Times New Roman"/>
           <w:b/>
           <w:sz w:val="24"/>
         </w:rPr>
-        <w:t xml:space="preserve">在覆盖 15 类攻击手法的 101 个场景、1204 次真实运行中，有效攻击运行的攻击成功率由无防护时的 70.3%（154／219）降至 0（0／219）</w:t>
-      </w:r>
-      <w:r>
-        <w:rPr>
-          <w:rFonts w:ascii="Times New Roman" w:hAnsi="Times New Roman" w:eastAsia="宋体" w:cs="Times New Roman"/>
-          <w:sz w:val="24"/>
-        </w:rPr>
-        <w:t xml:space="preserve">；正常任务无一被阻断，其中 93.3% 无需人工干预即自动完成，其余等待一次人工确认，929 个可确认良性动作均未因自身裁决被误挂起；单动作裁决耗时中位数为 8 ms，任务耗时与无防护时基本一致。</w:t>
+        <w:t>在覆盖 15 类攻击手法的 101 个场景、1204 次真实运行中，有效攻击运行的攻击成功率由无防护时的 70.3%（154／219）降至 0（0／219）</w:t>
+      </w:r>
+      <w:r>
+        <w:rPr>
+          <w:rFonts w:ascii="Times New Roman" w:hAnsi="Times New Roman" w:eastAsia="宋体" w:cs="Times New Roman"/>
+          <w:sz w:val="24"/>
+        </w:rPr>
+        <w:t>；正常任务无一被阻断，其中 93.3% 无需人工干预即自动完成，其余等待一次人工确认，929 个可确认良性动作均未因自身裁决被误挂起；单动作裁决耗时中位数为 8 ms，任务耗时与无防护时基本一致。</w:t>
       </w:r>
       <w:r>
         <w:rPr>
@@ -2935,7 +2992,7 @@
           <w:b/>
           <w:sz w:val="24"/>
         </w:rPr>
-        <w:t xml:space="preserve">在 CVE-2025-53773、CVE-2025-54135、CVE-2025-55284 与 CVE-2025-32711 四个公开漏洞的复现场景中，攻击成功由无防护时的 8／12 降至 0／12。</w:t>
+        <w:t>在 CVE-2025-53773、CVE-2025-54135、CVE-2025-55284 与 CVE-2025-32711 四个公开漏洞的复现场景中，攻击成功由无防护时的 8／12 降至 0／12。</w:t>
       </w:r>
     </w:p>
     <w:p>
@@ -3458,7 +3515,7 @@
       <w:r>
         <w:drawing>
           <wp:inline distT="0" distB="0" distL="114300" distR="114300">
-            <wp:extent cx="4751705" cy="3417388"/>
+            <wp:extent cx="4751705" cy="3416935"/>
             <wp:effectExtent l="0" t="0" r="3175" b="6350"/>
             <wp:docPr id="1" name="Picture 1"/>
             <wp:cNvGraphicFramePr>
@@ -3590,7 +3647,7 @@
       <w:r>
         <w:drawing>
           <wp:inline distT="0" distB="0" distL="114300" distR="114300">
-            <wp:extent cx="4751705" cy="2969816"/>
+            <wp:extent cx="4751705" cy="4127500"/>
             <wp:effectExtent l="0" t="0" r="3175" b="1905"/>
             <wp:docPr id="2" name="Picture 2"/>
             <wp:cNvGraphicFramePr>
@@ -3614,7 +3671,7 @@
                   <pic:spPr>
                     <a:xfrm>
                       <a:off x="0" y="0"/>
-                      <a:ext cx="4752000" cy="2970000"/>
+                      <a:ext cx="4752000" cy="4128300"/>
                     </a:xfrm>
                     <a:prstGeom prst="rect">
                       <a:avLst/>
@@ -3680,7 +3737,7 @@
           <w:b w:val="0"/>
           <w:sz w:val="24"/>
         </w:rPr>
-        <w:t>，包括模型请求快照、工具调用参数与返回、裁决依据及接收端回执，并据此构建由用户消息、外部来源、智能体、工具调用、裁决与受影响资产组成的溯源图。安全控制台提供态势展示、防护关闭与开启的对照运行、单任务防护运行与溯源分析等功能，可展示一次攻击从外部来源进入、经主智能体与子智能体传播、直至在执行前被拦截的完整过程，并支持在网页中对挂起动作进行批准或拒绝。图 1-3 为三层子智能体场景的攻击路径溯源图。</w:t>
+        <w:t>，包括模型请求快照、工具调用参数与返回、裁决依据及接收端回执，并据此构建由用户消息、外部来源、智能体、工具调用、裁决与受影响资产组成的溯源图。安全控制台分为展示、实操与设置三部分，提供作品与核心技术展示、防护关闭与开启的对照运行与溯源分析等功能，可展示一次攻击从外部来源进入、经主智能体与子智能体传播、直至在执行前被拦截的完整过程，并支持在网页中对挂起动作进行批准或拒绝。图 1-3 为三层子智能体场景的攻击路径溯源图。</w:t>
       </w:r>
     </w:p>
     <w:p>
@@ -3693,7 +3750,7 @@
       <w:r>
         <w:drawing>
           <wp:inline distT="0" distB="0" distL="114300" distR="114300">
-            <wp:extent cx="4751705" cy="3483610"/>
+            <wp:extent cx="4751705" cy="4171315"/>
             <wp:effectExtent l="0" t="0" r="3175" b="6350"/>
             <wp:docPr id="3" name="Picture 3"/>
             <wp:cNvGraphicFramePr>
@@ -3717,7 +3774,7 @@
                   <pic:spPr>
                     <a:xfrm>
                       <a:off x="0" y="0"/>
-                      <a:ext cx="4752000" cy="3483871"/>
+                      <a:ext cx="4752000" cy="4171603"/>
                     </a:xfrm>
                     <a:prstGeom prst="rect">
                       <a:avLst/>
@@ -3944,7 +4001,24 @@
           <w:b w:val="0"/>
           <w:sz w:val="24"/>
         </w:rPr>
-        <w:t>在部署形态上，同步裁决在本地完成，快镜支持纯 CPU 推理，慢镜可接入本地部署的大模型，能够满足数据不出域的私有化部署要求。由于防护内核通过事件与裁决接口与宿主解耦，提供工具执行前钩子的其他智能体框架原则上也可按相同方式接入。</w:t>
+        <w:t>在部署形态上，同步裁决在本地完成，快镜支持纯 CPU 推理，慢镜可接入本地部署的大模型，能够满足数据不出域的私有化部署要求。由于防护内核通过事件与裁决接口与宿主解耦，提供工具执行前</w:t>
+      </w:r>
+      <w:r>
+        <w:rPr>
+          <w:rFonts w:hint="eastAsia" w:cs="Times New Roman"/>
+          <w:b w:val="0"/>
+          <w:sz w:val="24"/>
+          <w:lang w:eastAsia="zh-CN"/>
+        </w:rPr>
+        <w:t>Hook</w:t>
+      </w:r>
+      <w:r>
+        <w:rPr>
+          <w:rFonts w:ascii="Times New Roman" w:hAnsi="Times New Roman" w:eastAsia="宋体" w:cs="Times New Roman"/>
+          <w:b w:val="0"/>
+          <w:sz w:val="24"/>
+        </w:rPr>
+        <w:t>的其他智能体框架原则上也可按相同方式接入。</w:t>
       </w:r>
     </w:p>
     <w:p>
@@ -3979,8 +4053,21 @@
           <w:b w:val="0"/>
           <w:sz w:val="24"/>
         </w:rPr>
-        <w:t>本文为整体设计文档，第二章给出威胁模型、设计目标与总体架构，第三章至第八章依次说明宿主接入组件、增量安全链、快慢协同防护内核、意图对齐与多源注入识别、快镜训练、安全控制台与工程实现，第九章说明创新点，第十章进行总结。部署方法与测试结果分别见《部署说明文档》与《测试样例及测试流程说明文档》。表 1-1 列出赛题交付件与能力要求在各文档和程序包中的对应位置。</w:t>
-      </w:r>
+        <w:t>本文为整体设计文档，第二章给出威胁模型、设计目标与总体架构，第三章至第八章依次说明宿主接入组件、增量安全链、快慢协同防护内核、意图对齐与多源注入识别、快镜训练、安全控制台与工程实现，第九章说明创新点，第十章进行总结。部署方法与测试结果分别见《部署说明文档》与《测试样例及测试流程说明文档》。表 1-1 说明本作品针对赛题五项能力要求所采用的实现方法及其实测效果，效果数据均来自《测试样例及测试流程说明文档》中的真实运行。</w:t>
+      </w:r>
+    </w:p>
+    <w:p>
+      <w:pPr>
+        <w:keepNext/>
+        <w:snapToGrid w:val="0"/>
+        <w:spacing w:before="60" w:after="60" w:line="360" w:lineRule="auto"/>
+        <w:jc w:val="both"/>
+        <w:rPr>
+          <w:rFonts w:ascii="Times New Roman" w:hAnsi="Times New Roman" w:eastAsia="宋体" w:cs="Times New Roman"/>
+          <w:b/>
+          <w:sz w:val="24"/>
+        </w:rPr>
+      </w:pPr>
     </w:p>
     <w:p>
       <w:pPr>
@@ -3988,14 +4075,57 @@
         <w:snapToGrid w:val="0"/>
         <w:spacing w:before="60" w:after="60" w:line="360" w:lineRule="auto"/>
         <w:jc w:val="center"/>
-      </w:pPr>
-      <w:r>
         <w:rPr>
           <w:rFonts w:ascii="Times New Roman" w:hAnsi="Times New Roman" w:eastAsia="宋体" w:cs="Times New Roman"/>
           <w:b/>
           <w:sz w:val="24"/>
         </w:rPr>
-        <w:t>表 1-1  赛题要求与文档、程序对照</w:t>
+      </w:pPr>
+    </w:p>
+    <w:p>
+      <w:pPr>
+        <w:keepNext/>
+        <w:snapToGrid w:val="0"/>
+        <w:spacing w:before="60" w:after="60" w:line="360" w:lineRule="auto"/>
+        <w:jc w:val="center"/>
+        <w:rPr>
+          <w:rFonts w:ascii="Times New Roman" w:hAnsi="Times New Roman" w:eastAsia="宋体" w:cs="Times New Roman"/>
+          <w:b/>
+          <w:sz w:val="24"/>
+        </w:rPr>
+      </w:pPr>
+    </w:p>
+    <w:p>
+      <w:pPr>
+        <w:rPr>
+          <w:rFonts w:ascii="Times New Roman" w:hAnsi="Times New Roman" w:eastAsia="宋体" w:cs="Times New Roman"/>
+          <w:b/>
+          <w:sz w:val="24"/>
+        </w:rPr>
+      </w:pPr>
+      <w:r>
+        <w:rPr>
+          <w:rFonts w:ascii="Times New Roman" w:hAnsi="Times New Roman" w:eastAsia="宋体" w:cs="Times New Roman"/>
+          <w:b/>
+          <w:sz w:val="24"/>
+        </w:rPr>
+        <w:br w:type="page"/>
+      </w:r>
+    </w:p>
+    <w:p>
+      <w:pPr>
+        <w:keepNext/>
+        <w:snapToGrid w:val="0"/>
+        <w:spacing w:before="60" w:after="60" w:line="360" w:lineRule="auto"/>
+        <w:jc w:val="center"/>
+      </w:pPr>
+      <w:r>
+        <w:rPr>
+          <w:rFonts w:ascii="Times New Roman" w:hAnsi="Times New Roman" w:eastAsia="宋体" w:cs="Times New Roman"/>
+          <w:b/>
+          <w:sz w:val="24"/>
+        </w:rPr>
+        <w:t>表 1-1  赛题能力要求与实现方法对照</w:t>
       </w:r>
     </w:p>
     <w:tbl>
@@ -4012,9 +4142,9 @@
         </w:tblCellMar>
       </w:tblPr>
       <w:tblGrid>
-        <w:gridCol w:w="2769"/>
-        <w:gridCol w:w="2487"/>
-        <w:gridCol w:w="3473"/>
+        <w:gridCol w:w="1920"/>
+        <w:gridCol w:w="4189"/>
+        <w:gridCol w:w="2618"/>
       </w:tblGrid>
       <w:tr>
         <w:tblPrEx>
@@ -4032,7 +4162,7 @@
         </w:trPr>
         <w:tc>
           <w:tcPr>
-            <w:tcW w:w="2769" w:type="dxa"/>
+            <w:tcW w:w="1920" w:type="dxa"/>
             <w:tcBorders>
               <w:top w:val="single" w:color="1B2A49" w:sz="12" w:space="0"/>
               <w:left w:val="nil"/>
@@ -4045,22 +4175,22 @@
           <w:p>
             <w:pPr>
               <w:snapToGrid w:val="0"/>
-              <w:spacing w:before="0" w:after="0" w:line="360" w:lineRule="auto"/>
+              <w:spacing w:before="40" w:after="40" w:line="276" w:lineRule="auto"/>
               <w:jc w:val="center"/>
             </w:pPr>
             <w:r>
               <w:rPr>
                 <w:rFonts w:ascii="Times New Roman" w:hAnsi="Times New Roman" w:eastAsia="宋体" w:cs="Times New Roman"/>
                 <w:b/>
-                <w:sz w:val="24"/>
-              </w:rPr>
-              <w:t>赛题要求</w:t>
-            </w:r>
-          </w:p>
-        </w:tc>
-        <w:tc>
-          <w:tcPr>
-            <w:tcW w:w="2488" w:type="dxa"/>
+                <w:sz w:val="21"/>
+              </w:rPr>
+              <w:t>赛题能力要求</w:t>
+            </w:r>
+          </w:p>
+        </w:tc>
+        <w:tc>
+          <w:tcPr>
+            <w:tcW w:w="4190" w:type="dxa"/>
             <w:tcBorders>
               <w:top w:val="single" w:color="1B2A49" w:sz="12" w:space="0"/>
               <w:left w:val="nil"/>
@@ -4073,22 +4203,22 @@
           <w:p>
             <w:pPr>
               <w:snapToGrid w:val="0"/>
-              <w:spacing w:before="0" w:after="0" w:line="360" w:lineRule="auto"/>
+              <w:spacing w:before="40" w:after="40" w:line="276" w:lineRule="auto"/>
               <w:jc w:val="center"/>
             </w:pPr>
             <w:r>
               <w:rPr>
                 <w:rFonts w:ascii="Times New Roman" w:hAnsi="Times New Roman" w:eastAsia="宋体" w:cs="Times New Roman"/>
                 <w:b/>
-                <w:sz w:val="24"/>
-              </w:rPr>
-              <w:t>文档位置</w:t>
-            </w:r>
-          </w:p>
-        </w:tc>
-        <w:tc>
-          <w:tcPr>
-            <w:tcW w:w="3474" w:type="dxa"/>
+                <w:sz w:val="21"/>
+              </w:rPr>
+              <w:t>实现方法</w:t>
+            </w:r>
+          </w:p>
+        </w:tc>
+        <w:tc>
+          <w:tcPr>
+            <w:tcW w:w="2619" w:type="dxa"/>
             <w:tcBorders>
               <w:top w:val="single" w:color="1B2A49" w:sz="12" w:space="0"/>
               <w:left w:val="nil"/>
@@ -4101,16 +4231,16 @@
           <w:p>
             <w:pPr>
               <w:snapToGrid w:val="0"/>
-              <w:spacing w:before="0" w:after="0" w:line="360" w:lineRule="auto"/>
+              <w:spacing w:before="40" w:after="40" w:line="276" w:lineRule="auto"/>
               <w:jc w:val="center"/>
             </w:pPr>
             <w:r>
               <w:rPr>
                 <w:rFonts w:ascii="Times New Roman" w:hAnsi="Times New Roman" w:eastAsia="宋体" w:cs="Times New Roman"/>
                 <w:b/>
-                <w:sz w:val="24"/>
-              </w:rPr>
-              <w:t>程序包位置</w:t>
+                <w:sz w:val="21"/>
+              </w:rPr>
+              <w:t>达到效果（无防护→防护）</w:t>
             </w:r>
           </w:p>
         </w:tc>
@@ -4130,82 +4260,99 @@
         </w:trPr>
         <w:tc>
           <w:tcPr>
-            <w:tcW w:w="2769" w:type="dxa"/>
-            <w:tcBorders>
-              <w:top w:val="single" w:color="C9D1DD" w:sz="4" w:space="0"/>
-              <w:left w:val="nil"/>
-              <w:bottom w:val="single" w:color="C9D1DD" w:sz="4" w:space="0"/>
-              <w:right w:val="nil"/>
-            </w:tcBorders>
-            <w:vAlign w:val="center"/>
-          </w:tcPr>
-          <w:p>
-            <w:pPr>
-              <w:snapToGrid w:val="0"/>
-              <w:spacing w:before="0" w:after="0" w:line="360" w:lineRule="auto"/>
-              <w:jc w:val="center"/>
-            </w:pPr>
-            <w:r>
-              <w:rPr>
-                <w:rFonts w:ascii="Times New Roman" w:hAnsi="Times New Roman" w:eastAsia="宋体" w:cs="Times New Roman"/>
-                <w:b w:val="0"/>
-                <w:sz w:val="24"/>
-              </w:rPr>
-              <w:t>整体设计文档</w:t>
-            </w:r>
-          </w:p>
-        </w:tc>
-        <w:tc>
-          <w:tcPr>
-            <w:tcW w:w="2488" w:type="dxa"/>
-            <w:tcBorders>
-              <w:top w:val="single" w:color="C9D1DD" w:sz="4" w:space="0"/>
-              <w:left w:val="nil"/>
-              <w:bottom w:val="single" w:color="C9D1DD" w:sz="4" w:space="0"/>
-              <w:right w:val="nil"/>
-            </w:tcBorders>
-            <w:vAlign w:val="center"/>
-          </w:tcPr>
-          <w:p>
-            <w:pPr>
-              <w:snapToGrid w:val="0"/>
-              <w:spacing w:before="0" w:after="0" w:line="360" w:lineRule="auto"/>
-              <w:jc w:val="center"/>
-            </w:pPr>
-            <w:r>
-              <w:rPr>
-                <w:rFonts w:ascii="Times New Roman" w:hAnsi="Times New Roman" w:eastAsia="宋体" w:cs="Times New Roman"/>
-                <w:b w:val="0"/>
-                <w:sz w:val="24"/>
-              </w:rPr>
-              <w:t>本文</w:t>
-            </w:r>
-          </w:p>
-        </w:tc>
-        <w:tc>
-          <w:tcPr>
-            <w:tcW w:w="3474" w:type="dxa"/>
-            <w:tcBorders>
-              <w:top w:val="single" w:color="C9D1DD" w:sz="4" w:space="0"/>
-              <w:left w:val="nil"/>
-              <w:bottom w:val="single" w:color="C9D1DD" w:sz="4" w:space="0"/>
-              <w:right w:val="nil"/>
-            </w:tcBorders>
-            <w:vAlign w:val="center"/>
-          </w:tcPr>
-          <w:p>
-            <w:pPr>
-              <w:snapToGrid w:val="0"/>
-              <w:spacing w:before="0" w:after="0" w:line="360" w:lineRule="auto"/>
+            <w:tcW w:w="1920" w:type="dxa"/>
+            <w:tcBorders>
+              <w:top w:val="single" w:color="C9D1DD" w:sz="4" w:space="0"/>
+              <w:left w:val="nil"/>
+              <w:bottom w:val="single" w:color="C9D1DD" w:sz="4" w:space="0"/>
+              <w:right w:val="nil"/>
+            </w:tcBorders>
+            <w:vAlign w:val="center"/>
+          </w:tcPr>
+          <w:p>
+            <w:pPr>
+              <w:snapToGrid w:val="0"/>
+              <w:spacing w:before="40" w:after="40" w:line="276" w:lineRule="auto"/>
               <w:jc w:val="left"/>
             </w:pPr>
             <w:r>
               <w:rPr>
                 <w:rFonts w:ascii="Times New Roman" w:hAnsi="Times New Roman" w:eastAsia="宋体" w:cs="Times New Roman"/>
                 <w:b w:val="0"/>
-                <w:sz w:val="24"/>
-              </w:rPr>
-              <w:t>src/、extensions/、console/</w:t>
+                <w:sz w:val="21"/>
+              </w:rPr>
+              <w:t>能力 1：多源注入识别（含直接注入与间接注入）</w:t>
+            </w:r>
+          </w:p>
+        </w:tc>
+        <w:tc>
+          <w:tcPr>
+            <w:tcW w:w="4190" w:type="dxa"/>
+            <w:tcBorders>
+              <w:top w:val="single" w:color="C9D1DD" w:sz="4" w:space="0"/>
+              <w:left w:val="nil"/>
+              <w:bottom w:val="single" w:color="C9D1DD" w:sz="4" w:space="0"/>
+              <w:right w:val="nil"/>
+            </w:tcBorders>
+            <w:vAlign w:val="center"/>
+          </w:tcPr>
+          <w:p>
+            <w:pPr>
+              <w:snapToGrid w:val="0"/>
+              <w:spacing w:before="40" w:after="40" w:line="276" w:lineRule="auto"/>
+              <w:jc w:val="left"/>
+            </w:pPr>
+            <w:r>
+              <w:rPr>
+                <w:rFonts w:ascii="Times New Roman" w:hAnsi="Times New Roman" w:eastAsia="宋体" w:cs="Times New Roman"/>
+                <w:b w:val="0"/>
+                <w:sz w:val="21"/>
+              </w:rPr>
+              <w:t>执行前</w:t>
+            </w:r>
+            <w:r>
+              <w:rPr>
+                <w:rFonts w:hint="eastAsia" w:cs="Times New Roman"/>
+                <w:b w:val="0"/>
+                <w:sz w:val="21"/>
+                <w:lang w:eastAsia="zh-CN"/>
+              </w:rPr>
+              <w:t>Hook</w:t>
+            </w:r>
+            <w:r>
+              <w:rPr>
+                <w:rFonts w:ascii="Times New Roman" w:hAnsi="Times New Roman" w:eastAsia="宋体" w:cs="Times New Roman"/>
+                <w:b w:val="0"/>
+                <w:sz w:val="21"/>
+              </w:rPr>
+              <w:t>插件、API 侧网关与 MCP 中间代理分别覆盖工具调用、模型请求与 MCP 三条链路，外部内容进入时登记为独立来源；快镜 D²Guard-Laya 判别来源是否向读者提出具体任务，规则层识别用户输入中的越权指令、角色伪装与上下文劫持（第三章、6.2、6.3）</w:t>
+            </w:r>
+          </w:p>
+        </w:tc>
+        <w:tc>
+          <w:tcPr>
+            <w:tcW w:w="2619" w:type="dxa"/>
+            <w:tcBorders>
+              <w:top w:val="single" w:color="C9D1DD" w:sz="4" w:space="0"/>
+              <w:left w:val="nil"/>
+              <w:bottom w:val="single" w:color="C9D1DD" w:sz="4" w:space="0"/>
+              <w:right w:val="nil"/>
+            </w:tcBorders>
+            <w:vAlign w:val="center"/>
+          </w:tcPr>
+          <w:p>
+            <w:pPr>
+              <w:snapToGrid w:val="0"/>
+              <w:spacing w:before="40" w:after="40" w:line="276" w:lineRule="auto"/>
+              <w:jc w:val="left"/>
+            </w:pPr>
+            <w:r>
+              <w:rPr>
+                <w:rFonts w:ascii="Times New Roman" w:hAnsi="Times New Roman" w:eastAsia="宋体" w:cs="Times New Roman"/>
+                <w:b w:val="0"/>
+                <w:sz w:val="21"/>
+              </w:rPr>
+              <w:t>间接注入攻击成功 44／55→0／54；直接注入攻击成功 35／39→0／39</w:t>
             </w:r>
           </w:p>
         </w:tc>
@@ -4225,82 +4372,82 @@
         </w:trPr>
         <w:tc>
           <w:tcPr>
-            <w:tcW w:w="2769" w:type="dxa"/>
-            <w:tcBorders>
-              <w:top w:val="single" w:color="C9D1DD" w:sz="4" w:space="0"/>
-              <w:left w:val="nil"/>
-              <w:bottom w:val="single" w:color="C9D1DD" w:sz="4" w:space="0"/>
-              <w:right w:val="nil"/>
-            </w:tcBorders>
-            <w:vAlign w:val="center"/>
-          </w:tcPr>
-          <w:p>
-            <w:pPr>
-              <w:snapToGrid w:val="0"/>
-              <w:spacing w:before="0" w:after="0" w:line="360" w:lineRule="auto"/>
+            <w:tcW w:w="1920" w:type="dxa"/>
+            <w:tcBorders>
+              <w:top w:val="single" w:color="C9D1DD" w:sz="4" w:space="0"/>
+              <w:left w:val="nil"/>
+              <w:bottom w:val="single" w:color="C9D1DD" w:sz="4" w:space="0"/>
+              <w:right w:val="nil"/>
+            </w:tcBorders>
+            <w:vAlign w:val="center"/>
+          </w:tcPr>
+          <w:p>
+            <w:pPr>
+              <w:snapToGrid w:val="0"/>
+              <w:spacing w:before="40" w:after="40" w:line="276" w:lineRule="auto"/>
               <w:jc w:val="left"/>
             </w:pPr>
             <w:r>
               <w:rPr>
                 <w:rFonts w:ascii="Times New Roman" w:hAnsi="Times New Roman" w:eastAsia="宋体" w:cs="Times New Roman"/>
                 <w:b w:val="0"/>
-                <w:sz w:val="24"/>
-              </w:rPr>
-              <w:t>测试样例及测试流程说明文档</w:t>
-            </w:r>
-          </w:p>
-        </w:tc>
-        <w:tc>
-          <w:tcPr>
-            <w:tcW w:w="2488" w:type="dxa"/>
-            <w:tcBorders>
-              <w:top w:val="single" w:color="C9D1DD" w:sz="4" w:space="0"/>
-              <w:left w:val="nil"/>
-              <w:bottom w:val="single" w:color="C9D1DD" w:sz="4" w:space="0"/>
-              <w:right w:val="nil"/>
-            </w:tcBorders>
-            <w:vAlign w:val="center"/>
-          </w:tcPr>
-          <w:p>
-            <w:pPr>
-              <w:snapToGrid w:val="0"/>
-              <w:spacing w:before="0" w:after="0" w:line="360" w:lineRule="auto"/>
+                <w:sz w:val="21"/>
+              </w:rPr>
+              <w:t>能力 2：意图—计划—工具语义对齐</w:t>
+            </w:r>
+          </w:p>
+        </w:tc>
+        <w:tc>
+          <w:tcPr>
+            <w:tcW w:w="4190" w:type="dxa"/>
+            <w:tcBorders>
+              <w:top w:val="single" w:color="C9D1DD" w:sz="4" w:space="0"/>
+              <w:left w:val="nil"/>
+              <w:bottom w:val="single" w:color="C9D1DD" w:sz="4" w:space="0"/>
+              <w:right w:val="nil"/>
+            </w:tcBorders>
+            <w:vAlign w:val="center"/>
+          </w:tcPr>
+          <w:p>
+            <w:pPr>
+              <w:snapToGrid w:val="0"/>
+              <w:spacing w:before="40" w:after="40" w:line="276" w:lineRule="auto"/>
               <w:jc w:val="left"/>
             </w:pPr>
             <w:r>
               <w:rPr>
                 <w:rFonts w:ascii="Times New Roman" w:hAnsi="Times New Roman" w:eastAsia="宋体" w:cs="Times New Roman"/>
                 <w:b w:val="0"/>
-                <w:sz w:val="24"/>
-              </w:rPr>
-              <w:t>《测试样例及测试流程说明文档》</w:t>
-            </w:r>
-          </w:p>
-        </w:tc>
-        <w:tc>
-          <w:tcPr>
-            <w:tcW w:w="3474" w:type="dxa"/>
-            <w:tcBorders>
-              <w:top w:val="single" w:color="C9D1DD" w:sz="4" w:space="0"/>
-              <w:left w:val="nil"/>
-              <w:bottom w:val="single" w:color="C9D1DD" w:sz="4" w:space="0"/>
-              <w:right w:val="nil"/>
-            </w:tcBorders>
-            <w:vAlign w:val="center"/>
-          </w:tcPr>
-          <w:p>
-            <w:pPr>
-              <w:snapToGrid w:val="0"/>
-              <w:spacing w:before="0" w:after="0" w:line="360" w:lineRule="auto"/>
+                <w:sz w:val="21"/>
+              </w:rPr>
+              <w:t>由可信用户消息生成授权锚点（意图），候选调用序列（计划）与规范化动作（工具）在执行前逐一比对；越出授权的动作再查询上下文中是否存在被快镜判定为提出任务的来源（第四章、6.1）</w:t>
+            </w:r>
+          </w:p>
+        </w:tc>
+        <w:tc>
+          <w:tcPr>
+            <w:tcW w:w="2619" w:type="dxa"/>
+            <w:tcBorders>
+              <w:top w:val="single" w:color="C9D1DD" w:sz="4" w:space="0"/>
+              <w:left w:val="nil"/>
+              <w:bottom w:val="single" w:color="C9D1DD" w:sz="4" w:space="0"/>
+              <w:right w:val="nil"/>
+            </w:tcBorders>
+            <w:vAlign w:val="center"/>
+          </w:tcPr>
+          <w:p>
+            <w:pPr>
+              <w:snapToGrid w:val="0"/>
+              <w:spacing w:before="40" w:after="40" w:line="276" w:lineRule="auto"/>
               <w:jc w:val="left"/>
             </w:pPr>
             <w:r>
               <w:rPr>
                 <w:rFonts w:ascii="Times New Roman" w:hAnsi="Times New Roman" w:eastAsia="宋体" w:cs="Times New Roman"/>
                 <w:b w:val="0"/>
-                <w:sz w:val="24"/>
-              </w:rPr>
-              <w:t>scenarios/、tests/、runs/</w:t>
+                <w:sz w:val="21"/>
+              </w:rPr>
+              <w:t>规则漏检的语义伪装攻击成功 0／20，正常任务完成 20／24（仅规则保守口径为 0／24）</w:t>
             </w:r>
           </w:p>
         </w:tc>
@@ -4320,82 +4467,82 @@
         </w:trPr>
         <w:tc>
           <w:tcPr>
-            <w:tcW w:w="2769" w:type="dxa"/>
-            <w:tcBorders>
-              <w:top w:val="single" w:color="C9D1DD" w:sz="4" w:space="0"/>
-              <w:left w:val="nil"/>
-              <w:bottom w:val="single" w:color="C9D1DD" w:sz="4" w:space="0"/>
-              <w:right w:val="nil"/>
-            </w:tcBorders>
-            <w:vAlign w:val="center"/>
-          </w:tcPr>
-          <w:p>
-            <w:pPr>
-              <w:snapToGrid w:val="0"/>
-              <w:spacing w:before="0" w:after="0" w:line="360" w:lineRule="auto"/>
-              <w:jc w:val="center"/>
-            </w:pPr>
-            <w:r>
-              <w:rPr>
-                <w:rFonts w:ascii="Times New Roman" w:hAnsi="Times New Roman" w:eastAsia="宋体" w:cs="Times New Roman"/>
-                <w:b w:val="0"/>
-                <w:sz w:val="24"/>
-              </w:rPr>
-              <w:t>部署说明文档</w:t>
-            </w:r>
-          </w:p>
-        </w:tc>
-        <w:tc>
-          <w:tcPr>
-            <w:tcW w:w="2488" w:type="dxa"/>
-            <w:tcBorders>
-              <w:top w:val="single" w:color="C9D1DD" w:sz="4" w:space="0"/>
-              <w:left w:val="nil"/>
-              <w:bottom w:val="single" w:color="C9D1DD" w:sz="4" w:space="0"/>
-              <w:right w:val="nil"/>
-            </w:tcBorders>
-            <w:vAlign w:val="center"/>
-          </w:tcPr>
-          <w:p>
-            <w:pPr>
-              <w:snapToGrid w:val="0"/>
-              <w:spacing w:before="0" w:after="0" w:line="360" w:lineRule="auto"/>
+            <w:tcW w:w="1920" w:type="dxa"/>
+            <w:tcBorders>
+              <w:top w:val="single" w:color="C9D1DD" w:sz="4" w:space="0"/>
+              <w:left w:val="nil"/>
+              <w:bottom w:val="single" w:color="C9D1DD" w:sz="4" w:space="0"/>
+              <w:right w:val="nil"/>
+            </w:tcBorders>
+            <w:vAlign w:val="center"/>
+          </w:tcPr>
+          <w:p>
+            <w:pPr>
+              <w:snapToGrid w:val="0"/>
+              <w:spacing w:before="40" w:after="40" w:line="276" w:lineRule="auto"/>
               <w:jc w:val="left"/>
             </w:pPr>
             <w:r>
               <w:rPr>
                 <w:rFonts w:ascii="Times New Roman" w:hAnsi="Times New Roman" w:eastAsia="宋体" w:cs="Times New Roman"/>
                 <w:b w:val="0"/>
-                <w:sz w:val="24"/>
-              </w:rPr>
-              <w:t>《部署说明文档》</w:t>
-            </w:r>
-          </w:p>
-        </w:tc>
-        <w:tc>
-          <w:tcPr>
-            <w:tcW w:w="3474" w:type="dxa"/>
-            <w:tcBorders>
-              <w:top w:val="single" w:color="C9D1DD" w:sz="4" w:space="0"/>
-              <w:left w:val="nil"/>
-              <w:bottom w:val="single" w:color="C9D1DD" w:sz="4" w:space="0"/>
-              <w:right w:val="nil"/>
-            </w:tcBorders>
-            <w:vAlign w:val="center"/>
-          </w:tcPr>
-          <w:p>
-            <w:pPr>
-              <w:snapToGrid w:val="0"/>
-              <w:spacing w:before="0" w:after="0" w:line="360" w:lineRule="auto"/>
+                <w:sz w:val="21"/>
+              </w:rPr>
+              <w:t>能力 3：细粒度策略与三态决策</w:t>
+            </w:r>
+          </w:p>
+        </w:tc>
+        <w:tc>
+          <w:tcPr>
+            <w:tcW w:w="4190" w:type="dxa"/>
+            <w:tcBorders>
+              <w:top w:val="single" w:color="C9D1DD" w:sz="4" w:space="0"/>
+              <w:left w:val="nil"/>
+              <w:bottom w:val="single" w:color="C9D1DD" w:sz="4" w:space="0"/>
+              <w:right w:val="nil"/>
+            </w:tcBorders>
+            <w:vAlign w:val="center"/>
+          </w:tcPr>
+          <w:p>
+            <w:pPr>
+              <w:snapToGrid w:val="0"/>
+              <w:spacing w:before="40" w:after="40" w:line="276" w:lineRule="auto"/>
               <w:jc w:val="left"/>
             </w:pPr>
             <w:r>
               <w:rPr>
                 <w:rFonts w:ascii="Times New Roman" w:hAnsi="Times New Roman" w:eastAsia="宋体" w:cs="Times New Roman"/>
                 <w:b w:val="0"/>
-                <w:sz w:val="24"/>
-              </w:rPr>
-              <w:t>README.md、使用说明.md、安装与启动脚本</w:t>
+                <w:sz w:val="21"/>
+              </w:rPr>
+              <w:t>14 条规则组成的决策表依据操作、目标、用户授权与来源污染给出放行、挂起或阻断；挂起操作经控制台网页审批，硬策略直接阻断（5.3、5.4）</w:t>
+            </w:r>
+          </w:p>
+        </w:tc>
+        <w:tc>
+          <w:tcPr>
+            <w:tcW w:w="2619" w:type="dxa"/>
+            <w:tcBorders>
+              <w:top w:val="single" w:color="C9D1DD" w:sz="4" w:space="0"/>
+              <w:left w:val="nil"/>
+              <w:bottom w:val="single" w:color="C9D1DD" w:sz="4" w:space="0"/>
+              <w:right w:val="nil"/>
+            </w:tcBorders>
+            <w:vAlign w:val="center"/>
+          </w:tcPr>
+          <w:p>
+            <w:pPr>
+              <w:snapToGrid w:val="0"/>
+              <w:spacing w:before="40" w:after="40" w:line="276" w:lineRule="auto"/>
+              <w:jc w:val="left"/>
+            </w:pPr>
+            <w:r>
+              <w:rPr>
+                <w:rFonts w:ascii="Times New Roman" w:hAnsi="Times New Roman" w:eastAsia="宋体" w:cs="Times New Roman"/>
+                <w:b w:val="0"/>
+                <w:sz w:val="21"/>
+              </w:rPr>
+              <w:t>正常任务阻断 0，298 次中 278 次自动完成；良性动作误挂起 0／929；裁决耗时中位数 8 ms</w:t>
             </w:r>
           </w:p>
         </w:tc>
@@ -4415,82 +4562,82 @@
         </w:trPr>
         <w:tc>
           <w:tcPr>
-            <w:tcW w:w="2769" w:type="dxa"/>
-            <w:tcBorders>
-              <w:top w:val="single" w:color="C9D1DD" w:sz="4" w:space="0"/>
-              <w:left w:val="nil"/>
-              <w:bottom w:val="single" w:color="C9D1DD" w:sz="4" w:space="0"/>
-              <w:right w:val="nil"/>
-            </w:tcBorders>
-            <w:vAlign w:val="center"/>
-          </w:tcPr>
-          <w:p>
-            <w:pPr>
-              <w:snapToGrid w:val="0"/>
-              <w:spacing w:before="0" w:after="0" w:line="360" w:lineRule="auto"/>
-              <w:jc w:val="center"/>
-            </w:pPr>
-            <w:r>
-              <w:rPr>
-                <w:rFonts w:ascii="Times New Roman" w:hAnsi="Times New Roman" w:eastAsia="宋体" w:cs="Times New Roman"/>
-                <w:b w:val="0"/>
-                <w:sz w:val="24"/>
-              </w:rPr>
-              <w:t>程序源码</w:t>
-            </w:r>
-          </w:p>
-        </w:tc>
-        <w:tc>
-          <w:tcPr>
-            <w:tcW w:w="2488" w:type="dxa"/>
-            <w:tcBorders>
-              <w:top w:val="single" w:color="C9D1DD" w:sz="4" w:space="0"/>
-              <w:left w:val="nil"/>
-              <w:bottom w:val="single" w:color="C9D1DD" w:sz="4" w:space="0"/>
-              <w:right w:val="nil"/>
-            </w:tcBorders>
-            <w:vAlign w:val="center"/>
-          </w:tcPr>
-          <w:p>
-            <w:pPr>
-              <w:snapToGrid w:val="0"/>
-              <w:spacing w:before="0" w:after="0" w:line="360" w:lineRule="auto"/>
-              <w:jc w:val="center"/>
-            </w:pPr>
-            <w:r>
-              <w:rPr>
-                <w:rFonts w:ascii="Times New Roman" w:hAnsi="Times New Roman" w:eastAsia="宋体" w:cs="Times New Roman"/>
-                <w:b w:val="0"/>
-                <w:sz w:val="24"/>
-              </w:rPr>
-              <w:t>—</w:t>
-            </w:r>
-          </w:p>
-        </w:tc>
-        <w:tc>
-          <w:tcPr>
-            <w:tcW w:w="3474" w:type="dxa"/>
-            <w:tcBorders>
-              <w:top w:val="single" w:color="C9D1DD" w:sz="4" w:space="0"/>
-              <w:left w:val="nil"/>
-              <w:bottom w:val="single" w:color="C9D1DD" w:sz="4" w:space="0"/>
-              <w:right w:val="nil"/>
-            </w:tcBorders>
-            <w:vAlign w:val="center"/>
-          </w:tcPr>
-          <w:p>
-            <w:pPr>
-              <w:snapToGrid w:val="0"/>
-              <w:spacing w:before="0" w:after="0" w:line="360" w:lineRule="auto"/>
+            <w:tcW w:w="1920" w:type="dxa"/>
+            <w:tcBorders>
+              <w:top w:val="single" w:color="C9D1DD" w:sz="4" w:space="0"/>
+              <w:left w:val="nil"/>
+              <w:bottom w:val="single" w:color="C9D1DD" w:sz="4" w:space="0"/>
+              <w:right w:val="nil"/>
+            </w:tcBorders>
+            <w:vAlign w:val="center"/>
+          </w:tcPr>
+          <w:p>
+            <w:pPr>
+              <w:snapToGrid w:val="0"/>
+              <w:spacing w:before="40" w:after="40" w:line="276" w:lineRule="auto"/>
               <w:jc w:val="left"/>
             </w:pPr>
             <w:r>
               <w:rPr>
                 <w:rFonts w:ascii="Times New Roman" w:hAnsi="Times New Roman" w:eastAsia="宋体" w:cs="Times New Roman"/>
                 <w:b w:val="0"/>
-                <w:sz w:val="24"/>
-              </w:rPr>
-              <w:t>程序包全部源码与模型权重</w:t>
+                <w:sz w:val="21"/>
+              </w:rPr>
+              <w:t>能力 4：跨 MCP 与子 Agent 溯源</w:t>
+            </w:r>
+          </w:p>
+        </w:tc>
+        <w:tc>
+          <w:tcPr>
+            <w:tcW w:w="4190" w:type="dxa"/>
+            <w:tcBorders>
+              <w:top w:val="single" w:color="C9D1DD" w:sz="4" w:space="0"/>
+              <w:left w:val="nil"/>
+              <w:bottom w:val="single" w:color="C9D1DD" w:sz="4" w:space="0"/>
+              <w:right w:val="nil"/>
+            </w:tcBorders>
+            <w:vAlign w:val="center"/>
+          </w:tcPr>
+          <w:p>
+            <w:pPr>
+              <w:snapToGrid w:val="0"/>
+              <w:spacing w:before="40" w:after="40" w:line="276" w:lineRule="auto"/>
+              <w:jc w:val="left"/>
+            </w:pPr>
+            <w:r>
+              <w:rPr>
+                <w:rFonts w:ascii="Times New Roman" w:hAnsi="Times New Roman" w:eastAsia="宋体" w:cs="Times New Roman"/>
+                <w:b w:val="0"/>
+                <w:sz w:val="21"/>
+              </w:rPr>
+              <w:t>MCP 工具以服务器与工具名联合标识并记录服务器身份；子智能体继承父智能体的来源标签，跨会话记忆保留写入来源；溯源图与慢镜报告引用原文字符区间（第三章、5.5）</w:t>
+            </w:r>
+          </w:p>
+        </w:tc>
+        <w:tc>
+          <w:tcPr>
+            <w:tcW w:w="2619" w:type="dxa"/>
+            <w:tcBorders>
+              <w:top w:val="single" w:color="C9D1DD" w:sz="4" w:space="0"/>
+              <w:left w:val="nil"/>
+              <w:bottom w:val="single" w:color="C9D1DD" w:sz="4" w:space="0"/>
+              <w:right w:val="nil"/>
+            </w:tcBorders>
+            <w:vAlign w:val="center"/>
+          </w:tcPr>
+          <w:p>
+            <w:pPr>
+              <w:snapToGrid w:val="0"/>
+              <w:spacing w:before="40" w:after="40" w:line="276" w:lineRule="auto"/>
+              <w:jc w:val="left"/>
+            </w:pPr>
+            <w:r>
+              <w:rPr>
+                <w:rFonts w:ascii="Times New Roman" w:hAnsi="Times New Roman" w:eastAsia="宋体" w:cs="Times New Roman"/>
+                <w:b w:val="0"/>
+                <w:sz w:val="21"/>
+              </w:rPr>
+              <w:t>工具链供应链攻击成功 4／6→0／6，工具滥用 17／47→0／48；公开 CVE 复现 8／12→0／12</w:t>
             </w:r>
           </w:p>
         </w:tc>
@@ -4510,462 +4657,82 @@
         </w:trPr>
         <w:tc>
           <w:tcPr>
-            <w:tcW w:w="2769" w:type="dxa"/>
-            <w:tcBorders>
-              <w:top w:val="single" w:color="C9D1DD" w:sz="4" w:space="0"/>
-              <w:left w:val="nil"/>
-              <w:bottom w:val="single" w:color="C9D1DD" w:sz="4" w:space="0"/>
-              <w:right w:val="nil"/>
-            </w:tcBorders>
-            <w:vAlign w:val="center"/>
-          </w:tcPr>
-          <w:p>
-            <w:pPr>
-              <w:snapToGrid w:val="0"/>
-              <w:spacing w:before="0" w:after="0" w:line="360" w:lineRule="auto"/>
+            <w:tcW w:w="1920" w:type="dxa"/>
+            <w:tcBorders>
+              <w:top w:val="single" w:color="C9D1DD" w:sz="4" w:space="0"/>
+              <w:left w:val="nil"/>
+              <w:bottom w:val="single" w:color="1B2A49" w:sz="12" w:space="0"/>
+              <w:right w:val="nil"/>
+            </w:tcBorders>
+            <w:vAlign w:val="center"/>
+          </w:tcPr>
+          <w:p>
+            <w:pPr>
+              <w:snapToGrid w:val="0"/>
+              <w:spacing w:before="40" w:after="40" w:line="276" w:lineRule="auto"/>
               <w:jc w:val="left"/>
             </w:pPr>
             <w:r>
               <w:rPr>
                 <w:rFonts w:ascii="Times New Roman" w:hAnsi="Times New Roman" w:eastAsia="宋体" w:cs="Times New Roman"/>
                 <w:b w:val="0"/>
-                <w:sz w:val="24"/>
-              </w:rPr>
-              <w:t>能力 1：多源注入识别（含直接注入）</w:t>
-            </w:r>
-          </w:p>
-        </w:tc>
-        <w:tc>
-          <w:tcPr>
-            <w:tcW w:w="2488" w:type="dxa"/>
-            <w:tcBorders>
-              <w:top w:val="single" w:color="C9D1DD" w:sz="4" w:space="0"/>
-              <w:left w:val="nil"/>
-              <w:bottom w:val="single" w:color="C9D1DD" w:sz="4" w:space="0"/>
-              <w:right w:val="nil"/>
-            </w:tcBorders>
-            <w:vAlign w:val="center"/>
-          </w:tcPr>
-          <w:p>
-            <w:pPr>
-              <w:snapToGrid w:val="0"/>
-              <w:spacing w:before="0" w:after="0" w:line="360" w:lineRule="auto"/>
+                <w:sz w:val="21"/>
+              </w:rPr>
+              <w:t>能力 5：对抗鲁棒性</w:t>
+            </w:r>
+          </w:p>
+        </w:tc>
+        <w:tc>
+          <w:tcPr>
+            <w:tcW w:w="4190" w:type="dxa"/>
+            <w:tcBorders>
+              <w:top w:val="single" w:color="C9D1DD" w:sz="4" w:space="0"/>
+              <w:left w:val="nil"/>
+              <w:bottom w:val="single" w:color="1B2A49" w:sz="12" w:space="0"/>
+              <w:right w:val="nil"/>
+            </w:tcBorders>
+            <w:vAlign w:val="center"/>
+          </w:tcPr>
+          <w:p>
+            <w:pPr>
+              <w:snapToGrid w:val="0"/>
+              <w:spacing w:before="40" w:after="40" w:line="276" w:lineRule="auto"/>
               <w:jc w:val="left"/>
             </w:pPr>
             <w:r>
               <w:rPr>
                 <w:rFonts w:ascii="Times New Roman" w:hAnsi="Times New Roman" w:eastAsia="宋体" w:cs="Times New Roman"/>
                 <w:b w:val="0"/>
-                <w:sz w:val="24"/>
-              </w:rPr>
-              <w:t>第三章、6.2、6.3</w:t>
-            </w:r>
-          </w:p>
-        </w:tc>
-        <w:tc>
-          <w:tcPr>
-            <w:tcW w:w="3474" w:type="dxa"/>
-            <w:tcBorders>
-              <w:top w:val="single" w:color="C9D1DD" w:sz="4" w:space="0"/>
-              <w:left w:val="nil"/>
-              <w:bottom w:val="single" w:color="C9D1DD" w:sz="4" w:space="0"/>
-              <w:right w:val="nil"/>
-            </w:tcBorders>
-            <w:vAlign w:val="center"/>
-          </w:tcPr>
-          <w:p>
-            <w:pPr>
-              <w:snapToGrid w:val="0"/>
-              <w:spacing w:before="0" w:after="0" w:line="360" w:lineRule="auto"/>
+                <w:sz w:val="21"/>
+              </w:rPr>
+              <w:t>规范化层统一编码、大小写与同形字后再比对目标；快镜以中、英、日、俄多语言及约 20% 混淆变体训练；增量安全链保留早期注入以抵抗上下文稀释（6.4、6.5）</w:t>
+            </w:r>
+          </w:p>
+        </w:tc>
+        <w:tc>
+          <w:tcPr>
+            <w:tcW w:w="2619" w:type="dxa"/>
+            <w:tcBorders>
+              <w:top w:val="single" w:color="C9D1DD" w:sz="4" w:space="0"/>
+              <w:left w:val="nil"/>
+              <w:bottom w:val="single" w:color="1B2A49" w:sz="12" w:space="0"/>
+              <w:right w:val="nil"/>
+            </w:tcBorders>
+            <w:vAlign w:val="center"/>
+          </w:tcPr>
+          <w:p>
+            <w:pPr>
+              <w:snapToGrid w:val="0"/>
+              <w:spacing w:before="40" w:after="40" w:line="276" w:lineRule="auto"/>
               <w:jc w:val="left"/>
             </w:pPr>
             <w:r>
               <w:rPr>
                 <w:rFonts w:ascii="Times New Roman" w:hAnsi="Times New Roman" w:eastAsia="宋体" w:cs="Times New Roman"/>
                 <w:b w:val="0"/>
-                <w:sz w:val="24"/>
-              </w:rPr>
-              <w:t>content_model.py、request_taint.py、direct_injection.py、mcp_bridge.py</w:t>
-            </w:r>
-          </w:p>
-        </w:tc>
-      </w:tr>
-      <w:tr>
-        <w:tblPrEx>
-          <w:tblCellMar>
-            <w:top w:w="50" w:type="dxa"/>
-            <w:left w:w="80" w:type="dxa"/>
-            <w:bottom w:w="50" w:type="dxa"/>
-            <w:right w:w="80" w:type="dxa"/>
-          </w:tblCellMar>
-        </w:tblPrEx>
-        <w:trPr>
-          <w:cantSplit/>
-          <w:jc w:val="center"/>
-        </w:trPr>
-        <w:tc>
-          <w:tcPr>
-            <w:tcW w:w="2769" w:type="dxa"/>
-            <w:tcBorders>
-              <w:top w:val="single" w:color="C9D1DD" w:sz="4" w:space="0"/>
-              <w:left w:val="nil"/>
-              <w:bottom w:val="single" w:color="C9D1DD" w:sz="4" w:space="0"/>
-              <w:right w:val="nil"/>
-            </w:tcBorders>
-            <w:vAlign w:val="center"/>
-          </w:tcPr>
-          <w:p>
-            <w:pPr>
-              <w:snapToGrid w:val="0"/>
-              <w:spacing w:before="0" w:after="0" w:line="360" w:lineRule="auto"/>
-              <w:jc w:val="left"/>
-            </w:pPr>
-            <w:r>
-              <w:rPr>
-                <w:rFonts w:ascii="Times New Roman" w:hAnsi="Times New Roman" w:eastAsia="宋体" w:cs="Times New Roman"/>
-                <w:b w:val="0"/>
-                <w:sz w:val="24"/>
-              </w:rPr>
-              <w:t>能力 2：意图—计划—工具对齐</w:t>
-            </w:r>
-          </w:p>
-        </w:tc>
-        <w:tc>
-          <w:tcPr>
-            <w:tcW w:w="2488" w:type="dxa"/>
-            <w:tcBorders>
-              <w:top w:val="single" w:color="C9D1DD" w:sz="4" w:space="0"/>
-              <w:left w:val="nil"/>
-              <w:bottom w:val="single" w:color="C9D1DD" w:sz="4" w:space="0"/>
-              <w:right w:val="nil"/>
-            </w:tcBorders>
-            <w:vAlign w:val="center"/>
-          </w:tcPr>
-          <w:p>
-            <w:pPr>
-              <w:snapToGrid w:val="0"/>
-              <w:spacing w:before="0" w:after="0" w:line="360" w:lineRule="auto"/>
-              <w:jc w:val="left"/>
-            </w:pPr>
-            <w:r>
-              <w:rPr>
-                <w:rFonts w:ascii="Times New Roman" w:hAnsi="Times New Roman" w:eastAsia="宋体" w:cs="Times New Roman"/>
-                <w:b w:val="0"/>
-                <w:sz w:val="24"/>
-              </w:rPr>
-              <w:t>第四章、6.1</w:t>
-            </w:r>
-          </w:p>
-        </w:tc>
-        <w:tc>
-          <w:tcPr>
-            <w:tcW w:w="3474" w:type="dxa"/>
-            <w:tcBorders>
-              <w:top w:val="single" w:color="C9D1DD" w:sz="4" w:space="0"/>
-              <w:left w:val="nil"/>
-              <w:bottom w:val="single" w:color="C9D1DD" w:sz="4" w:space="0"/>
-              <w:right w:val="nil"/>
-            </w:tcBorders>
-            <w:vAlign w:val="center"/>
-          </w:tcPr>
-          <w:p>
-            <w:pPr>
-              <w:snapToGrid w:val="0"/>
-              <w:spacing w:before="0" w:after="0" w:line="360" w:lineRule="auto"/>
-              <w:jc w:val="left"/>
-            </w:pPr>
-            <w:r>
-              <w:rPr>
-                <w:rFonts w:ascii="Times New Roman" w:hAnsi="Times New Roman" w:eastAsia="宋体" w:cs="Times New Roman"/>
-                <w:b w:val="0"/>
-                <w:sz w:val="24"/>
-              </w:rPr>
-              <w:t>task_brief.py、ledger.py、decision.py</w:t>
-            </w:r>
-          </w:p>
-        </w:tc>
-      </w:tr>
-      <w:tr>
-        <w:tblPrEx>
-          <w:tblCellMar>
-            <w:top w:w="50" w:type="dxa"/>
-            <w:left w:w="80" w:type="dxa"/>
-            <w:bottom w:w="50" w:type="dxa"/>
-            <w:right w:w="80" w:type="dxa"/>
-          </w:tblCellMar>
-        </w:tblPrEx>
-        <w:trPr>
-          <w:cantSplit/>
-          <w:jc w:val="center"/>
-        </w:trPr>
-        <w:tc>
-          <w:tcPr>
-            <w:tcW w:w="2769" w:type="dxa"/>
-            <w:tcBorders>
-              <w:top w:val="single" w:color="C9D1DD" w:sz="4" w:space="0"/>
-              <w:left w:val="nil"/>
-              <w:bottom w:val="single" w:color="C9D1DD" w:sz="4" w:space="0"/>
-              <w:right w:val="nil"/>
-            </w:tcBorders>
-            <w:vAlign w:val="center"/>
-          </w:tcPr>
-          <w:p>
-            <w:pPr>
-              <w:snapToGrid w:val="0"/>
-              <w:spacing w:before="0" w:after="0" w:line="360" w:lineRule="auto"/>
-              <w:jc w:val="left"/>
-            </w:pPr>
-            <w:r>
-              <w:rPr>
-                <w:rFonts w:ascii="Times New Roman" w:hAnsi="Times New Roman" w:eastAsia="宋体" w:cs="Times New Roman"/>
-                <w:b w:val="0"/>
-                <w:sz w:val="24"/>
-              </w:rPr>
-              <w:t>能力 3：细粒度策略与三态决策</w:t>
-            </w:r>
-          </w:p>
-        </w:tc>
-        <w:tc>
-          <w:tcPr>
-            <w:tcW w:w="2488" w:type="dxa"/>
-            <w:tcBorders>
-              <w:top w:val="single" w:color="C9D1DD" w:sz="4" w:space="0"/>
-              <w:left w:val="nil"/>
-              <w:bottom w:val="single" w:color="C9D1DD" w:sz="4" w:space="0"/>
-              <w:right w:val="nil"/>
-            </w:tcBorders>
-            <w:vAlign w:val="center"/>
-          </w:tcPr>
-          <w:p>
-            <w:pPr>
-              <w:snapToGrid w:val="0"/>
-              <w:spacing w:before="0" w:after="0" w:line="360" w:lineRule="auto"/>
-              <w:jc w:val="left"/>
-            </w:pPr>
-            <w:r>
-              <w:rPr>
-                <w:rFonts w:ascii="Times New Roman" w:hAnsi="Times New Roman" w:eastAsia="宋体" w:cs="Times New Roman"/>
-                <w:b w:val="0"/>
-                <w:sz w:val="24"/>
-              </w:rPr>
-              <w:t>5.3、5.4</w:t>
-            </w:r>
-          </w:p>
-        </w:tc>
-        <w:tc>
-          <w:tcPr>
-            <w:tcW w:w="3474" w:type="dxa"/>
-            <w:tcBorders>
-              <w:top w:val="single" w:color="C9D1DD" w:sz="4" w:space="0"/>
-              <w:left w:val="nil"/>
-              <w:bottom w:val="single" w:color="C9D1DD" w:sz="4" w:space="0"/>
-              <w:right w:val="nil"/>
-            </w:tcBorders>
-            <w:vAlign w:val="center"/>
-          </w:tcPr>
-          <w:p>
-            <w:pPr>
-              <w:snapToGrid w:val="0"/>
-              <w:spacing w:before="0" w:after="0" w:line="360" w:lineRule="auto"/>
-              <w:jc w:val="left"/>
-            </w:pPr>
-            <w:r>
-              <w:rPr>
-                <w:rFonts w:ascii="Times New Roman" w:hAnsi="Times New Roman" w:eastAsia="宋体" w:cs="Times New Roman"/>
-                <w:b w:val="0"/>
-                <w:sz w:val="24"/>
-              </w:rPr>
-              <w:t>policy.py、policies.yaml、approval.py</w:t>
-            </w:r>
-          </w:p>
-        </w:tc>
-      </w:tr>
-      <w:tr>
-        <w:tblPrEx>
-          <w:tblCellMar>
-            <w:top w:w="50" w:type="dxa"/>
-            <w:left w:w="80" w:type="dxa"/>
-            <w:bottom w:w="50" w:type="dxa"/>
-            <w:right w:w="80" w:type="dxa"/>
-          </w:tblCellMar>
-        </w:tblPrEx>
-        <w:trPr>
-          <w:cantSplit/>
-          <w:jc w:val="center"/>
-        </w:trPr>
-        <w:tc>
-          <w:tcPr>
-            <w:tcW w:w="2769" w:type="dxa"/>
-            <w:tcBorders>
-              <w:top w:val="single" w:color="C9D1DD" w:sz="4" w:space="0"/>
-              <w:left w:val="nil"/>
-              <w:bottom w:val="single" w:color="C9D1DD" w:sz="4" w:space="0"/>
-              <w:right w:val="nil"/>
-            </w:tcBorders>
-            <w:vAlign w:val="center"/>
-          </w:tcPr>
-          <w:p>
-            <w:pPr>
-              <w:snapToGrid w:val="0"/>
-              <w:spacing w:before="0" w:after="0" w:line="360" w:lineRule="auto"/>
-              <w:jc w:val="left"/>
-            </w:pPr>
-            <w:r>
-              <w:rPr>
-                <w:rFonts w:ascii="Times New Roman" w:hAnsi="Times New Roman" w:eastAsia="宋体" w:cs="Times New Roman"/>
-                <w:b w:val="0"/>
-                <w:sz w:val="24"/>
-              </w:rPr>
-              <w:t>能力 4：跨 MCP 与子 Agent 溯源</w:t>
-            </w:r>
-          </w:p>
-        </w:tc>
-        <w:tc>
-          <w:tcPr>
-            <w:tcW w:w="2488" w:type="dxa"/>
-            <w:tcBorders>
-              <w:top w:val="single" w:color="C9D1DD" w:sz="4" w:space="0"/>
-              <w:left w:val="nil"/>
-              <w:bottom w:val="single" w:color="C9D1DD" w:sz="4" w:space="0"/>
-              <w:right w:val="nil"/>
-            </w:tcBorders>
-            <w:vAlign w:val="center"/>
-          </w:tcPr>
-          <w:p>
-            <w:pPr>
-              <w:snapToGrid w:val="0"/>
-              <w:spacing w:before="0" w:after="0" w:line="360" w:lineRule="auto"/>
-              <w:jc w:val="left"/>
-            </w:pPr>
-            <w:r>
-              <w:rPr>
-                <w:rFonts w:ascii="Times New Roman" w:hAnsi="Times New Roman" w:eastAsia="宋体" w:cs="Times New Roman"/>
-                <w:b w:val="0"/>
-                <w:sz w:val="24"/>
-              </w:rPr>
-              <w:t>第三章、5.5</w:t>
-            </w:r>
-          </w:p>
-        </w:tc>
-        <w:tc>
-          <w:tcPr>
-            <w:tcW w:w="3474" w:type="dxa"/>
-            <w:tcBorders>
-              <w:top w:val="single" w:color="C9D1DD" w:sz="4" w:space="0"/>
-              <w:left w:val="nil"/>
-              <w:bottom w:val="single" w:color="C9D1DD" w:sz="4" w:space="0"/>
-              <w:right w:val="nil"/>
-            </w:tcBorders>
-            <w:vAlign w:val="center"/>
-          </w:tcPr>
-          <w:p>
-            <w:pPr>
-              <w:snapToGrid w:val="0"/>
-              <w:spacing w:before="0" w:after="0" w:line="360" w:lineRule="auto"/>
-              <w:jc w:val="left"/>
-            </w:pPr>
-            <w:r>
-              <w:rPr>
-                <w:rFonts w:ascii="Times New Roman" w:hAnsi="Times New Roman" w:eastAsia="宋体" w:cs="Times New Roman"/>
-                <w:b w:val="0"/>
-                <w:sz w:val="24"/>
-              </w:rPr>
-              <w:t>provenance.py、trace.py、console/</w:t>
-            </w:r>
-          </w:p>
-        </w:tc>
-      </w:tr>
-      <w:tr>
-        <w:tblPrEx>
-          <w:tblCellMar>
-            <w:top w:w="50" w:type="dxa"/>
-            <w:left w:w="80" w:type="dxa"/>
-            <w:bottom w:w="50" w:type="dxa"/>
-            <w:right w:w="80" w:type="dxa"/>
-          </w:tblCellMar>
-        </w:tblPrEx>
-        <w:trPr>
-          <w:cantSplit/>
-          <w:jc w:val="center"/>
-        </w:trPr>
-        <w:tc>
-          <w:tcPr>
-            <w:tcW w:w="2769" w:type="dxa"/>
-            <w:tcBorders>
-              <w:top w:val="single" w:color="C9D1DD" w:sz="4" w:space="0"/>
-              <w:left w:val="nil"/>
-              <w:bottom w:val="single" w:color="1B2A49" w:sz="12" w:space="0"/>
-              <w:right w:val="nil"/>
-            </w:tcBorders>
-            <w:vAlign w:val="center"/>
-          </w:tcPr>
-          <w:p>
-            <w:pPr>
-              <w:snapToGrid w:val="0"/>
-              <w:spacing w:before="0" w:after="0" w:line="360" w:lineRule="auto"/>
-              <w:jc w:val="left"/>
-            </w:pPr>
-            <w:r>
-              <w:rPr>
-                <w:rFonts w:ascii="Times New Roman" w:hAnsi="Times New Roman" w:eastAsia="宋体" w:cs="Times New Roman"/>
-                <w:b w:val="0"/>
-                <w:sz w:val="24"/>
-              </w:rPr>
-              <w:t>能力 5：对抗鲁棒性</w:t>
-            </w:r>
-          </w:p>
-        </w:tc>
-        <w:tc>
-          <w:tcPr>
-            <w:tcW w:w="2488" w:type="dxa"/>
-            <w:tcBorders>
-              <w:top w:val="single" w:color="C9D1DD" w:sz="4" w:space="0"/>
-              <w:left w:val="nil"/>
-              <w:bottom w:val="single" w:color="1B2A49" w:sz="12" w:space="0"/>
-              <w:right w:val="nil"/>
-            </w:tcBorders>
-            <w:vAlign w:val="center"/>
-          </w:tcPr>
-          <w:p>
-            <w:pPr>
-              <w:snapToGrid w:val="0"/>
-              <w:spacing w:before="0" w:after="0" w:line="360" w:lineRule="auto"/>
-              <w:jc w:val="left"/>
-            </w:pPr>
-            <w:r>
-              <w:rPr>
-                <w:rFonts w:ascii="Times New Roman" w:hAnsi="Times New Roman" w:eastAsia="宋体" w:cs="Times New Roman"/>
-                <w:b w:val="0"/>
-                <w:sz w:val="24"/>
-              </w:rPr>
-              <w:t>6.4、6.5</w:t>
-            </w:r>
-          </w:p>
-        </w:tc>
-        <w:tc>
-          <w:tcPr>
-            <w:tcW w:w="3474" w:type="dxa"/>
-            <w:tcBorders>
-              <w:top w:val="single" w:color="C9D1DD" w:sz="4" w:space="0"/>
-              <w:left w:val="nil"/>
-              <w:bottom w:val="single" w:color="1B2A49" w:sz="12" w:space="0"/>
-              <w:right w:val="nil"/>
-            </w:tcBorders>
-            <w:vAlign w:val="center"/>
-          </w:tcPr>
-          <w:p>
-            <w:pPr>
-              <w:snapToGrid w:val="0"/>
-              <w:spacing w:before="0" w:after="0" w:line="360" w:lineRule="auto"/>
-              <w:jc w:val="left"/>
-            </w:pPr>
-            <w:r>
-              <w:rPr>
-                <w:rFonts w:ascii="Times New Roman" w:hAnsi="Times New Roman" w:eastAsia="宋体" w:cs="Times New Roman"/>
-                <w:b w:val="0"/>
-                <w:sz w:val="24"/>
-              </w:rPr>
-              <w:t>normalization.py、semantic_view.py</w:t>
+                <w:sz w:val="21"/>
+              </w:rPr>
+              <w:t>对抗变体攻击成功 54／63→0／63；51 轮稀释场景中安全状态保持约 2.1 KB</w:t>
             </w:r>
           </w:p>
         </w:tc>
@@ -5250,7 +5017,7 @@
             <w:pPr>
               <w:snapToGrid w:val="0"/>
               <w:spacing w:before="0" w:after="0" w:line="360" w:lineRule="auto"/>
-              <w:jc w:val="left"/>
+              <w:jc w:val="center"/>
             </w:pPr>
             <w:r>
               <w:rPr>
@@ -6205,7 +5972,22 @@
           <w:rFonts w:ascii="Times New Roman" w:hAnsi="Times New Roman" w:eastAsia="宋体" w:cs="Times New Roman"/>
           <w:sz w:val="24"/>
         </w:rPr>
-        <w:t>系统由宿主侧的三个接入组件和一个本地防护内核组成，如图 2-1 所示。图中灰色部分为宿主智能体及其外部环境，蓝色部分为本作品新增的组件。在赛题给出的系统形态中，本作品组合采用了宿主 Agent Hook 插件（执行前钩子插件）、Sidecar 网关（API 侧网关）与 MCP 中间代理三种形态。三个接入组件分别位于工具执行之前、模型请求链路和 MCP 工具链路上，负责采集事件并执行裁决；防护内核维护证据库、增量安全链、规则层、快镜、决策表、慢镜与溯源图。</w:t>
+        <w:t>系统由宿主侧的三个接入组件和一个本地防护内核组成，如图 2-1 所示。图中灰色部分为宿主智能体及其外部环境，蓝色部分为本作品新增的组件。在赛题给出的系统形态中，本作品组合采用了宿主 Agent Hook 插件（执行前</w:t>
+      </w:r>
+      <w:r>
+        <w:rPr>
+          <w:rFonts w:hint="eastAsia" w:cs="Times New Roman"/>
+          <w:sz w:val="24"/>
+          <w:lang w:eastAsia="zh-CN"/>
+        </w:rPr>
+        <w:t>Hook</w:t>
+      </w:r>
+      <w:r>
+        <w:rPr>
+          <w:rFonts w:ascii="Times New Roman" w:hAnsi="Times New Roman" w:eastAsia="宋体" w:cs="Times New Roman"/>
+          <w:sz w:val="24"/>
+        </w:rPr>
+        <w:t>插件）、Sidecar 网关（API 侧网关）与 MCP 中间代理三种形态。三个接入组件分别位于工具执行之前、模型请求链路和 MCP 工具链路上，负责采集事件并执行裁决；防护内核维护证据库、增量安全链、规则层、快镜、决策表、慢镜与溯源图。</w:t>
       </w:r>
       <w:r>
         <w:rPr>
@@ -6290,7 +6072,37 @@
           <w:rFonts w:ascii="Times New Roman" w:hAnsi="Times New Roman" w:eastAsia="宋体" w:cs="Times New Roman"/>
           <w:sz w:val="24"/>
         </w:rPr>
-        <w:t>一次工具调用的处理流程如下。首先，网关或钩子插件观察到模型提出的候选调用，内核登记其调用身份。随后，钩子插件在工具执行前同步请求内核裁决，调用编号、参数哈希与发起调用的智能体三者绑定，以防止审查与执行的对象不一致。内核返回 ALLOW 时签发一次性执行许可；返回 BLOCK 时拒绝执行并给出原因；返回 ASK 时挂起该调用，等待用户审批。工具执行后，执行结果写入证据库，新读取到的机密进入指纹库，返回内容作为新的外部内容摄入并由快镜标注。</w:t>
+        <w:t>一次工具调用的处理流程如下。首先，网关或</w:t>
+      </w:r>
+      <w:r>
+        <w:rPr>
+          <w:rFonts w:hint="eastAsia" w:cs="Times New Roman"/>
+          <w:sz w:val="24"/>
+          <w:lang w:eastAsia="zh-CN"/>
+        </w:rPr>
+        <w:t>Hook</w:t>
+      </w:r>
+      <w:r>
+        <w:rPr>
+          <w:rFonts w:ascii="Times New Roman" w:hAnsi="Times New Roman" w:eastAsia="宋体" w:cs="Times New Roman"/>
+          <w:sz w:val="24"/>
+        </w:rPr>
+        <w:t>插件观察到模型提出的候选调用，内核登记其调用身份。随后，</w:t>
+      </w:r>
+      <w:r>
+        <w:rPr>
+          <w:rFonts w:hint="eastAsia" w:cs="Times New Roman"/>
+          <w:sz w:val="24"/>
+          <w:lang w:eastAsia="zh-CN"/>
+        </w:rPr>
+        <w:t>Hook</w:t>
+      </w:r>
+      <w:r>
+        <w:rPr>
+          <w:rFonts w:ascii="Times New Roman" w:hAnsi="Times New Roman" w:eastAsia="宋体" w:cs="Times New Roman"/>
+          <w:sz w:val="24"/>
+        </w:rPr>
+        <w:t>插件在工具执行前同步请求内核裁决，调用编号、参数哈希与发起调用的智能体三者绑定，以防止审查与执行的对象不一致。内核返回 ALLOW 时签发一次性执行许可；返回 BLOCK 时拒绝执行并给出原因；返回 ASK 时挂起该调用，等待用户审批。工具执行后，执行结果写入证据库，新读取到的机密进入指纹库，返回内容作为新的外部内容摄入并由快镜标注。</w:t>
       </w:r>
     </w:p>
     <w:p>
@@ -6328,7 +6140,25 @@
           <w:b w:val="0"/>
           <w:sz w:val="28"/>
         </w:rPr>
-        <w:t>3.1 执行前钩子插件</w:t>
+        <w:t>3.1 执行前</w:t>
+      </w:r>
+      <w:r>
+        <w:rPr>
+          <w:rFonts w:hint="eastAsia" w:ascii="Times New Roman" w:hAnsi="Times New Roman" w:eastAsia="宋体" w:cs="Times New Roman"/>
+          <w:b w:val="0"/>
+          <w:sz w:val="28"/>
+          <w:szCs w:val="28"/>
+          <w:lang w:val="en-US" w:eastAsia="zh-CN"/>
+        </w:rPr>
+        <w:t>Hook</w:t>
+      </w:r>
+      <w:r>
+        <w:rPr>
+          <w:rFonts w:ascii="Arial" w:hAnsi="Arial" w:eastAsia="黑体" w:cs="Arial"/>
+          <w:b w:val="0"/>
+          <w:sz w:val="28"/>
+        </w:rPr>
+        <w:t>插件</w:t>
       </w:r>
       <w:bookmarkEnd w:id="11"/>
     </w:p>
@@ -6341,11 +6171,20 @@
       </w:pPr>
       <w:r>
         <w:rPr>
-          <w:rFonts w:ascii="Times New Roman" w:hAnsi="Times New Roman" w:eastAsia="宋体" w:cs="Times New Roman"/>
+          <w:rFonts w:hint="eastAsia" w:cs="Times New Roman"/>
           <w:b w:val="0"/>
           <w:sz w:val="24"/>
-        </w:rPr>
-        <w:t>钩子插件以 Pi 扩展的形式加载，采用 TypeScript 实现，订阅 Pi 的原生事件。插件上报用户输入、助手的公开文本、候选工具调用、执行结果与子智能体的父子关系，并在每次工具执行前同步调用内核裁决，严格执行 ALLOW、ASK 与 BLOCK 三种结果。子智能体进程自动继承该插件，因此主、子、孙三层派发记录在同一张溯源图中。插件只使用公开文本与工具调用，不采集模型的私有推理内容。</w:t>
+          <w:lang w:eastAsia="zh-CN"/>
+        </w:rPr>
+        <w:t>Hook</w:t>
+      </w:r>
+      <w:r>
+        <w:rPr>
+          <w:rFonts w:ascii="Times New Roman" w:hAnsi="Times New Roman" w:eastAsia="宋体" w:cs="Times New Roman"/>
+          <w:b w:val="0"/>
+          <w:sz w:val="24"/>
+        </w:rPr>
+        <w:t>插件以 Pi 扩展的形式加载，采用 TypeScript 实现，订阅 Pi 的原生事件。插件上报用户输入、助手的公开文本、候选工具调用、执行结果与子智能体的父子关系，并在每次工具执行前同步调用内核裁决，严格执行 ALLOW、ASK 与 BLOCK 三种结果。子智能体进程自动继承该插件，因此主、子、孙三层派发记录在同一张溯源图中。插件只使用公开文本与工具调用，不采集模型的私有推理内容。</w:t>
       </w:r>
     </w:p>
     <w:p>
@@ -6851,7 +6690,7 @@
             <w:pPr>
               <w:snapToGrid w:val="0"/>
               <w:spacing w:before="0" w:after="0" w:line="360" w:lineRule="auto"/>
-              <w:jc w:val="left"/>
+              <w:jc w:val="center"/>
             </w:pPr>
             <w:r>
               <w:rPr>
@@ -7649,11 +7488,20 @@
             </w:pPr>
             <w:r>
               <w:rPr>
-                <w:rFonts w:ascii="Times New Roman" w:hAnsi="Times New Roman" w:eastAsia="宋体" w:cs="Times New Roman"/>
-                <w:b w:val="0"/>
-                <w:sz w:val="24"/>
-              </w:rPr>
-              <w:t>钩子插件的执行前请求</w:t>
+                <w:rFonts w:hint="eastAsia" w:cs="Times New Roman"/>
+                <w:b w:val="0"/>
+                <w:sz w:val="24"/>
+                <w:lang w:eastAsia="zh-CN"/>
+              </w:rPr>
+              <w:t>Hook</w:t>
+            </w:r>
+            <w:r>
+              <w:rPr>
+                <w:rFonts w:ascii="Times New Roman" w:hAnsi="Times New Roman" w:eastAsia="宋体" w:cs="Times New Roman"/>
+                <w:b w:val="0"/>
+                <w:sz w:val="24"/>
+              </w:rPr>
+              <w:t>插件的执行前请求</w:t>
             </w:r>
           </w:p>
         </w:tc>
@@ -8479,6 +8327,19 @@
         </w:rPr>
         <w:t>表 4-3 以 README 间接注入场景为例，给出安全链在各帧的变化与对应裁决，表中 DT-x 表示决策表（表 5-2）的第 x 条规则。</w:t>
       </w:r>
+    </w:p>
+    <w:p>
+      <w:pPr>
+        <w:keepNext/>
+        <w:snapToGrid w:val="0"/>
+        <w:spacing w:before="60" w:after="60" w:line="360" w:lineRule="auto"/>
+        <w:jc w:val="center"/>
+        <w:rPr>
+          <w:rFonts w:ascii="Times New Roman" w:hAnsi="Times New Roman" w:eastAsia="宋体" w:cs="Times New Roman"/>
+          <w:b/>
+          <w:sz w:val="24"/>
+        </w:rPr>
+      </w:pPr>
     </w:p>
     <w:p>
       <w:pPr>
@@ -13768,7 +13629,7 @@
           <w:rFonts w:ascii="Times New Roman" w:hAnsi="Times New Roman" w:eastAsia="宋体" w:cs="Times New Roman"/>
           <w:sz w:val="24"/>
         </w:rPr>
-        <w:t>Task Shield 等对齐方法检查“该动作是否服务于用户任务”；本作品将这一问题转化为越权动作与来源请求之间可计算的关联检查，即依据用户授权与各来源的请求信息，检查一个超出授权的动作是否与外部内容提出的操作、目标相匹配。快镜在内容进入时已经确定了哪些来源提出了具体任务，规则将这些任务抽取为（操作，目标）索引，据此区分已授权动作、未匹配外部请求的规划动作与存在外部请求关联的动作，并对应表 5-4 中的风险等级：在授权范围内或属于低风险辅助动作为 R0；超出字面授权、上下文无请求污染的高风险动作为 R1；涉及敏感目标、请求污染、外部指令或机密风险为 R2；违反硬策略或确证外泄为 R3。轨迹级偏离度取各动作偏离等级的最大值，并给出偏离路径。安全控制台的任务跟踪模式（护航模式）以授权锚点为计划，逐步核对每个动作的裁决与执行情况，并标出与外部指令关联且已被拦截的偏离；该关联对应溯源图中“关联”或“模型支持”级别的因果强度（见 5.5 节）。</w:t>
+        <w:t>Task Shield 等对齐方法检查“该动作是否服务于用户任务”；本作品将这一问题转化为越权动作与来源请求之间可计算的关联检查，即依据用户授权与各来源的请求信息，检查一个超出授权的动作是否与外部内容提出的操作、目标相匹配。快镜在内容进入时已经确定了哪些来源提出了具体任务，规则将这些任务抽取为（操作，目标）索引，据此区分已授权动作、未匹配外部请求的规划动作与存在外部请求关联的动作，并对应表 5-4 中的风险等级：在授权范围内或属于低风险辅助动作为 R0；超出字面授权、上下文无请求污染的高风险动作为 R1；涉及敏感目标、请求污染、外部指令或机密风险为 R2；违反硬策略或确证外泄为 R3。轨迹级偏离度取各动作偏离等级的最大值，并给出偏离路径。安全控制台的“核心亮点”页面以一次真实运行为例，逐步展示授权锚点、快镜对各外部来源的判别以及每个候选动作的比对结果与裁决；溯源图中与外部指令关联且已被拦截的偏离对应溯源图中“关联”或“模型支持”级别的因果强度（见 5.5 节）。</w:t>
       </w:r>
     </w:p>
     <w:p>
@@ -16119,7 +15980,7 @@
           <w:b w:val="0"/>
           <w:sz w:val="24"/>
         </w:rPr>
-        <w:t>安全控制台为 Web 应用，全部视图由每轮运行的证据库确定性生成，页面上的数字均读自全部评测的汇总文件与运行证据。控制台按功能分为态势、管理、执行与分析四组页面（表 8-1），界面示例见图 1-1 至图 1-3 与图 5-3。</w:t>
+        <w:t>安全控制台为 Web 应用，全部视图由每轮运行的证据库确定性生成，页面上的数字均读自全部评测的汇总文件与运行证据。控制台分为展示、实操与设置三组页面（表 8-1）：展示组说明作品的整体结构、核心亮点及其对赛题能力要求的实现，实操组运行真实智能体并查看运行证据，设置组管理模型接口、场景与策略。界面示例见图 1-1 至图 1-3 与图 5-3。</w:t>
       </w:r>
     </w:p>
     <w:p>
@@ -16291,7 +16152,7 @@
                 <w:b w:val="0"/>
                 <w:sz w:val="24"/>
               </w:rPr>
-              <w:t>态势</w:t>
+              <w:t>展示</w:t>
             </w:r>
           </w:p>
         </w:tc>
@@ -16318,7 +16179,7 @@
                 <w:b w:val="0"/>
                 <w:sz w:val="24"/>
               </w:rPr>
-              <w:t>攻防大屏</w:t>
+              <w:t>作品概览</w:t>
             </w:r>
           </w:p>
         </w:tc>
@@ -16345,7 +16206,7 @@
                 <w:b w:val="0"/>
                 <w:sz w:val="24"/>
               </w:rPr>
-              <w:t>全部评测总体结果、各攻击族攻防对比、消融结果、安全链压缩曲线、运行时防御链路回放</w:t>
+              <w:t>作品定位、总体评测结果、“正常运行—遭受攻击—防护拦截”三步说明、系统架构与三项核心特色</w:t>
             </w:r>
           </w:p>
         </w:tc>
@@ -16386,7 +16247,7 @@
                 <w:b w:val="0"/>
                 <w:sz w:val="24"/>
               </w:rPr>
-              <w:t>态势</w:t>
+              <w:t>展示</w:t>
             </w:r>
           </w:p>
         </w:tc>
@@ -16413,7 +16274,7 @@
                 <w:b w:val="0"/>
                 <w:sz w:val="24"/>
               </w:rPr>
-              <w:t>态势总览</w:t>
+              <w:t>核心亮点</w:t>
             </w:r>
           </w:p>
         </w:tc>
@@ -16440,7 +16301,7 @@
                 <w:b w:val="0"/>
                 <w:sz w:val="24"/>
               </w:rPr>
-              <w:t>防护关闭与开启下的攻击成功率、拦截率、正常任务完成率、裁决分布、规则命中排行</w:t>
+              <w:t>以真实运行逐步展示增量安全链的抽取过程与有界状态、意图—计划—工具语义对齐与 D²Guard-Laya 判别、快慢双镜分工与慢镜研判报告</w:t>
             </w:r>
           </w:p>
         </w:tc>
@@ -16481,7 +16342,7 @@
                 <w:b w:val="0"/>
                 <w:sz w:val="24"/>
               </w:rPr>
-              <w:t>管理</w:t>
+              <w:t>展示</w:t>
             </w:r>
           </w:p>
         </w:tc>
@@ -16508,7 +16369,7 @@
                 <w:b w:val="0"/>
                 <w:sz w:val="24"/>
               </w:rPr>
-              <w:t>攻防场景库</w:t>
+              <w:t>五种能力</w:t>
             </w:r>
           </w:p>
         </w:tc>
@@ -16535,7 +16396,7 @@
                 <w:b w:val="0"/>
                 <w:sz w:val="24"/>
               </w:rPr>
-              <w:t>场景列表与详情（任务、载荷、初始文件、判分条件、期望裁决、最近运行），支持增删改与导入导出</w:t>
+              <w:t>逐项给出赛题五种能力的实现方法、无防护与防护下的实测结果，并链接至对应场景与溯源证据</w:t>
             </w:r>
           </w:p>
         </w:tc>
@@ -16576,7 +16437,7 @@
                 <w:b w:val="0"/>
                 <w:sz w:val="24"/>
               </w:rPr>
-              <w:t>管理</w:t>
+              <w:t>展示</w:t>
             </w:r>
           </w:p>
         </w:tc>
@@ -16603,7 +16464,7 @@
                 <w:b w:val="0"/>
                 <w:sz w:val="24"/>
               </w:rPr>
-              <w:t>防御策略</w:t>
+              <w:t>攻防大屏</w:t>
             </w:r>
           </w:p>
         </w:tc>
@@ -16630,7 +16491,7 @@
                 <w:b w:val="0"/>
                 <w:sz w:val="24"/>
               </w:rPr>
-              <w:t>策略 DSL、风险等级与裁决的映射、决策表各规则的命中分布</w:t>
+              <w:t>全部评测总体结果、各攻击族攻防对比、消融结果、安全链压缩曲线、运行时防御链路回放</w:t>
             </w:r>
           </w:p>
         </w:tc>
@@ -16671,7 +16532,7 @@
                 <w:b w:val="0"/>
                 <w:sz w:val="24"/>
               </w:rPr>
-              <w:t>管理</w:t>
+              <w:t>实操</w:t>
             </w:r>
           </w:p>
         </w:tc>
@@ -16698,7 +16559,7 @@
                 <w:b w:val="0"/>
                 <w:sz w:val="24"/>
               </w:rPr>
-              <w:t>模型设置</w:t>
+              <w:t>三步演示</w:t>
             </w:r>
           </w:p>
         </w:tc>
@@ -16725,7 +16586,7 @@
                 <w:b w:val="0"/>
                 <w:sz w:val="24"/>
               </w:rPr>
-              <w:t>分别指定智能体与慢镜所用的大模型接口和模型名称，并可测试连通性；密钥仅保存在本机且不回显</w:t>
+              <w:t>按“正常运行—遭受攻击—防护拦截”三步，在干净与攻击环境中同时运行防护关闭与开启的两路真实智能体，左右对照工具调用、裁决与执行结果</w:t>
             </w:r>
           </w:p>
         </w:tc>
@@ -16766,7 +16627,7 @@
                 <w:b w:val="0"/>
                 <w:sz w:val="24"/>
               </w:rPr>
-              <w:t>执行</w:t>
+              <w:t>实操</w:t>
             </w:r>
           </w:p>
         </w:tc>
@@ -16793,7 +16654,7 @@
                 <w:b w:val="0"/>
                 <w:sz w:val="24"/>
               </w:rPr>
-              <w:t>自由对话</w:t>
+              <w:t>网页审批</w:t>
             </w:r>
           </w:p>
         </w:tc>
@@ -16820,7 +16681,7 @@
                 <w:b w:val="0"/>
                 <w:sz w:val="24"/>
               </w:rPr>
-              <w:t>直接输入任务、附带文本与连续追问；原生 Pi 会话保留上下文，支持停止生成</w:t>
+              <w:t>在被挂起的步骤旁显示待审批调用的工具、参数、理由与有效期，批准或拒绝后原会话继续执行</w:t>
             </w:r>
           </w:p>
         </w:tc>
@@ -16861,7 +16722,7 @@
                 <w:b w:val="0"/>
                 <w:sz w:val="24"/>
               </w:rPr>
-              <w:t>执行</w:t>
+              <w:t>实操</w:t>
             </w:r>
           </w:p>
         </w:tc>
@@ -16888,7 +16749,7 @@
                 <w:b w:val="0"/>
                 <w:sz w:val="24"/>
               </w:rPr>
-              <w:t>攻防竞技场</w:t>
+              <w:t>自由对话</w:t>
             </w:r>
           </w:p>
         </w:tc>
@@ -16915,7 +16776,7 @@
                 <w:b w:val="0"/>
                 <w:sz w:val="24"/>
               </w:rPr>
-              <w:t>同一场景在防护关闭与开启两种条件下同时运行真实智能体，左右两路逐步对照工具调用、裁决与执行结果</w:t>
+              <w:t>直接输入任务、附带文本与连续追问；原生 Pi 会话保留上下文，支持停止生成</w:t>
             </w:r>
           </w:p>
         </w:tc>
@@ -16956,7 +16817,7 @@
                 <w:b w:val="0"/>
                 <w:sz w:val="24"/>
               </w:rPr>
-              <w:t>执行</w:t>
+              <w:t>实操</w:t>
             </w:r>
           </w:p>
         </w:tc>
@@ -16983,7 +16844,7 @@
                 <w:b w:val="0"/>
                 <w:sz w:val="24"/>
               </w:rPr>
-              <w:t>护航模式</w:t>
+              <w:t>溯源分析</w:t>
             </w:r>
           </w:p>
         </w:tc>
@@ -17010,7 +16871,7 @@
                 <w:b w:val="0"/>
                 <w:sz w:val="24"/>
               </w:rPr>
-              <w:t>防护开启下运行，以授权锚点为计划逐步核对动作的裁决与执行，标出被诱导的偏离</w:t>
+              <w:t>攻击路径 DAG、时序泳道、来源原文高亮、影响范围与研判报告</w:t>
             </w:r>
           </w:p>
         </w:tc>
@@ -17051,7 +16912,7 @@
                 <w:b w:val="0"/>
                 <w:sz w:val="24"/>
               </w:rPr>
-              <w:t>执行</w:t>
+              <w:t>实操</w:t>
             </w:r>
           </w:p>
         </w:tc>
@@ -17078,7 +16939,7 @@
                 <w:b w:val="0"/>
                 <w:sz w:val="24"/>
               </w:rPr>
-              <w:t>网页审批</w:t>
+              <w:t>运行记录</w:t>
             </w:r>
           </w:p>
         </w:tc>
@@ -17105,7 +16966,7 @@
                 <w:b w:val="0"/>
                 <w:sz w:val="24"/>
               </w:rPr>
-              <w:t>在被挂起的步骤旁显示待审批调用的工具、参数、理由与有效期，批准或拒绝后原会话继续执行</w:t>
+              <w:t>全部运行的筛选列表</w:t>
             </w:r>
           </w:p>
         </w:tc>
@@ -17146,7 +17007,7 @@
                 <w:b w:val="0"/>
                 <w:sz w:val="24"/>
               </w:rPr>
-              <w:t>分析</w:t>
+              <w:t>设置</w:t>
             </w:r>
           </w:p>
         </w:tc>
@@ -17173,7 +17034,7 @@
                 <w:b w:val="0"/>
                 <w:sz w:val="24"/>
               </w:rPr>
-              <w:t>溯源分析</w:t>
+              <w:t>模型设置</w:t>
             </w:r>
           </w:p>
         </w:tc>
@@ -17200,7 +17061,7 @@
                 <w:b w:val="0"/>
                 <w:sz w:val="24"/>
               </w:rPr>
-              <w:t>攻击路径 DAG、时序泳道、来源原文高亮、影响范围与研判报告</w:t>
+              <w:t>分别指定智能体与慢镜所用的大模型接口和模型名称，并可测试连通性；密钥仅保存在本机且不回显</w:t>
             </w:r>
           </w:p>
         </w:tc>
@@ -17241,7 +17102,7 @@
                 <w:b w:val="0"/>
                 <w:sz w:val="24"/>
               </w:rPr>
-              <w:t>分析</w:t>
+              <w:t>设置</w:t>
             </w:r>
           </w:p>
         </w:tc>
@@ -17268,7 +17129,7 @@
                 <w:b w:val="0"/>
                 <w:sz w:val="24"/>
               </w:rPr>
-              <w:t>运行记录</w:t>
+              <w:t>攻防场景库</w:t>
             </w:r>
           </w:p>
         </w:tc>
@@ -17295,7 +17156,102 @@
                 <w:b w:val="0"/>
                 <w:sz w:val="24"/>
               </w:rPr>
-              <w:t>全部运行的筛选列表</w:t>
+              <w:t>场景列表与详情（任务、载荷、初始文件、判分条件、期望裁决、最近运行），支持增删改与导入导出</w:t>
+            </w:r>
+          </w:p>
+        </w:tc>
+      </w:tr>
+      <w:tr>
+        <w:tblPrEx>
+          <w:tblCellMar>
+            <w:top w:w="50" w:type="dxa"/>
+            <w:left w:w="80" w:type="dxa"/>
+            <w:bottom w:w="50" w:type="dxa"/>
+            <w:right w:w="80" w:type="dxa"/>
+          </w:tblCellMar>
+        </w:tblPrEx>
+        <w:trPr>
+          <w:cantSplit/>
+          <w:jc w:val="center"/>
+        </w:trPr>
+        <w:tc>
+          <w:tcPr>
+            <w:tcW w:w="1101" w:type="dxa"/>
+            <w:tcBorders>
+              <w:top w:val="single" w:color="C9D1DD" w:sz="4" w:space="0"/>
+              <w:left w:val="nil"/>
+              <w:bottom w:val="single" w:color="1B2A49" w:sz="12" w:space="0"/>
+              <w:right w:val="nil"/>
+            </w:tcBorders>
+            <w:vAlign w:val="center"/>
+          </w:tcPr>
+          <w:p>
+            <w:pPr>
+              <w:snapToGrid w:val="0"/>
+              <w:spacing w:before="0" w:after="40" w:line="276" w:lineRule="auto"/>
+              <w:jc w:val="center"/>
+            </w:pPr>
+            <w:r>
+              <w:rPr>
+                <w:rFonts w:ascii="Times New Roman" w:hAnsi="Times New Roman" w:eastAsia="宋体" w:cs="Times New Roman"/>
+                <w:b w:val="0"/>
+                <w:sz w:val="24"/>
+              </w:rPr>
+              <w:t>设置</w:t>
+            </w:r>
+          </w:p>
+        </w:tc>
+        <w:tc>
+          <w:tcPr>
+            <w:tcW w:w="1809" w:type="dxa"/>
+            <w:tcBorders>
+              <w:top w:val="single" w:color="C9D1DD" w:sz="4" w:space="0"/>
+              <w:left w:val="nil"/>
+              <w:bottom w:val="single" w:color="1B2A49" w:sz="12" w:space="0"/>
+              <w:right w:val="nil"/>
+            </w:tcBorders>
+            <w:vAlign w:val="center"/>
+          </w:tcPr>
+          <w:p>
+            <w:pPr>
+              <w:snapToGrid w:val="0"/>
+              <w:spacing w:before="0" w:after="40" w:line="276" w:lineRule="auto"/>
+              <w:jc w:val="center"/>
+            </w:pPr>
+            <w:r>
+              <w:rPr>
+                <w:rFonts w:ascii="Times New Roman" w:hAnsi="Times New Roman" w:eastAsia="宋体" w:cs="Times New Roman"/>
+                <w:b w:val="0"/>
+                <w:sz w:val="24"/>
+              </w:rPr>
+              <w:t>防御策略</w:t>
+            </w:r>
+          </w:p>
+        </w:tc>
+        <w:tc>
+          <w:tcPr>
+            <w:tcW w:w="5820" w:type="dxa"/>
+            <w:tcBorders>
+              <w:top w:val="single" w:color="C9D1DD" w:sz="4" w:space="0"/>
+              <w:left w:val="nil"/>
+              <w:bottom w:val="single" w:color="1B2A49" w:sz="12" w:space="0"/>
+              <w:right w:val="nil"/>
+            </w:tcBorders>
+            <w:vAlign w:val="center"/>
+          </w:tcPr>
+          <w:p>
+            <w:pPr>
+              <w:snapToGrid w:val="0"/>
+              <w:spacing w:before="0" w:after="40" w:line="276" w:lineRule="auto"/>
+              <w:jc w:val="left"/>
+            </w:pPr>
+            <w:r>
+              <w:rPr>
+                <w:rFonts w:ascii="Times New Roman" w:hAnsi="Times New Roman" w:eastAsia="宋体" w:cs="Times New Roman"/>
+                <w:b w:val="0"/>
+                <w:sz w:val="24"/>
+              </w:rPr>
+              <w:t>策略 DSL、风险等级与裁决的映射、决策表各规则的命中分布</w:t>
             </w:r>
           </w:p>
         </w:tc>
@@ -17369,7 +17325,22 @@
           <w:rFonts w:ascii="Times New Roman" w:hAnsi="Times New Roman" w:eastAsia="宋体" w:cs="Times New Roman"/>
           <w:sz w:val="24"/>
         </w:rPr>
-        <w:t>系统技术栈见表 8-2。Pi、钩子插件、网关、MCP 代理和内核部署在防护主机；快镜支持 GPU 及 CPU 推理，慢镜接入 OpenAI 兼容接口，可与智能体选用不同模型。系统支持 Windows 10／11 与 Linux：前者使用独立 Python 虚拟环境、固定版本 Pi 及 Git for Windows 的 Bash，后者采用 POSIX Shell。两平台使用同一套源码、策略和权重，安装步骤见《部署说明文档》。</w:t>
+        <w:t>系统技术栈见表 8-2。Pi、</w:t>
+      </w:r>
+      <w:r>
+        <w:rPr>
+          <w:rFonts w:hint="eastAsia" w:cs="Times New Roman"/>
+          <w:sz w:val="24"/>
+          <w:lang w:eastAsia="zh-CN"/>
+        </w:rPr>
+        <w:t>Hook</w:t>
+      </w:r>
+      <w:r>
+        <w:rPr>
+          <w:rFonts w:ascii="Times New Roman" w:hAnsi="Times New Roman" w:eastAsia="宋体" w:cs="Times New Roman"/>
+          <w:sz w:val="24"/>
+        </w:rPr>
+        <w:t>插件、网关、MCP 代理和内核部署在防护主机；快镜支持 GPU 及 CPU 推理，慢镜接入 OpenAI 兼容接口，可与智能体选用不同模型。系统支持 Windows 10／11 与 Linux：前者使用独立 Python 虚拟环境、固定版本 Pi 及 Git for Windows 的 Bash，后者采用 POSIX Shell。两平台使用同一套源码、策略和权重，安装步骤见《部署说明文档》。</w:t>
       </w:r>
     </w:p>
     <w:p>
@@ -18391,7 +18362,24 @@
           <w:b/>
           <w:sz w:val="24"/>
         </w:rPr>
-        <w:t>通过执行前钩子插件、API 侧网关与 MCP 中间代理三个组件非侵入接入</w:t>
+        <w:t>通过执行前</w:t>
+      </w:r>
+      <w:r>
+        <w:rPr>
+          <w:rFonts w:hint="eastAsia" w:cs="Times New Roman"/>
+          <w:b/>
+          <w:sz w:val="24"/>
+          <w:lang w:eastAsia="zh-CN"/>
+        </w:rPr>
+        <w:t>Hook</w:t>
+      </w:r>
+      <w:r>
+        <w:rPr>
+          <w:rFonts w:ascii="Times New Roman" w:hAnsi="Times New Roman" w:eastAsia="宋体" w:cs="Times New Roman"/>
+          <w:b/>
+          <w:sz w:val="24"/>
+        </w:rPr>
+        <w:t>插件、API 侧网关与 MCP 中间代理三个组件非侵入接入</w:t>
       </w:r>
       <w:r>
         <w:rPr>
@@ -18415,7 +18403,24 @@
           <w:b w:val="0"/>
           <w:sz w:val="24"/>
         </w:rPr>
-        <w:t>全部 1204 次评测运行均在未经改造的 Pi 智能体上执行，经独立脚本逐项核验，未出现非模型原因导致的核验失败。由于内核通过事件与裁决接口与宿主解耦，该接入方式原则上适用于其他提供工具执行前钩子的智能体框架。</w:t>
+        <w:t>全部 1204 次评测运行均在未经改造的 Pi 智能体上执行，经独立脚本逐项核验，未出现非模型原因导致的核验失败。由于内核通过事件与裁决接口与宿主解耦，该接入方式原则上适用于其他提供工具执行前</w:t>
+      </w:r>
+      <w:r>
+        <w:rPr>
+          <w:rFonts w:hint="eastAsia" w:cs="Times New Roman"/>
+          <w:b w:val="0"/>
+          <w:sz w:val="24"/>
+          <w:lang w:eastAsia="zh-CN"/>
+        </w:rPr>
+        <w:t>Hook</w:t>
+      </w:r>
+      <w:r>
+        <w:rPr>
+          <w:rFonts w:ascii="Times New Roman" w:hAnsi="Times New Roman" w:eastAsia="宋体" w:cs="Times New Roman"/>
+          <w:b w:val="0"/>
+          <w:sz w:val="24"/>
+        </w:rPr>
+        <w:t>的智能体框架。</w:t>
       </w:r>
     </w:p>
     <w:p>
@@ -18454,11 +18459,30 @@
     </w:p>
     <w:p>
       <w:pPr>
+        <w:rPr>
+          <w:rFonts w:ascii="Times New Roman" w:hAnsi="Times New Roman" w:eastAsia="宋体" w:cs="Times New Roman"/>
+          <w:b/>
+          <w:sz w:val="24"/>
+        </w:rPr>
+      </w:pPr>
+      <w:r>
+        <w:rPr>
+          <w:rFonts w:ascii="Times New Roman" w:hAnsi="Times New Roman" w:eastAsia="宋体" w:cs="Times New Roman"/>
+          <w:b/>
+          <w:sz w:val="24"/>
+        </w:rPr>
+        <w:br w:type="page"/>
+      </w:r>
+    </w:p>
+    <w:p>
+      <w:pPr>
         <w:keepNext/>
         <w:snapToGrid w:val="0"/>
         <w:spacing w:before="60" w:after="60" w:line="360" w:lineRule="auto"/>
         <w:jc w:val="center"/>
       </w:pPr>
+      <w:bookmarkStart w:id="50" w:name="_GoBack"/>
+      <w:bookmarkEnd w:id="50"/>
       <w:r>
         <w:rPr>
           <w:rFonts w:ascii="Times New Roman" w:hAnsi="Times New Roman" w:eastAsia="宋体" w:cs="Times New Roman"/>
@@ -19481,7 +19505,7 @@
           <w:rFonts w:ascii="Times New Roman" w:hAnsi="Times New Roman" w:eastAsia="宋体" w:cs="Times New Roman"/>
           <w:sz w:val="24"/>
         </w:rPr>
-        <w:t xml:space="preserve">在覆盖 15 类攻击手法的 101 个场景、1204 次真实运行中，在模型有效且可判分的攻击运行中，</w:t>
+        <w:t>在覆盖 15 类攻击手法的 101 个场景、1204 次真实运行中，在模型有效且可判分的攻击运行中，</w:t>
       </w:r>
       <w:r>
         <w:rPr>
@@ -19489,14 +19513,14 @@
           <w:b/>
           <w:sz w:val="24"/>
         </w:rPr>
-        <w:t xml:space="preserve">攻击成功率由无防护时的 70.3%（154／219）降至 0（0／219）</w:t>
-      </w:r>
-      <w:r>
-        <w:rPr>
-          <w:rFonts w:ascii="Times New Roman" w:hAnsi="Times New Roman" w:eastAsia="宋体" w:cs="Times New Roman"/>
-          <w:sz w:val="24"/>
-        </w:rPr>
-        <w:t xml:space="preserve">；正常任务被阻断为 0，自动完成率为 93.3%，其余运行等待一次人工确认，可确认良性动作因自身裁决被误挂起为 0／929；单动作裁决耗时中位数为 8 ms，干净环境下任务耗时与无防护时基本一致，本地路径比例为 100%。</w:t>
+        <w:t>攻击成功率由无防护时的 70.3%（154／219）降至 0（0／219）</w:t>
+      </w:r>
+      <w:r>
+        <w:rPr>
+          <w:rFonts w:ascii="Times New Roman" w:hAnsi="Times New Roman" w:eastAsia="宋体" w:cs="Times New Roman"/>
+          <w:sz w:val="24"/>
+        </w:rPr>
+        <w:t>；正常任务被阻断为 0，自动完成率为 93.3%，其余运行等待一次人工确认，可确认良性动作因自身裁决被误挂起为 0／929；单动作裁决耗时中位数为 8 ms，干净环境下任务耗时与无防护时基本一致，本地路径比例为 100%。</w:t>
       </w:r>
       <w:r>
         <w:rPr>
@@ -19504,14 +19528,14 @@
           <w:b/>
           <w:sz w:val="24"/>
         </w:rPr>
-        <w:t xml:space="preserve">四个公开漏洞复现场景的攻击成功由 8／12 降为 0／12</w:t>
-      </w:r>
-      <w:r>
-        <w:rPr>
-          <w:rFonts w:ascii="Times New Roman" w:hAnsi="Times New Roman" w:eastAsia="宋体" w:cs="Times New Roman"/>
-          <w:sz w:val="24"/>
-        </w:rPr>
-        <w:t xml:space="preserve">，其中 MCP 配置篡改（CVE-2025-54135）在无防护时未触发，不据此评价防护效果。测试方法与详细结果见《测试样例及测试流程说明文档》。消融实验验证了快镜在兼顾安全性与可用性方面的作用，决策充分性实验与长程压力测试表明，裁决所需的安全状态保持精简，早期污点不会丢失。</w:t>
+        <w:t>四个公开漏洞复现场景的攻击成功由 8／12 降为 0／12</w:t>
+      </w:r>
+      <w:r>
+        <w:rPr>
+          <w:rFonts w:ascii="Times New Roman" w:hAnsi="Times New Roman" w:eastAsia="宋体" w:cs="Times New Roman"/>
+          <w:sz w:val="24"/>
+        </w:rPr>
+        <w:t>，其中 MCP 配置篡改（CVE-2025-54135）在无防护时未触发，不据此评价防护效果。测试方法与详细结果见《测试样例及测试流程说明文档》。消融实验验证了快镜在兼顾安全性与可用性方面的作用，决策充分性实验与长程压力测试表明，裁决所需的安全状态保持精简，早期污点不会丢失。</w:t>
       </w:r>
     </w:p>
     <w:p>

</xml_diff>